<commit_message>
Add interactive HTML dashboard (index.html)
agent/html.py renders a single-page HTML report with sortable, filterable benchmark and study tables, embedded figures, and a needs-data section.

build_summary.py now writes index.html on every run and the daily workflow commits it.
</commit_message>
<xml_diff>
--- a/MODEL_PERFORMANCE.docx
+++ b/MODEL_PERFORMANCE.docx
@@ -20559,7 +20559,7 @@
               <w:rPr>
                 <w:sz w:val="16"/>
               </w:rPr>
-              <w:t>GRACE-1L-OAM, SevenNet-0, MACE-MP-0, MatterSim</w:t>
+              <w:t>GRACE-1L-OAM, SevenNet-0, MatterSim, MACE-MP-0</w:t>
             </w:r>
           </w:p>
         </w:tc>
@@ -24662,7 +24662,7 @@
               <w:rPr>
                 <w:sz w:val="16"/>
               </w:rPr>
-              <w:t>MEGNet, ALIGNN, CGCNN</w:t>
+              <w:t>ALIGNN, MEGNet, CGCNN</w:t>
             </w:r>
           </w:p>
         </w:tc>
@@ -24813,7 +24813,7 @@
               <w:rPr>
                 <w:sz w:val="16"/>
               </w:rPr>
-              <w:t>MEGNet, ALIGNN, CGCNN</w:t>
+              <w:t>ALIGNN, MEGNet, CGCNN</w:t>
             </w:r>
           </w:p>
         </w:tc>
@@ -30094,7 +30094,7 @@
               <w:rPr>
                 <w:sz w:val="16"/>
               </w:rPr>
-              <w:t>MatterGen, MatterSim</w:t>
+              <w:t>MatterSim, MatterGen</w:t>
             </w:r>
           </w:p>
         </w:tc>

</xml_diff>

<commit_message>
Digest + summary: 2026-08-29
</commit_message>
<xml_diff>
--- a/MODEL_PERFORMANCE.docx
+++ b/MODEL_PERFORMANCE.docx
@@ -200,7 +200,7 @@
         <w:rPr>
           <w:b/>
         </w:rPr>
-        <w:t>76</w:t>
+        <w:t>93</w:t>
       </w:r>
       <w:r>
         <w:t xml:space="preserve"> studies parsed from the digest; </w:t>
@@ -20432,7 +20432,7 @@
               <w:rPr>
                 <w:sz w:val="16"/>
               </w:rPr>
-              <w:t>GRACE-1L-OAM, SevenNet-0, MACE-MP-0, MatterSim</w:t>
+              <w:t>GRACE-1L-OAM, SevenNet-0, MatterSim, MACE-MP-0</w:t>
             </w:r>
           </w:p>
         </w:tc>
@@ -23828,7 +23828,7 @@
               <w:rPr>
                 <w:sz w:val="16"/>
               </w:rPr>
-              <w:t>ALIGNN, MEGNet, CGCNN</w:t>
+              <w:t>MEGNet, ALIGNN, CGCNN</w:t>
             </w:r>
           </w:p>
         </w:tc>
@@ -25840,7 +25840,7 @@
               <w:rPr>
                 <w:sz w:val="16"/>
               </w:rPr>
-              <w:t>ALIGNN, CHGNet</w:t>
+              <w:t>CHGNet, ALIGNN</w:t>
             </w:r>
           </w:p>
         </w:tc>
@@ -28390,6 +28390,145 @@
                   <w:sz w:val="16"/>
                   <w:u w:val="single"/>
                 </w:rPr>
+                <w:t>Text Embedding-Assisted Prediction of Corrosion Inhibition Efficiency Using Machine Learning under Small-Sample Conditions</w:t>
+              </w:r>
+            </w:hyperlink>
+          </w:p>
+        </w:tc>
+        <w:tc>
+          <w:tcPr>
+            <w:tcW w:type="dxa" w:w="1120"/>
+          </w:tcPr>
+          <w:p>
+            <w:pPr>
+              <w:jc w:val="left"/>
+            </w:pPr>
+            <w:r/>
+          </w:p>
+        </w:tc>
+        <w:tc>
+          <w:tcPr>
+            <w:tcW w:type="dxa" w:w="1120"/>
+          </w:tcPr>
+          <w:p>
+            <w:pPr>
+              <w:jc w:val="left"/>
+            </w:pPr>
+            <w:r/>
+            <w:r>
+              <w:rPr>
+                <w:sz w:val="16"/>
+              </w:rPr>
+              <w:t>alloy</w:t>
+            </w:r>
+          </w:p>
+        </w:tc>
+        <w:tc>
+          <w:tcPr>
+            <w:tcW w:type="dxa" w:w="1120"/>
+          </w:tcPr>
+          <w:p>
+            <w:pPr>
+              <w:jc w:val="left"/>
+            </w:pPr>
+            <w:r/>
+          </w:p>
+        </w:tc>
+        <w:tc>
+          <w:tcPr>
+            <w:tcW w:type="dxa" w:w="1120"/>
+          </w:tcPr>
+          <w:p>
+            <w:pPr>
+              <w:jc w:val="left"/>
+            </w:pPr>
+            <w:r/>
+          </w:p>
+        </w:tc>
+        <w:tc>
+          <w:tcPr>
+            <w:tcW w:type="dxa" w:w="1120"/>
+          </w:tcPr>
+          <w:p>
+            <w:pPr>
+              <w:jc w:val="left"/>
+            </w:pPr>
+            <w:r/>
+            <w:r>
+              <w:rPr>
+                <w:sz w:val="16"/>
+              </w:rPr>
+              <w:t>2026-08-26</w:t>
+            </w:r>
+          </w:p>
+        </w:tc>
+        <w:tc>
+          <w:tcPr>
+            <w:tcW w:type="dxa" w:w="1120"/>
+          </w:tcPr>
+          <w:p>
+            <w:pPr>
+              <w:jc w:val="left"/>
+            </w:pPr>
+            <w:r/>
+            <w:hyperlink r:id="rId120">
+              <w:r>
+                <w:rPr>
+                  <w:color w:val="0B4F9E"/>
+                  <w:sz w:val="16"/>
+                  <w:u w:val="single"/>
+                </w:rPr>
+                <w:t>10.26434/chemrxiv.15007865/v1</w:t>
+              </w:r>
+            </w:hyperlink>
+          </w:p>
+        </w:tc>
+      </w:tr>
+      <w:tr>
+        <w:tc>
+          <w:tcPr>
+            <w:tcW w:type="dxa" w:w="1120"/>
+          </w:tcPr>
+          <w:p>
+            <w:pPr>
+              <w:jc w:val="left"/>
+            </w:pPr>
+            <w:r/>
+            <w:r>
+              <w:rPr>
+                <w:sz w:val="16"/>
+              </w:rPr>
+              <w:t>66</w:t>
+            </w:r>
+          </w:p>
+        </w:tc>
+        <w:tc>
+          <w:tcPr>
+            <w:tcW w:type="dxa" w:w="1120"/>
+          </w:tcPr>
+          <w:p>
+            <w:pPr>
+              <w:jc w:val="left"/>
+            </w:pPr>
+            <w:r/>
+          </w:p>
+        </w:tc>
+        <w:tc>
+          <w:tcPr>
+            <w:tcW w:type="dxa" w:w="1120"/>
+          </w:tcPr>
+          <w:p>
+            <w:pPr>
+              <w:jc w:val="left"/>
+            </w:pPr>
+            <w:r/>
+            <w:hyperlink r:id="rId121">
+              <w:r>
+                <w:rPr>
+                  <w:color w:val="0B4F9E"/>
+                  <w:sz w:val="16"/>
+                  <w:u w:val="single"/>
+                </w:rPr>
                 <w:t>Insights into Lithium Diffusion in Crystalline and Amorphous Solid Electrolytes with Machine Learning Interatomic Potentials</w:t>
               </w:r>
             </w:hyperlink>
@@ -28477,7 +28616,7 @@
               <w:jc w:val="left"/>
             </w:pPr>
             <w:r/>
-            <w:hyperlink r:id="rId120">
+            <w:hyperlink r:id="rId121">
               <w:r>
                 <w:rPr>
                   <w:color w:val="0B4F9E"/>
@@ -28504,31 +28643,31 @@
               <w:rPr>
                 <w:sz w:val="16"/>
               </w:rPr>
-              <w:t>66</w:t>
-            </w:r>
-          </w:p>
-        </w:tc>
-        <w:tc>
-          <w:tcPr>
-            <w:tcW w:type="dxa" w:w="1120"/>
-          </w:tcPr>
-          <w:p>
-            <w:pPr>
-              <w:jc w:val="left"/>
-            </w:pPr>
-            <w:r/>
-          </w:p>
-        </w:tc>
-        <w:tc>
-          <w:tcPr>
-            <w:tcW w:type="dxa" w:w="1120"/>
-          </w:tcPr>
-          <w:p>
-            <w:pPr>
-              <w:jc w:val="left"/>
-            </w:pPr>
-            <w:r/>
-            <w:hyperlink r:id="rId121">
+              <w:t>67</w:t>
+            </w:r>
+          </w:p>
+        </w:tc>
+        <w:tc>
+          <w:tcPr>
+            <w:tcW w:type="dxa" w:w="1120"/>
+          </w:tcPr>
+          <w:p>
+            <w:pPr>
+              <w:jc w:val="left"/>
+            </w:pPr>
+            <w:r/>
+          </w:p>
+        </w:tc>
+        <w:tc>
+          <w:tcPr>
+            <w:tcW w:type="dxa" w:w="1120"/>
+          </w:tcPr>
+          <w:p>
+            <w:pPr>
+              <w:jc w:val="left"/>
+            </w:pPr>
+            <w:r/>
+            <w:hyperlink r:id="rId122">
               <w:r>
                 <w:rPr>
                   <w:color w:val="0B4F9E"/>
@@ -28622,7 +28761,7 @@
               <w:jc w:val="left"/>
             </w:pPr>
             <w:r/>
-            <w:hyperlink r:id="rId121">
+            <w:hyperlink r:id="rId122">
               <w:r>
                 <w:rPr>
                   <w:color w:val="0B4F9E"/>
@@ -28649,31 +28788,31 @@
               <w:rPr>
                 <w:sz w:val="16"/>
               </w:rPr>
-              <w:t>67</w:t>
-            </w:r>
-          </w:p>
-        </w:tc>
-        <w:tc>
-          <w:tcPr>
-            <w:tcW w:type="dxa" w:w="1120"/>
-          </w:tcPr>
-          <w:p>
-            <w:pPr>
-              <w:jc w:val="left"/>
-            </w:pPr>
-            <w:r/>
-          </w:p>
-        </w:tc>
-        <w:tc>
-          <w:tcPr>
-            <w:tcW w:type="dxa" w:w="1120"/>
-          </w:tcPr>
-          <w:p>
-            <w:pPr>
-              <w:jc w:val="left"/>
-            </w:pPr>
-            <w:r/>
-            <w:hyperlink r:id="rId122">
+              <w:t>68</w:t>
+            </w:r>
+          </w:p>
+        </w:tc>
+        <w:tc>
+          <w:tcPr>
+            <w:tcW w:type="dxa" w:w="1120"/>
+          </w:tcPr>
+          <w:p>
+            <w:pPr>
+              <w:jc w:val="left"/>
+            </w:pPr>
+            <w:r/>
+          </w:p>
+        </w:tc>
+        <w:tc>
+          <w:tcPr>
+            <w:tcW w:type="dxa" w:w="1120"/>
+          </w:tcPr>
+          <w:p>
+            <w:pPr>
+              <w:jc w:val="left"/>
+            </w:pPr>
+            <w:r/>
+            <w:hyperlink r:id="rId123">
               <w:r>
                 <w:rPr>
                   <w:color w:val="0B4F9E"/>
@@ -28755,7 +28894,7 @@
               <w:jc w:val="left"/>
             </w:pPr>
             <w:r/>
-            <w:hyperlink r:id="rId122">
+            <w:hyperlink r:id="rId123">
               <w:r>
                 <w:rPr>
                   <w:color w:val="0B4F9E"/>
@@ -28782,31 +28921,176 @@
               <w:rPr>
                 <w:sz w:val="16"/>
               </w:rPr>
-              <w:t>68</w:t>
-            </w:r>
-          </w:p>
-        </w:tc>
-        <w:tc>
-          <w:tcPr>
-            <w:tcW w:type="dxa" w:w="1120"/>
-          </w:tcPr>
-          <w:p>
-            <w:pPr>
-              <w:jc w:val="left"/>
-            </w:pPr>
-            <w:r/>
-          </w:p>
-        </w:tc>
-        <w:tc>
-          <w:tcPr>
-            <w:tcW w:type="dxa" w:w="1120"/>
-          </w:tcPr>
-          <w:p>
-            <w:pPr>
-              <w:jc w:val="left"/>
-            </w:pPr>
-            <w:r/>
-            <w:hyperlink r:id="rId123">
+              <w:t>69</w:t>
+            </w:r>
+          </w:p>
+        </w:tc>
+        <w:tc>
+          <w:tcPr>
+            <w:tcW w:type="dxa" w:w="1120"/>
+          </w:tcPr>
+          <w:p>
+            <w:pPr>
+              <w:jc w:val="left"/>
+            </w:pPr>
+            <w:r/>
+          </w:p>
+        </w:tc>
+        <w:tc>
+          <w:tcPr>
+            <w:tcW w:type="dxa" w:w="1120"/>
+          </w:tcPr>
+          <w:p>
+            <w:pPr>
+              <w:jc w:val="left"/>
+            </w:pPr>
+            <w:r/>
+            <w:hyperlink r:id="rId124">
+              <w:r>
+                <w:rPr>
+                  <w:color w:val="0B4F9E"/>
+                  <w:sz w:val="16"/>
+                  <w:u w:val="single"/>
+                </w:rPr>
+                <w:t>Atomistic Simulation Frameworks for Lithium-Ion Battery Materials: From First-Principles to Machine Learning Potentials</w:t>
+              </w:r>
+            </w:hyperlink>
+          </w:p>
+        </w:tc>
+        <w:tc>
+          <w:tcPr>
+            <w:tcW w:type="dxa" w:w="1120"/>
+          </w:tcPr>
+          <w:p>
+            <w:pPr>
+              <w:jc w:val="left"/>
+            </w:pPr>
+            <w:r/>
+          </w:p>
+        </w:tc>
+        <w:tc>
+          <w:tcPr>
+            <w:tcW w:type="dxa" w:w="1120"/>
+          </w:tcPr>
+          <w:p>
+            <w:pPr>
+              <w:jc w:val="left"/>
+            </w:pPr>
+            <w:r/>
+            <w:r>
+              <w:rPr>
+                <w:sz w:val="16"/>
+              </w:rPr>
+              <w:t>Li-ion battery</w:t>
+            </w:r>
+          </w:p>
+        </w:tc>
+        <w:tc>
+          <w:tcPr>
+            <w:tcW w:type="dxa" w:w="1120"/>
+          </w:tcPr>
+          <w:p>
+            <w:pPr>
+              <w:jc w:val="left"/>
+            </w:pPr>
+            <w:r/>
+            <w:r>
+              <w:rPr>
+                <w:sz w:val="16"/>
+              </w:rPr>
+              <w:t>DFT</w:t>
+            </w:r>
+          </w:p>
+        </w:tc>
+        <w:tc>
+          <w:tcPr>
+            <w:tcW w:type="dxa" w:w="1120"/>
+          </w:tcPr>
+          <w:p>
+            <w:pPr>
+              <w:jc w:val="left"/>
+            </w:pPr>
+            <w:r/>
+          </w:p>
+        </w:tc>
+        <w:tc>
+          <w:tcPr>
+            <w:tcW w:type="dxa" w:w="1120"/>
+          </w:tcPr>
+          <w:p>
+            <w:pPr>
+              <w:jc w:val="left"/>
+            </w:pPr>
+            <w:r/>
+            <w:r>
+              <w:rPr>
+                <w:sz w:val="16"/>
+              </w:rPr>
+              <w:t>2026-08-26</w:t>
+            </w:r>
+          </w:p>
+        </w:tc>
+        <w:tc>
+          <w:tcPr>
+            <w:tcW w:type="dxa" w:w="1120"/>
+          </w:tcPr>
+          <w:p>
+            <w:pPr>
+              <w:jc w:val="left"/>
+            </w:pPr>
+            <w:r/>
+            <w:hyperlink r:id="rId124">
+              <w:r>
+                <w:rPr>
+                  <w:color w:val="0B4F9E"/>
+                  <w:sz w:val="16"/>
+                  <w:u w:val="single"/>
+                </w:rPr>
+                <w:t>10.1007/s42493-026-00160-6</w:t>
+              </w:r>
+            </w:hyperlink>
+          </w:p>
+        </w:tc>
+      </w:tr>
+      <w:tr>
+        <w:tc>
+          <w:tcPr>
+            <w:tcW w:type="dxa" w:w="1120"/>
+          </w:tcPr>
+          <w:p>
+            <w:pPr>
+              <w:jc w:val="left"/>
+            </w:pPr>
+            <w:r/>
+            <w:r>
+              <w:rPr>
+                <w:sz w:val="16"/>
+              </w:rPr>
+              <w:t>70</w:t>
+            </w:r>
+          </w:p>
+        </w:tc>
+        <w:tc>
+          <w:tcPr>
+            <w:tcW w:type="dxa" w:w="1120"/>
+          </w:tcPr>
+          <w:p>
+            <w:pPr>
+              <w:jc w:val="left"/>
+            </w:pPr>
+            <w:r/>
+          </w:p>
+        </w:tc>
+        <w:tc>
+          <w:tcPr>
+            <w:tcW w:type="dxa" w:w="1120"/>
+          </w:tcPr>
+          <w:p>
+            <w:pPr>
+              <w:jc w:val="left"/>
+            </w:pPr>
+            <w:r/>
+            <w:hyperlink r:id="rId125">
               <w:r>
                 <w:rPr>
                   <w:color w:val="0B4F9E"/>
@@ -28888,7 +29172,7 @@
               <w:jc w:val="left"/>
             </w:pPr>
             <w:r/>
-            <w:hyperlink r:id="rId124">
+            <w:hyperlink r:id="rId126">
               <w:r>
                 <w:rPr>
                   <w:color w:val="0B4F9E"/>
@@ -28915,31 +29199,31 @@
               <w:rPr>
                 <w:sz w:val="16"/>
               </w:rPr>
-              <w:t>69</w:t>
-            </w:r>
-          </w:p>
-        </w:tc>
-        <w:tc>
-          <w:tcPr>
-            <w:tcW w:type="dxa" w:w="1120"/>
-          </w:tcPr>
-          <w:p>
-            <w:pPr>
-              <w:jc w:val="left"/>
-            </w:pPr>
-            <w:r/>
-          </w:p>
-        </w:tc>
-        <w:tc>
-          <w:tcPr>
-            <w:tcW w:type="dxa" w:w="1120"/>
-          </w:tcPr>
-          <w:p>
-            <w:pPr>
-              <w:jc w:val="left"/>
-            </w:pPr>
-            <w:r/>
-            <w:hyperlink r:id="rId125">
+              <w:t>71</w:t>
+            </w:r>
+          </w:p>
+        </w:tc>
+        <w:tc>
+          <w:tcPr>
+            <w:tcW w:type="dxa" w:w="1120"/>
+          </w:tcPr>
+          <w:p>
+            <w:pPr>
+              <w:jc w:val="left"/>
+            </w:pPr>
+            <w:r/>
+          </w:p>
+        </w:tc>
+        <w:tc>
+          <w:tcPr>
+            <w:tcW w:type="dxa" w:w="1120"/>
+          </w:tcPr>
+          <w:p>
+            <w:pPr>
+              <w:jc w:val="left"/>
+            </w:pPr>
+            <w:r/>
+            <w:hyperlink r:id="rId127">
               <w:r>
                 <w:rPr>
                   <w:color w:val="0B4F9E"/>
@@ -29027,7 +29311,7 @@
               <w:jc w:val="left"/>
             </w:pPr>
             <w:r/>
-            <w:hyperlink r:id="rId125">
+            <w:hyperlink r:id="rId127">
               <w:r>
                 <w:rPr>
                   <w:color w:val="0B4F9E"/>
@@ -29054,284 +29338,6 @@
               <w:rPr>
                 <w:sz w:val="16"/>
               </w:rPr>
-              <w:t>70</w:t>
-            </w:r>
-          </w:p>
-        </w:tc>
-        <w:tc>
-          <w:tcPr>
-            <w:tcW w:type="dxa" w:w="1120"/>
-          </w:tcPr>
-          <w:p>
-            <w:pPr>
-              <w:jc w:val="left"/>
-            </w:pPr>
-            <w:r/>
-          </w:p>
-        </w:tc>
-        <w:tc>
-          <w:tcPr>
-            <w:tcW w:type="dxa" w:w="1120"/>
-          </w:tcPr>
-          <w:p>
-            <w:pPr>
-              <w:jc w:val="left"/>
-            </w:pPr>
-            <w:r/>
-            <w:hyperlink r:id="rId126">
-              <w:r>
-                <w:rPr>
-                  <w:color w:val="0B4F9E"/>
-                  <w:sz w:val="16"/>
-                  <w:u w:val="single"/>
-                </w:rPr>
-                <w:t>Comparative study of ensemble-based uncertainty quantification methods for neural network interatomic potentials</w:t>
-              </w:r>
-            </w:hyperlink>
-          </w:p>
-        </w:tc>
-        <w:tc>
-          <w:tcPr>
-            <w:tcW w:type="dxa" w:w="1120"/>
-          </w:tcPr>
-          <w:p>
-            <w:pPr>
-              <w:jc w:val="left"/>
-            </w:pPr>
-            <w:r/>
-          </w:p>
-        </w:tc>
-        <w:tc>
-          <w:tcPr>
-            <w:tcW w:type="dxa" w:w="1120"/>
-          </w:tcPr>
-          <w:p>
-            <w:pPr>
-              <w:jc w:val="left"/>
-            </w:pPr>
-            <w:r/>
-          </w:p>
-        </w:tc>
-        <w:tc>
-          <w:tcPr>
-            <w:tcW w:type="dxa" w:w="1120"/>
-          </w:tcPr>
-          <w:p>
-            <w:pPr>
-              <w:jc w:val="left"/>
-            </w:pPr>
-            <w:r/>
-            <w:r>
-              <w:rPr>
-                <w:sz w:val="16"/>
-              </w:rPr>
-              <w:t>DFT, phonons, MLIP</w:t>
-            </w:r>
-          </w:p>
-        </w:tc>
-        <w:tc>
-          <w:tcPr>
-            <w:tcW w:type="dxa" w:w="1120"/>
-          </w:tcPr>
-          <w:p>
-            <w:pPr>
-              <w:jc w:val="left"/>
-            </w:pPr>
-            <w:r/>
-          </w:p>
-        </w:tc>
-        <w:tc>
-          <w:tcPr>
-            <w:tcW w:type="dxa" w:w="1120"/>
-          </w:tcPr>
-          <w:p>
-            <w:pPr>
-              <w:jc w:val="left"/>
-            </w:pPr>
-            <w:r/>
-            <w:r>
-              <w:rPr>
-                <w:sz w:val="16"/>
-              </w:rPr>
-              <w:t>2026-08-27</w:t>
-            </w:r>
-          </w:p>
-        </w:tc>
-        <w:tc>
-          <w:tcPr>
-            <w:tcW w:type="dxa" w:w="1120"/>
-          </w:tcPr>
-          <w:p>
-            <w:pPr>
-              <w:jc w:val="left"/>
-            </w:pPr>
-            <w:r/>
-            <w:hyperlink r:id="rId126">
-              <w:r>
-                <w:rPr>
-                  <w:color w:val="0B4F9E"/>
-                  <w:sz w:val="16"/>
-                  <w:u w:val="single"/>
-                </w:rPr>
-                <w:t>10.1088/2632-2153/ae9fb4</w:t>
-              </w:r>
-            </w:hyperlink>
-          </w:p>
-        </w:tc>
-      </w:tr>
-      <w:tr>
-        <w:tc>
-          <w:tcPr>
-            <w:tcW w:type="dxa" w:w="1120"/>
-          </w:tcPr>
-          <w:p>
-            <w:pPr>
-              <w:jc w:val="left"/>
-            </w:pPr>
-            <w:r/>
-            <w:r>
-              <w:rPr>
-                <w:sz w:val="16"/>
-              </w:rPr>
-              <w:t>71</w:t>
-            </w:r>
-          </w:p>
-        </w:tc>
-        <w:tc>
-          <w:tcPr>
-            <w:tcW w:type="dxa" w:w="1120"/>
-          </w:tcPr>
-          <w:p>
-            <w:pPr>
-              <w:jc w:val="left"/>
-            </w:pPr>
-            <w:r/>
-          </w:p>
-        </w:tc>
-        <w:tc>
-          <w:tcPr>
-            <w:tcW w:type="dxa" w:w="1120"/>
-          </w:tcPr>
-          <w:p>
-            <w:pPr>
-              <w:jc w:val="left"/>
-            </w:pPr>
-            <w:r/>
-            <w:hyperlink r:id="rId127">
-              <w:r>
-                <w:rPr>
-                  <w:color w:val="0B4F9E"/>
-                  <w:sz w:val="16"/>
-                  <w:u w:val="single"/>
-                </w:rPr>
-                <w:t>Carbon Nanotube-Induced Magnetic Shielding Effects on 129Xe NMR from Equivariant Neural Networks</w:t>
-              </w:r>
-            </w:hyperlink>
-          </w:p>
-        </w:tc>
-        <w:tc>
-          <w:tcPr>
-            <w:tcW w:type="dxa" w:w="1120"/>
-          </w:tcPr>
-          <w:p>
-            <w:pPr>
-              <w:jc w:val="left"/>
-            </w:pPr>
-            <w:r/>
-          </w:p>
-        </w:tc>
-        <w:tc>
-          <w:tcPr>
-            <w:tcW w:type="dxa" w:w="1120"/>
-          </w:tcPr>
-          <w:p>
-            <w:pPr>
-              <w:jc w:val="left"/>
-            </w:pPr>
-            <w:r/>
-          </w:p>
-        </w:tc>
-        <w:tc>
-          <w:tcPr>
-            <w:tcW w:type="dxa" w:w="1120"/>
-          </w:tcPr>
-          <w:p>
-            <w:pPr>
-              <w:jc w:val="left"/>
-            </w:pPr>
-            <w:r/>
-            <w:r>
-              <w:rPr>
-                <w:sz w:val="16"/>
-              </w:rPr>
-              <w:t>MD, MLIP</w:t>
-            </w:r>
-          </w:p>
-        </w:tc>
-        <w:tc>
-          <w:tcPr>
-            <w:tcW w:type="dxa" w:w="1120"/>
-          </w:tcPr>
-          <w:p>
-            <w:pPr>
-              <w:jc w:val="left"/>
-            </w:pPr>
-            <w:r/>
-          </w:p>
-        </w:tc>
-        <w:tc>
-          <w:tcPr>
-            <w:tcW w:type="dxa" w:w="1120"/>
-          </w:tcPr>
-          <w:p>
-            <w:pPr>
-              <w:jc w:val="left"/>
-            </w:pPr>
-            <w:r/>
-            <w:r>
-              <w:rPr>
-                <w:sz w:val="16"/>
-              </w:rPr>
-              <w:t>2026-08-27</w:t>
-            </w:r>
-          </w:p>
-        </w:tc>
-        <w:tc>
-          <w:tcPr>
-            <w:tcW w:type="dxa" w:w="1120"/>
-          </w:tcPr>
-          <w:p>
-            <w:pPr>
-              <w:jc w:val="left"/>
-            </w:pPr>
-            <w:r/>
-            <w:hyperlink r:id="rId127">
-              <w:r>
-                <w:rPr>
-                  <w:color w:val="0B4F9E"/>
-                  <w:sz w:val="16"/>
-                  <w:u w:val="single"/>
-                </w:rPr>
-                <w:t>10.26434/chemrxiv.15007956/v1</w:t>
-              </w:r>
-            </w:hyperlink>
-          </w:p>
-        </w:tc>
-      </w:tr>
-      <w:tr>
-        <w:tc>
-          <w:tcPr>
-            <w:tcW w:type="dxa" w:w="1120"/>
-          </w:tcPr>
-          <w:p>
-            <w:pPr>
-              <w:jc w:val="left"/>
-            </w:pPr>
-            <w:r/>
-            <w:r>
-              <w:rPr>
-                <w:sz w:val="16"/>
-              </w:rPr>
               <w:t>72</w:t>
             </w:r>
           </w:p>
@@ -29363,7 +29369,7 @@
                   <w:sz w:val="16"/>
                   <w:u w:val="single"/>
                 </w:rPr>
-                <w:t>Benchmarking of Fast and Interpretable UF Machine Learning Potentials</w:t>
+                <w:t>Bayesian Optimization for Self-Driving Materials Laboratories: From Algorithms to Physics-Informed Workflows</w:t>
               </w:r>
             </w:hyperlink>
           </w:p>
@@ -29399,39 +29405,33 @@
               <w:jc w:val="left"/>
             </w:pPr>
             <w:r/>
-            <w:r>
-              <w:rPr>
-                <w:sz w:val="16"/>
-              </w:rPr>
-              <w:t>DFT, MD, MLIP</w:t>
-            </w:r>
-          </w:p>
-        </w:tc>
-        <w:tc>
-          <w:tcPr>
-            <w:tcW w:type="dxa" w:w="1120"/>
-          </w:tcPr>
-          <w:p>
-            <w:pPr>
-              <w:jc w:val="left"/>
-            </w:pPr>
-            <w:r/>
-          </w:p>
-        </w:tc>
-        <w:tc>
-          <w:tcPr>
-            <w:tcW w:type="dxa" w:w="1120"/>
-          </w:tcPr>
-          <w:p>
-            <w:pPr>
-              <w:jc w:val="left"/>
-            </w:pPr>
-            <w:r/>
-            <w:r>
-              <w:rPr>
-                <w:sz w:val="16"/>
-              </w:rPr>
-              <w:t>2026-08-27</w:t>
+          </w:p>
+        </w:tc>
+        <w:tc>
+          <w:tcPr>
+            <w:tcW w:type="dxa" w:w="1120"/>
+          </w:tcPr>
+          <w:p>
+            <w:pPr>
+              <w:jc w:val="left"/>
+            </w:pPr>
+            <w:r/>
+          </w:p>
+        </w:tc>
+        <w:tc>
+          <w:tcPr>
+            <w:tcW w:type="dxa" w:w="1120"/>
+          </w:tcPr>
+          <w:p>
+            <w:pPr>
+              <w:jc w:val="left"/>
+            </w:pPr>
+            <w:r/>
+            <w:r>
+              <w:rPr>
+                <w:sz w:val="16"/>
+              </w:rPr>
+              <w:t>2026-08-26</w:t>
             </w:r>
           </w:p>
         </w:tc>
@@ -29502,6 +29502,1136 @@
                   <w:sz w:val="16"/>
                   <w:u w:val="single"/>
                 </w:rPr>
+                <w:t>Cross-Scale Assessment of MACE Foundation Models and from Scratch Trained Potentials for Bi-Pt Systems</w:t>
+              </w:r>
+            </w:hyperlink>
+          </w:p>
+        </w:tc>
+        <w:tc>
+          <w:tcPr>
+            <w:tcW w:type="dxa" w:w="1120"/>
+          </w:tcPr>
+          <w:p>
+            <w:pPr>
+              <w:jc w:val="left"/>
+            </w:pPr>
+            <w:r/>
+            <w:r>
+              <w:rPr>
+                <w:sz w:val="16"/>
+              </w:rPr>
+              <w:t>MACE</w:t>
+            </w:r>
+          </w:p>
+        </w:tc>
+        <w:tc>
+          <w:tcPr>
+            <w:tcW w:type="dxa" w:w="1120"/>
+          </w:tcPr>
+          <w:p>
+            <w:pPr>
+              <w:jc w:val="left"/>
+            </w:pPr>
+            <w:r/>
+            <w:r>
+              <w:rPr>
+                <w:sz w:val="16"/>
+              </w:rPr>
+              <w:t>Bi18Pt24</w:t>
+            </w:r>
+          </w:p>
+        </w:tc>
+        <w:tc>
+          <w:tcPr>
+            <w:tcW w:type="dxa" w:w="1120"/>
+          </w:tcPr>
+          <w:p>
+            <w:pPr>
+              <w:jc w:val="left"/>
+            </w:pPr>
+            <w:r/>
+            <w:r>
+              <w:rPr>
+                <w:sz w:val="16"/>
+              </w:rPr>
+              <w:t>DFT, phonons, MLIP</w:t>
+            </w:r>
+          </w:p>
+        </w:tc>
+        <w:tc>
+          <w:tcPr>
+            <w:tcW w:type="dxa" w:w="1120"/>
+          </w:tcPr>
+          <w:p>
+            <w:pPr>
+              <w:jc w:val="left"/>
+            </w:pPr>
+            <w:r/>
+          </w:p>
+        </w:tc>
+        <w:tc>
+          <w:tcPr>
+            <w:tcW w:type="dxa" w:w="1120"/>
+          </w:tcPr>
+          <w:p>
+            <w:pPr>
+              <w:jc w:val="left"/>
+            </w:pPr>
+            <w:r/>
+            <w:r>
+              <w:rPr>
+                <w:sz w:val="16"/>
+              </w:rPr>
+              <w:t>2026-08-27</w:t>
+            </w:r>
+          </w:p>
+        </w:tc>
+        <w:tc>
+          <w:tcPr>
+            <w:tcW w:type="dxa" w:w="1120"/>
+          </w:tcPr>
+          <w:p>
+            <w:pPr>
+              <w:jc w:val="left"/>
+            </w:pPr>
+            <w:r/>
+            <w:hyperlink r:id="rId129">
+              <w:r>
+                <w:rPr>
+                  <w:color w:val="0B4F9E"/>
+                  <w:sz w:val="16"/>
+                  <w:u w:val="single"/>
+                </w:rPr>
+                <w:t>10.26434/chemrxiv.15007985/v1</w:t>
+              </w:r>
+            </w:hyperlink>
+          </w:p>
+        </w:tc>
+      </w:tr>
+      <w:tr>
+        <w:tc>
+          <w:tcPr>
+            <w:tcW w:type="dxa" w:w="1120"/>
+          </w:tcPr>
+          <w:p>
+            <w:pPr>
+              <w:jc w:val="left"/>
+            </w:pPr>
+            <w:r/>
+            <w:r>
+              <w:rPr>
+                <w:sz w:val="16"/>
+              </w:rPr>
+              <w:t>74</w:t>
+            </w:r>
+          </w:p>
+        </w:tc>
+        <w:tc>
+          <w:tcPr>
+            <w:tcW w:type="dxa" w:w="1120"/>
+          </w:tcPr>
+          <w:p>
+            <w:pPr>
+              <w:jc w:val="left"/>
+            </w:pPr>
+            <w:r/>
+          </w:p>
+        </w:tc>
+        <w:tc>
+          <w:tcPr>
+            <w:tcW w:type="dxa" w:w="1120"/>
+          </w:tcPr>
+          <w:p>
+            <w:pPr>
+              <w:jc w:val="left"/>
+            </w:pPr>
+            <w:r/>
+            <w:hyperlink r:id="rId130">
+              <w:r>
+                <w:rPr>
+                  <w:color w:val="0B4F9E"/>
+                  <w:sz w:val="16"/>
+                  <w:u w:val="single"/>
+                </w:rPr>
+                <w:t>Comparative study of ensemble-based uncertainty quantification methods for neural network interatomic potentials</w:t>
+              </w:r>
+            </w:hyperlink>
+          </w:p>
+        </w:tc>
+        <w:tc>
+          <w:tcPr>
+            <w:tcW w:type="dxa" w:w="1120"/>
+          </w:tcPr>
+          <w:p>
+            <w:pPr>
+              <w:jc w:val="left"/>
+            </w:pPr>
+            <w:r/>
+          </w:p>
+        </w:tc>
+        <w:tc>
+          <w:tcPr>
+            <w:tcW w:type="dxa" w:w="1120"/>
+          </w:tcPr>
+          <w:p>
+            <w:pPr>
+              <w:jc w:val="left"/>
+            </w:pPr>
+            <w:r/>
+          </w:p>
+        </w:tc>
+        <w:tc>
+          <w:tcPr>
+            <w:tcW w:type="dxa" w:w="1120"/>
+          </w:tcPr>
+          <w:p>
+            <w:pPr>
+              <w:jc w:val="left"/>
+            </w:pPr>
+            <w:r/>
+            <w:r>
+              <w:rPr>
+                <w:sz w:val="16"/>
+              </w:rPr>
+              <w:t>DFT, phonons, MLIP</w:t>
+            </w:r>
+          </w:p>
+        </w:tc>
+        <w:tc>
+          <w:tcPr>
+            <w:tcW w:type="dxa" w:w="1120"/>
+          </w:tcPr>
+          <w:p>
+            <w:pPr>
+              <w:jc w:val="left"/>
+            </w:pPr>
+            <w:r/>
+          </w:p>
+        </w:tc>
+        <w:tc>
+          <w:tcPr>
+            <w:tcW w:type="dxa" w:w="1120"/>
+          </w:tcPr>
+          <w:p>
+            <w:pPr>
+              <w:jc w:val="left"/>
+            </w:pPr>
+            <w:r/>
+            <w:r>
+              <w:rPr>
+                <w:sz w:val="16"/>
+              </w:rPr>
+              <w:t>2026-08-27</w:t>
+            </w:r>
+          </w:p>
+        </w:tc>
+        <w:tc>
+          <w:tcPr>
+            <w:tcW w:type="dxa" w:w="1120"/>
+          </w:tcPr>
+          <w:p>
+            <w:pPr>
+              <w:jc w:val="left"/>
+            </w:pPr>
+            <w:r/>
+            <w:hyperlink r:id="rId130">
+              <w:r>
+                <w:rPr>
+                  <w:color w:val="0B4F9E"/>
+                  <w:sz w:val="16"/>
+                  <w:u w:val="single"/>
+                </w:rPr>
+                <w:t>10.1088/2632-2153/ae9fb4</w:t>
+              </w:r>
+            </w:hyperlink>
+          </w:p>
+        </w:tc>
+      </w:tr>
+      <w:tr>
+        <w:tc>
+          <w:tcPr>
+            <w:tcW w:type="dxa" w:w="1120"/>
+          </w:tcPr>
+          <w:p>
+            <w:pPr>
+              <w:jc w:val="left"/>
+            </w:pPr>
+            <w:r/>
+            <w:r>
+              <w:rPr>
+                <w:sz w:val="16"/>
+              </w:rPr>
+              <w:t>75</w:t>
+            </w:r>
+          </w:p>
+        </w:tc>
+        <w:tc>
+          <w:tcPr>
+            <w:tcW w:type="dxa" w:w="1120"/>
+          </w:tcPr>
+          <w:p>
+            <w:pPr>
+              <w:jc w:val="left"/>
+            </w:pPr>
+            <w:r/>
+          </w:p>
+        </w:tc>
+        <w:tc>
+          <w:tcPr>
+            <w:tcW w:type="dxa" w:w="1120"/>
+          </w:tcPr>
+          <w:p>
+            <w:pPr>
+              <w:jc w:val="left"/>
+            </w:pPr>
+            <w:r/>
+            <w:hyperlink r:id="rId131">
+              <w:r>
+                <w:rPr>
+                  <w:color w:val="0B4F9E"/>
+                  <w:sz w:val="16"/>
+                  <w:u w:val="single"/>
+                </w:rPr>
+                <w:t>Designing High-Entropy Alloys: From Physical Metallurgy to Machine Learning Enabled Discovery</w:t>
+              </w:r>
+            </w:hyperlink>
+          </w:p>
+        </w:tc>
+        <w:tc>
+          <w:tcPr>
+            <w:tcW w:type="dxa" w:w="1120"/>
+          </w:tcPr>
+          <w:p>
+            <w:pPr>
+              <w:jc w:val="left"/>
+            </w:pPr>
+            <w:r/>
+          </w:p>
+        </w:tc>
+        <w:tc>
+          <w:tcPr>
+            <w:tcW w:type="dxa" w:w="1120"/>
+          </w:tcPr>
+          <w:p>
+            <w:pPr>
+              <w:jc w:val="left"/>
+            </w:pPr>
+            <w:r/>
+            <w:r>
+              <w:rPr>
+                <w:sz w:val="16"/>
+              </w:rPr>
+              <w:t>alloy</w:t>
+            </w:r>
+          </w:p>
+        </w:tc>
+        <w:tc>
+          <w:tcPr>
+            <w:tcW w:type="dxa" w:w="1120"/>
+          </w:tcPr>
+          <w:p>
+            <w:pPr>
+              <w:jc w:val="left"/>
+            </w:pPr>
+            <w:r/>
+            <w:r>
+              <w:rPr>
+                <w:sz w:val="16"/>
+              </w:rPr>
+              <w:t>MLIP</w:t>
+            </w:r>
+          </w:p>
+        </w:tc>
+        <w:tc>
+          <w:tcPr>
+            <w:tcW w:type="dxa" w:w="1120"/>
+          </w:tcPr>
+          <w:p>
+            <w:pPr>
+              <w:jc w:val="left"/>
+            </w:pPr>
+            <w:r/>
+          </w:p>
+        </w:tc>
+        <w:tc>
+          <w:tcPr>
+            <w:tcW w:type="dxa" w:w="1120"/>
+          </w:tcPr>
+          <w:p>
+            <w:pPr>
+              <w:jc w:val="left"/>
+            </w:pPr>
+            <w:r/>
+            <w:r>
+              <w:rPr>
+                <w:sz w:val="16"/>
+              </w:rPr>
+              <w:t>2026-08-27</w:t>
+            </w:r>
+          </w:p>
+        </w:tc>
+        <w:tc>
+          <w:tcPr>
+            <w:tcW w:type="dxa" w:w="1120"/>
+          </w:tcPr>
+          <w:p>
+            <w:pPr>
+              <w:jc w:val="left"/>
+            </w:pPr>
+            <w:r/>
+            <w:hyperlink r:id="rId131">
+              <w:r>
+                <w:rPr>
+                  <w:color w:val="0B4F9E"/>
+                  <w:sz w:val="16"/>
+                  <w:u w:val="single"/>
+                </w:rPr>
+                <w:t>10.20944/preprints202608.1952.v1</w:t>
+              </w:r>
+            </w:hyperlink>
+          </w:p>
+        </w:tc>
+      </w:tr>
+      <w:tr>
+        <w:tc>
+          <w:tcPr>
+            <w:tcW w:type="dxa" w:w="1120"/>
+          </w:tcPr>
+          <w:p>
+            <w:pPr>
+              <w:jc w:val="left"/>
+            </w:pPr>
+            <w:r/>
+            <w:r>
+              <w:rPr>
+                <w:sz w:val="16"/>
+              </w:rPr>
+              <w:t>76</w:t>
+            </w:r>
+          </w:p>
+        </w:tc>
+        <w:tc>
+          <w:tcPr>
+            <w:tcW w:type="dxa" w:w="1120"/>
+          </w:tcPr>
+          <w:p>
+            <w:pPr>
+              <w:jc w:val="left"/>
+            </w:pPr>
+            <w:r/>
+          </w:p>
+        </w:tc>
+        <w:tc>
+          <w:tcPr>
+            <w:tcW w:type="dxa" w:w="1120"/>
+          </w:tcPr>
+          <w:p>
+            <w:pPr>
+              <w:jc w:val="left"/>
+            </w:pPr>
+            <w:r/>
+            <w:hyperlink r:id="rId132">
+              <w:r>
+                <w:rPr>
+                  <w:color w:val="0B4F9E"/>
+                  <w:sz w:val="16"/>
+                  <w:u w:val="single"/>
+                </w:rPr>
+                <w:t>A multi-scale mixture of experts model for cross-size structural prediction of Cu nanoparticles</w:t>
+              </w:r>
+            </w:hyperlink>
+          </w:p>
+        </w:tc>
+        <w:tc>
+          <w:tcPr>
+            <w:tcW w:type="dxa" w:w="1120"/>
+          </w:tcPr>
+          <w:p>
+            <w:pPr>
+              <w:jc w:val="left"/>
+            </w:pPr>
+            <w:r/>
+          </w:p>
+        </w:tc>
+        <w:tc>
+          <w:tcPr>
+            <w:tcW w:type="dxa" w:w="1120"/>
+          </w:tcPr>
+          <w:p>
+            <w:pPr>
+              <w:jc w:val="left"/>
+            </w:pPr>
+            <w:r/>
+          </w:p>
+        </w:tc>
+        <w:tc>
+          <w:tcPr>
+            <w:tcW w:type="dxa" w:w="1120"/>
+          </w:tcPr>
+          <w:p>
+            <w:pPr>
+              <w:jc w:val="left"/>
+            </w:pPr>
+            <w:r/>
+            <w:r>
+              <w:rPr>
+                <w:sz w:val="16"/>
+              </w:rPr>
+              <w:t>DFT, MD, MLIP</w:t>
+            </w:r>
+          </w:p>
+        </w:tc>
+        <w:tc>
+          <w:tcPr>
+            <w:tcW w:type="dxa" w:w="1120"/>
+          </w:tcPr>
+          <w:p>
+            <w:pPr>
+              <w:jc w:val="left"/>
+            </w:pPr>
+            <w:r/>
+          </w:p>
+        </w:tc>
+        <w:tc>
+          <w:tcPr>
+            <w:tcW w:type="dxa" w:w="1120"/>
+          </w:tcPr>
+          <w:p>
+            <w:pPr>
+              <w:jc w:val="left"/>
+            </w:pPr>
+            <w:r/>
+            <w:r>
+              <w:rPr>
+                <w:sz w:val="16"/>
+              </w:rPr>
+              <w:t>2026-08-27</w:t>
+            </w:r>
+          </w:p>
+        </w:tc>
+        <w:tc>
+          <w:tcPr>
+            <w:tcW w:type="dxa" w:w="1120"/>
+          </w:tcPr>
+          <w:p>
+            <w:pPr>
+              <w:jc w:val="left"/>
+            </w:pPr>
+            <w:r/>
+            <w:hyperlink r:id="rId132">
+              <w:r>
+                <w:rPr>
+                  <w:color w:val="0B4F9E"/>
+                  <w:sz w:val="16"/>
+                  <w:u w:val="single"/>
+                </w:rPr>
+                <w:t>10.1038/s41524-026-02280-x</w:t>
+              </w:r>
+            </w:hyperlink>
+          </w:p>
+        </w:tc>
+      </w:tr>
+      <w:tr>
+        <w:tc>
+          <w:tcPr>
+            <w:tcW w:type="dxa" w:w="1120"/>
+          </w:tcPr>
+          <w:p>
+            <w:pPr>
+              <w:jc w:val="left"/>
+            </w:pPr>
+            <w:r/>
+            <w:r>
+              <w:rPr>
+                <w:sz w:val="16"/>
+              </w:rPr>
+              <w:t>77</w:t>
+            </w:r>
+          </w:p>
+        </w:tc>
+        <w:tc>
+          <w:tcPr>
+            <w:tcW w:type="dxa" w:w="1120"/>
+          </w:tcPr>
+          <w:p>
+            <w:pPr>
+              <w:jc w:val="left"/>
+            </w:pPr>
+            <w:r/>
+          </w:p>
+        </w:tc>
+        <w:tc>
+          <w:tcPr>
+            <w:tcW w:type="dxa" w:w="1120"/>
+          </w:tcPr>
+          <w:p>
+            <w:pPr>
+              <w:jc w:val="left"/>
+            </w:pPr>
+            <w:r/>
+            <w:hyperlink r:id="rId133">
+              <w:r>
+                <w:rPr>
+                  <w:color w:val="0B4F9E"/>
+                  <w:sz w:val="16"/>
+                  <w:u w:val="single"/>
+                </w:rPr>
+                <w:t>Benchmarking of Fast and Interpretable UF Machine Learning Potentials</w:t>
+              </w:r>
+            </w:hyperlink>
+          </w:p>
+        </w:tc>
+        <w:tc>
+          <w:tcPr>
+            <w:tcW w:type="dxa" w:w="1120"/>
+          </w:tcPr>
+          <w:p>
+            <w:pPr>
+              <w:jc w:val="left"/>
+            </w:pPr>
+            <w:r/>
+          </w:p>
+        </w:tc>
+        <w:tc>
+          <w:tcPr>
+            <w:tcW w:type="dxa" w:w="1120"/>
+          </w:tcPr>
+          <w:p>
+            <w:pPr>
+              <w:jc w:val="left"/>
+            </w:pPr>
+            <w:r/>
+          </w:p>
+        </w:tc>
+        <w:tc>
+          <w:tcPr>
+            <w:tcW w:type="dxa" w:w="1120"/>
+          </w:tcPr>
+          <w:p>
+            <w:pPr>
+              <w:jc w:val="left"/>
+            </w:pPr>
+            <w:r/>
+            <w:r>
+              <w:rPr>
+                <w:sz w:val="16"/>
+              </w:rPr>
+              <w:t>DFT, MD, MLIP</w:t>
+            </w:r>
+          </w:p>
+        </w:tc>
+        <w:tc>
+          <w:tcPr>
+            <w:tcW w:type="dxa" w:w="1120"/>
+          </w:tcPr>
+          <w:p>
+            <w:pPr>
+              <w:jc w:val="left"/>
+            </w:pPr>
+            <w:r/>
+          </w:p>
+        </w:tc>
+        <w:tc>
+          <w:tcPr>
+            <w:tcW w:type="dxa" w:w="1120"/>
+          </w:tcPr>
+          <w:p>
+            <w:pPr>
+              <w:jc w:val="left"/>
+            </w:pPr>
+            <w:r/>
+            <w:r>
+              <w:rPr>
+                <w:sz w:val="16"/>
+              </w:rPr>
+              <w:t>2026-08-27</w:t>
+            </w:r>
+          </w:p>
+        </w:tc>
+        <w:tc>
+          <w:tcPr>
+            <w:tcW w:type="dxa" w:w="1120"/>
+          </w:tcPr>
+          <w:p>
+            <w:pPr>
+              <w:jc w:val="left"/>
+            </w:pPr>
+            <w:r/>
+            <w:hyperlink r:id="rId133">
+              <w:r>
+                <w:rPr>
+                  <w:color w:val="0B4F9E"/>
+                  <w:sz w:val="16"/>
+                  <w:u w:val="single"/>
+                </w:rPr>
+                <w:t>10.48550/arxiv.2608.27277</w:t>
+              </w:r>
+            </w:hyperlink>
+          </w:p>
+        </w:tc>
+      </w:tr>
+      <w:tr>
+        <w:tc>
+          <w:tcPr>
+            <w:tcW w:type="dxa" w:w="1120"/>
+          </w:tcPr>
+          <w:p>
+            <w:pPr>
+              <w:jc w:val="left"/>
+            </w:pPr>
+            <w:r/>
+            <w:r>
+              <w:rPr>
+                <w:sz w:val="16"/>
+              </w:rPr>
+              <w:t>78</w:t>
+            </w:r>
+          </w:p>
+        </w:tc>
+        <w:tc>
+          <w:tcPr>
+            <w:tcW w:type="dxa" w:w="1120"/>
+          </w:tcPr>
+          <w:p>
+            <w:pPr>
+              <w:jc w:val="left"/>
+            </w:pPr>
+            <w:r/>
+          </w:p>
+        </w:tc>
+        <w:tc>
+          <w:tcPr>
+            <w:tcW w:type="dxa" w:w="1120"/>
+          </w:tcPr>
+          <w:p>
+            <w:pPr>
+              <w:jc w:val="left"/>
+            </w:pPr>
+            <w:r/>
+            <w:hyperlink r:id="rId134">
+              <w:r>
+                <w:rPr>
+                  <w:color w:val="0B4F9E"/>
+                  <w:sz w:val="16"/>
+                  <w:u w:val="single"/>
+                </w:rPr>
+                <w:t>Grain-Boundary Premelting in High-Entropy Transition Metal Carbides</w:t>
+              </w:r>
+            </w:hyperlink>
+          </w:p>
+        </w:tc>
+        <w:tc>
+          <w:tcPr>
+            <w:tcW w:type="dxa" w:w="1120"/>
+          </w:tcPr>
+          <w:p>
+            <w:pPr>
+              <w:jc w:val="left"/>
+            </w:pPr>
+            <w:r/>
+            <w:r>
+              <w:rPr>
+                <w:sz w:val="16"/>
+              </w:rPr>
+              <w:t>MACE</w:t>
+            </w:r>
+          </w:p>
+        </w:tc>
+        <w:tc>
+          <w:tcPr>
+            <w:tcW w:type="dxa" w:w="1120"/>
+          </w:tcPr>
+          <w:p>
+            <w:pPr>
+              <w:jc w:val="left"/>
+            </w:pPr>
+            <w:r/>
+          </w:p>
+        </w:tc>
+        <w:tc>
+          <w:tcPr>
+            <w:tcW w:type="dxa" w:w="1120"/>
+          </w:tcPr>
+          <w:p>
+            <w:pPr>
+              <w:jc w:val="left"/>
+            </w:pPr>
+            <w:r/>
+            <w:r>
+              <w:rPr>
+                <w:sz w:val="16"/>
+              </w:rPr>
+              <w:t>MD, Monte Carlo, MLIP</w:t>
+            </w:r>
+          </w:p>
+        </w:tc>
+        <w:tc>
+          <w:tcPr>
+            <w:tcW w:type="dxa" w:w="1120"/>
+          </w:tcPr>
+          <w:p>
+            <w:pPr>
+              <w:jc w:val="left"/>
+            </w:pPr>
+            <w:r/>
+          </w:p>
+        </w:tc>
+        <w:tc>
+          <w:tcPr>
+            <w:tcW w:type="dxa" w:w="1120"/>
+          </w:tcPr>
+          <w:p>
+            <w:pPr>
+              <w:jc w:val="left"/>
+            </w:pPr>
+            <w:r/>
+            <w:r>
+              <w:rPr>
+                <w:sz w:val="16"/>
+              </w:rPr>
+              <w:t>2026-08-27</w:t>
+            </w:r>
+          </w:p>
+        </w:tc>
+        <w:tc>
+          <w:tcPr>
+            <w:tcW w:type="dxa" w:w="1120"/>
+          </w:tcPr>
+          <w:p>
+            <w:pPr>
+              <w:jc w:val="left"/>
+            </w:pPr>
+            <w:r/>
+            <w:hyperlink r:id="rId134">
+              <w:r>
+                <w:rPr>
+                  <w:color w:val="0B4F9E"/>
+                  <w:sz w:val="16"/>
+                  <w:u w:val="single"/>
+                </w:rPr>
+                <w:t>10.48550/arxiv.2608.27273</w:t>
+              </w:r>
+            </w:hyperlink>
+          </w:p>
+        </w:tc>
+      </w:tr>
+      <w:tr>
+        <w:tc>
+          <w:tcPr>
+            <w:tcW w:type="dxa" w:w="1120"/>
+          </w:tcPr>
+          <w:p>
+            <w:pPr>
+              <w:jc w:val="left"/>
+            </w:pPr>
+            <w:r/>
+            <w:r>
+              <w:rPr>
+                <w:sz w:val="16"/>
+              </w:rPr>
+              <w:t>79</w:t>
+            </w:r>
+          </w:p>
+        </w:tc>
+        <w:tc>
+          <w:tcPr>
+            <w:tcW w:type="dxa" w:w="1120"/>
+          </w:tcPr>
+          <w:p>
+            <w:pPr>
+              <w:jc w:val="left"/>
+            </w:pPr>
+            <w:r/>
+          </w:p>
+        </w:tc>
+        <w:tc>
+          <w:tcPr>
+            <w:tcW w:type="dxa" w:w="1120"/>
+          </w:tcPr>
+          <w:p>
+            <w:pPr>
+              <w:jc w:val="left"/>
+            </w:pPr>
+            <w:r/>
+            <w:hyperlink r:id="rId135">
+              <w:r>
+                <w:rPr>
+                  <w:color w:val="0B4F9E"/>
+                  <w:sz w:val="16"/>
+                  <w:u w:val="single"/>
+                </w:rPr>
+                <w:t>Carbon Nanotube-Induced Magnetic Shielding Effects on 129Xe NMR from Equivariant Neural Networks</w:t>
+              </w:r>
+            </w:hyperlink>
+          </w:p>
+        </w:tc>
+        <w:tc>
+          <w:tcPr>
+            <w:tcW w:type="dxa" w:w="1120"/>
+          </w:tcPr>
+          <w:p>
+            <w:pPr>
+              <w:jc w:val="left"/>
+            </w:pPr>
+            <w:r/>
+          </w:p>
+        </w:tc>
+        <w:tc>
+          <w:tcPr>
+            <w:tcW w:type="dxa" w:w="1120"/>
+          </w:tcPr>
+          <w:p>
+            <w:pPr>
+              <w:jc w:val="left"/>
+            </w:pPr>
+            <w:r/>
+          </w:p>
+        </w:tc>
+        <w:tc>
+          <w:tcPr>
+            <w:tcW w:type="dxa" w:w="1120"/>
+          </w:tcPr>
+          <w:p>
+            <w:pPr>
+              <w:jc w:val="left"/>
+            </w:pPr>
+            <w:r/>
+            <w:r>
+              <w:rPr>
+                <w:sz w:val="16"/>
+              </w:rPr>
+              <w:t>MD, MLIP</w:t>
+            </w:r>
+          </w:p>
+        </w:tc>
+        <w:tc>
+          <w:tcPr>
+            <w:tcW w:type="dxa" w:w="1120"/>
+          </w:tcPr>
+          <w:p>
+            <w:pPr>
+              <w:jc w:val="left"/>
+            </w:pPr>
+            <w:r/>
+          </w:p>
+        </w:tc>
+        <w:tc>
+          <w:tcPr>
+            <w:tcW w:type="dxa" w:w="1120"/>
+          </w:tcPr>
+          <w:p>
+            <w:pPr>
+              <w:jc w:val="left"/>
+            </w:pPr>
+            <w:r/>
+            <w:r>
+              <w:rPr>
+                <w:sz w:val="16"/>
+              </w:rPr>
+              <w:t>2026-08-27</w:t>
+            </w:r>
+          </w:p>
+        </w:tc>
+        <w:tc>
+          <w:tcPr>
+            <w:tcW w:type="dxa" w:w="1120"/>
+          </w:tcPr>
+          <w:p>
+            <w:pPr>
+              <w:jc w:val="left"/>
+            </w:pPr>
+            <w:r/>
+            <w:hyperlink r:id="rId135">
+              <w:r>
+                <w:rPr>
+                  <w:color w:val="0B4F9E"/>
+                  <w:sz w:val="16"/>
+                  <w:u w:val="single"/>
+                </w:rPr>
+                <w:t>10.26434/chemrxiv.15007956/v1</w:t>
+              </w:r>
+            </w:hyperlink>
+          </w:p>
+        </w:tc>
+      </w:tr>
+      <w:tr>
+        <w:tc>
+          <w:tcPr>
+            <w:tcW w:type="dxa" w:w="1120"/>
+          </w:tcPr>
+          <w:p>
+            <w:pPr>
+              <w:jc w:val="left"/>
+            </w:pPr>
+            <w:r/>
+            <w:r>
+              <w:rPr>
+                <w:sz w:val="16"/>
+              </w:rPr>
+              <w:t>80</w:t>
+            </w:r>
+          </w:p>
+        </w:tc>
+        <w:tc>
+          <w:tcPr>
+            <w:tcW w:type="dxa" w:w="1120"/>
+          </w:tcPr>
+          <w:p>
+            <w:pPr>
+              <w:jc w:val="left"/>
+            </w:pPr>
+            <w:r/>
+          </w:p>
+        </w:tc>
+        <w:tc>
+          <w:tcPr>
+            <w:tcW w:type="dxa" w:w="1120"/>
+          </w:tcPr>
+          <w:p>
+            <w:pPr>
+              <w:jc w:val="left"/>
+            </w:pPr>
+            <w:r/>
+            <w:hyperlink r:id="rId136">
+              <w:r>
+                <w:rPr>
+                  <w:color w:val="0B4F9E"/>
+                  <w:sz w:val="16"/>
+                  <w:u w:val="single"/>
+                </w:rPr>
+                <w:t>Commentary on ten selected 2025 papers in AI for Materials Science</w:t>
+              </w:r>
+            </w:hyperlink>
+          </w:p>
+        </w:tc>
+        <w:tc>
+          <w:tcPr>
+            <w:tcW w:type="dxa" w:w="1120"/>
+          </w:tcPr>
+          <w:p>
+            <w:pPr>
+              <w:jc w:val="left"/>
+            </w:pPr>
+            <w:r/>
+          </w:p>
+        </w:tc>
+        <w:tc>
+          <w:tcPr>
+            <w:tcW w:type="dxa" w:w="1120"/>
+          </w:tcPr>
+          <w:p>
+            <w:pPr>
+              <w:jc w:val="left"/>
+            </w:pPr>
+            <w:r/>
+          </w:p>
+        </w:tc>
+        <w:tc>
+          <w:tcPr>
+            <w:tcW w:type="dxa" w:w="1120"/>
+          </w:tcPr>
+          <w:p>
+            <w:pPr>
+              <w:jc w:val="left"/>
+            </w:pPr>
+            <w:r/>
+          </w:p>
+        </w:tc>
+        <w:tc>
+          <w:tcPr>
+            <w:tcW w:type="dxa" w:w="1120"/>
+          </w:tcPr>
+          <w:p>
+            <w:pPr>
+              <w:jc w:val="left"/>
+            </w:pPr>
+            <w:r/>
+          </w:p>
+        </w:tc>
+        <w:tc>
+          <w:tcPr>
+            <w:tcW w:type="dxa" w:w="1120"/>
+          </w:tcPr>
+          <w:p>
+            <w:pPr>
+              <w:jc w:val="left"/>
+            </w:pPr>
+            <w:r/>
+            <w:r>
+              <w:rPr>
+                <w:sz w:val="16"/>
+              </w:rPr>
+              <w:t>2026-08-27</w:t>
+            </w:r>
+          </w:p>
+        </w:tc>
+        <w:tc>
+          <w:tcPr>
+            <w:tcW w:type="dxa" w:w="1120"/>
+          </w:tcPr>
+          <w:p>
+            <w:pPr>
+              <w:jc w:val="left"/>
+            </w:pPr>
+            <w:r/>
+            <w:hyperlink r:id="rId136">
+              <w:r>
+                <w:rPr>
+                  <w:color w:val="0B4F9E"/>
+                  <w:sz w:val="16"/>
+                  <w:u w:val="single"/>
+                </w:rPr>
+                <w:t>10.20517/jmi.2026.36</w:t>
+              </w:r>
+            </w:hyperlink>
+          </w:p>
+        </w:tc>
+      </w:tr>
+      <w:tr>
+        <w:tc>
+          <w:tcPr>
+            <w:tcW w:type="dxa" w:w="1120"/>
+          </w:tcPr>
+          <w:p>
+            <w:pPr>
+              <w:jc w:val="left"/>
+            </w:pPr>
+            <w:r/>
+            <w:r>
+              <w:rPr>
+                <w:sz w:val="16"/>
+              </w:rPr>
+              <w:t>81</w:t>
+            </w:r>
+          </w:p>
+        </w:tc>
+        <w:tc>
+          <w:tcPr>
+            <w:tcW w:type="dxa" w:w="1120"/>
+          </w:tcPr>
+          <w:p>
+            <w:pPr>
+              <w:jc w:val="left"/>
+            </w:pPr>
+            <w:r/>
+          </w:p>
+        </w:tc>
+        <w:tc>
+          <w:tcPr>
+            <w:tcW w:type="dxa" w:w="1120"/>
+          </w:tcPr>
+          <w:p>
+            <w:pPr>
+              <w:jc w:val="left"/>
+            </w:pPr>
+            <w:r/>
+            <w:hyperlink r:id="rId137">
+              <w:r>
+                <w:rPr>
+                  <w:color w:val="0B4F9E"/>
+                  <w:sz w:val="16"/>
+                  <w:u w:val="single"/>
+                </w:rPr>
                 <w:t>Packora: Systematic Design for Generative Molecular Crystal Structure Prediction</w:t>
               </w:r>
             </w:hyperlink>
@@ -29577,7 +30707,7 @@
               <w:jc w:val="left"/>
             </w:pPr>
             <w:r/>
-            <w:hyperlink r:id="rId129">
+            <w:hyperlink r:id="rId137">
               <w:r>
                 <w:rPr>
                   <w:color w:val="0B4F9E"/>
@@ -29604,31 +30734,164 @@
               <w:rPr>
                 <w:sz w:val="16"/>
               </w:rPr>
-              <w:t>74</w:t>
-            </w:r>
-          </w:p>
-        </w:tc>
-        <w:tc>
-          <w:tcPr>
-            <w:tcW w:type="dxa" w:w="1120"/>
-          </w:tcPr>
-          <w:p>
-            <w:pPr>
-              <w:jc w:val="left"/>
-            </w:pPr>
-            <w:r/>
-          </w:p>
-        </w:tc>
-        <w:tc>
-          <w:tcPr>
-            <w:tcW w:type="dxa" w:w="1120"/>
-          </w:tcPr>
-          <w:p>
-            <w:pPr>
-              <w:jc w:val="left"/>
-            </w:pPr>
-            <w:r/>
-            <w:hyperlink r:id="rId130">
+              <w:t>82</w:t>
+            </w:r>
+          </w:p>
+        </w:tc>
+        <w:tc>
+          <w:tcPr>
+            <w:tcW w:type="dxa" w:w="1120"/>
+          </w:tcPr>
+          <w:p>
+            <w:pPr>
+              <w:jc w:val="left"/>
+            </w:pPr>
+            <w:r/>
+          </w:p>
+        </w:tc>
+        <w:tc>
+          <w:tcPr>
+            <w:tcW w:type="dxa" w:w="1120"/>
+          </w:tcPr>
+          <w:p>
+            <w:pPr>
+              <w:jc w:val="left"/>
+            </w:pPr>
+            <w:r/>
+            <w:hyperlink r:id="rId138">
+              <w:r>
+                <w:rPr>
+                  <w:color w:val="0B4F9E"/>
+                  <w:sz w:val="16"/>
+                  <w:u w:val="single"/>
+                </w:rPr>
+                <w:t>Docking-Score Landscapes Shape Active-Learning Performance across Vina, Glide, and SILCS</w:t>
+              </w:r>
+            </w:hyperlink>
+          </w:p>
+        </w:tc>
+        <w:tc>
+          <w:tcPr>
+            <w:tcW w:type="dxa" w:w="1120"/>
+          </w:tcPr>
+          <w:p>
+            <w:pPr>
+              <w:jc w:val="left"/>
+            </w:pPr>
+            <w:r/>
+          </w:p>
+        </w:tc>
+        <w:tc>
+          <w:tcPr>
+            <w:tcW w:type="dxa" w:w="1120"/>
+          </w:tcPr>
+          <w:p>
+            <w:pPr>
+              <w:jc w:val="left"/>
+            </w:pPr>
+            <w:r/>
+          </w:p>
+        </w:tc>
+        <w:tc>
+          <w:tcPr>
+            <w:tcW w:type="dxa" w:w="1120"/>
+          </w:tcPr>
+          <w:p>
+            <w:pPr>
+              <w:jc w:val="left"/>
+            </w:pPr>
+            <w:r/>
+          </w:p>
+        </w:tc>
+        <w:tc>
+          <w:tcPr>
+            <w:tcW w:type="dxa" w:w="1120"/>
+          </w:tcPr>
+          <w:p>
+            <w:pPr>
+              <w:jc w:val="left"/>
+            </w:pPr>
+            <w:r/>
+          </w:p>
+        </w:tc>
+        <w:tc>
+          <w:tcPr>
+            <w:tcW w:type="dxa" w:w="1120"/>
+          </w:tcPr>
+          <w:p>
+            <w:pPr>
+              <w:jc w:val="left"/>
+            </w:pPr>
+            <w:r/>
+            <w:r>
+              <w:rPr>
+                <w:sz w:val="16"/>
+              </w:rPr>
+              <w:t>2026-08-28</w:t>
+            </w:r>
+          </w:p>
+        </w:tc>
+        <w:tc>
+          <w:tcPr>
+            <w:tcW w:type="dxa" w:w="1120"/>
+          </w:tcPr>
+          <w:p>
+            <w:pPr>
+              <w:jc w:val="left"/>
+            </w:pPr>
+            <w:r/>
+            <w:hyperlink r:id="rId138">
+              <w:r>
+                <w:rPr>
+                  <w:color w:val="0B4F9E"/>
+                  <w:sz w:val="16"/>
+                  <w:u w:val="single"/>
+                </w:rPr>
+                <w:t>10.26434/chemrxiv-2025-3t356/v2</w:t>
+              </w:r>
+            </w:hyperlink>
+          </w:p>
+        </w:tc>
+      </w:tr>
+      <w:tr>
+        <w:tc>
+          <w:tcPr>
+            <w:tcW w:type="dxa" w:w="1120"/>
+          </w:tcPr>
+          <w:p>
+            <w:pPr>
+              <w:jc w:val="left"/>
+            </w:pPr>
+            <w:r/>
+            <w:r>
+              <w:rPr>
+                <w:sz w:val="16"/>
+              </w:rPr>
+              <w:t>83</w:t>
+            </w:r>
+          </w:p>
+        </w:tc>
+        <w:tc>
+          <w:tcPr>
+            <w:tcW w:type="dxa" w:w="1120"/>
+          </w:tcPr>
+          <w:p>
+            <w:pPr>
+              <w:jc w:val="left"/>
+            </w:pPr>
+            <w:r/>
+          </w:p>
+        </w:tc>
+        <w:tc>
+          <w:tcPr>
+            <w:tcW w:type="dxa" w:w="1120"/>
+          </w:tcPr>
+          <w:p>
+            <w:pPr>
+              <w:jc w:val="left"/>
+            </w:pPr>
+            <w:r/>
+            <w:hyperlink r:id="rId139">
               <w:r>
                 <w:rPr>
                   <w:color w:val="0B4F9E"/>
@@ -29716,7 +30979,7 @@
               <w:jc w:val="left"/>
             </w:pPr>
             <w:r/>
-            <w:hyperlink r:id="rId130">
+            <w:hyperlink r:id="rId139">
               <w:r>
                 <w:rPr>
                   <w:color w:val="0B4F9E"/>
@@ -29743,31 +31006,466 @@
               <w:rPr>
                 <w:sz w:val="16"/>
               </w:rPr>
-              <w:t>75</w:t>
-            </w:r>
-          </w:p>
-        </w:tc>
-        <w:tc>
-          <w:tcPr>
-            <w:tcW w:type="dxa" w:w="1120"/>
-          </w:tcPr>
-          <w:p>
-            <w:pPr>
-              <w:jc w:val="left"/>
-            </w:pPr>
-            <w:r/>
-          </w:p>
-        </w:tc>
-        <w:tc>
-          <w:tcPr>
-            <w:tcW w:type="dxa" w:w="1120"/>
-          </w:tcPr>
-          <w:p>
-            <w:pPr>
-              <w:jc w:val="left"/>
-            </w:pPr>
-            <w:r/>
-            <w:hyperlink r:id="rId131">
+              <w:t>84</w:t>
+            </w:r>
+          </w:p>
+        </w:tc>
+        <w:tc>
+          <w:tcPr>
+            <w:tcW w:type="dxa" w:w="1120"/>
+          </w:tcPr>
+          <w:p>
+            <w:pPr>
+              <w:jc w:val="left"/>
+            </w:pPr>
+            <w:r/>
+          </w:p>
+        </w:tc>
+        <w:tc>
+          <w:tcPr>
+            <w:tcW w:type="dxa" w:w="1120"/>
+          </w:tcPr>
+          <w:p>
+            <w:pPr>
+              <w:jc w:val="left"/>
+            </w:pPr>
+            <w:r/>
+            <w:hyperlink r:id="rId140">
+              <w:r>
+                <w:rPr>
+                  <w:color w:val="0B4F9E"/>
+                  <w:sz w:val="16"/>
+                  <w:u w:val="single"/>
+                </w:rPr>
+                <w:t>Ferroelastic hysteresis, shear modulus softening, and the tetragonal↔cubic transition in davemaoite</w:t>
+              </w:r>
+            </w:hyperlink>
+          </w:p>
+        </w:tc>
+        <w:tc>
+          <w:tcPr>
+            <w:tcW w:type="dxa" w:w="1120"/>
+          </w:tcPr>
+          <w:p>
+            <w:pPr>
+              <w:jc w:val="left"/>
+            </w:pPr>
+            <w:r/>
+          </w:p>
+        </w:tc>
+        <w:tc>
+          <w:tcPr>
+            <w:tcW w:type="dxa" w:w="1120"/>
+          </w:tcPr>
+          <w:p>
+            <w:pPr>
+              <w:jc w:val="left"/>
+            </w:pPr>
+            <w:r/>
+            <w:r>
+              <w:rPr>
+                <w:sz w:val="16"/>
+              </w:rPr>
+              <w:t>perovskite</w:t>
+            </w:r>
+          </w:p>
+        </w:tc>
+        <w:tc>
+          <w:tcPr>
+            <w:tcW w:type="dxa" w:w="1120"/>
+          </w:tcPr>
+          <w:p>
+            <w:pPr>
+              <w:jc w:val="left"/>
+            </w:pPr>
+            <w:r/>
+            <w:r>
+              <w:rPr>
+                <w:sz w:val="16"/>
+              </w:rPr>
+              <w:t>MD, MLIP</w:t>
+            </w:r>
+          </w:p>
+        </w:tc>
+        <w:tc>
+          <w:tcPr>
+            <w:tcW w:type="dxa" w:w="1120"/>
+          </w:tcPr>
+          <w:p>
+            <w:pPr>
+              <w:jc w:val="left"/>
+            </w:pPr>
+            <w:r/>
+          </w:p>
+        </w:tc>
+        <w:tc>
+          <w:tcPr>
+            <w:tcW w:type="dxa" w:w="1120"/>
+          </w:tcPr>
+          <w:p>
+            <w:pPr>
+              <w:jc w:val="left"/>
+            </w:pPr>
+            <w:r/>
+            <w:r>
+              <w:rPr>
+                <w:sz w:val="16"/>
+              </w:rPr>
+              <w:t>2026-08-28</w:t>
+            </w:r>
+          </w:p>
+        </w:tc>
+        <w:tc>
+          <w:tcPr>
+            <w:tcW w:type="dxa" w:w="1120"/>
+          </w:tcPr>
+          <w:p>
+            <w:pPr>
+              <w:jc w:val="left"/>
+            </w:pPr>
+            <w:r/>
+            <w:hyperlink r:id="rId140">
+              <w:r>
+                <w:rPr>
+                  <w:color w:val="0B4F9E"/>
+                  <w:sz w:val="16"/>
+                  <w:u w:val="single"/>
+                </w:rPr>
+                <w:t>10.1126/sciadv.aed7601</w:t>
+              </w:r>
+            </w:hyperlink>
+          </w:p>
+        </w:tc>
+      </w:tr>
+      <w:tr>
+        <w:tc>
+          <w:tcPr>
+            <w:tcW w:type="dxa" w:w="1120"/>
+          </w:tcPr>
+          <w:p>
+            <w:pPr>
+              <w:jc w:val="left"/>
+            </w:pPr>
+            <w:r/>
+            <w:r>
+              <w:rPr>
+                <w:sz w:val="16"/>
+              </w:rPr>
+              <w:t>85</w:t>
+            </w:r>
+          </w:p>
+        </w:tc>
+        <w:tc>
+          <w:tcPr>
+            <w:tcW w:type="dxa" w:w="1120"/>
+          </w:tcPr>
+          <w:p>
+            <w:pPr>
+              <w:jc w:val="left"/>
+            </w:pPr>
+            <w:r/>
+          </w:p>
+        </w:tc>
+        <w:tc>
+          <w:tcPr>
+            <w:tcW w:type="dxa" w:w="1120"/>
+          </w:tcPr>
+          <w:p>
+            <w:pPr>
+              <w:jc w:val="left"/>
+            </w:pPr>
+            <w:r/>
+            <w:hyperlink r:id="rId141">
+              <w:r>
+                <w:rPr>
+                  <w:color w:val="0B4F9E"/>
+                  <w:sz w:val="16"/>
+                  <w:u w:val="single"/>
+                </w:rPr>
+                <w:t>Machine learning interatomic potential study of grain boundaries thermal conductance and tensile strength in hexagonal boron nitride</w:t>
+              </w:r>
+            </w:hyperlink>
+          </w:p>
+        </w:tc>
+        <w:tc>
+          <w:tcPr>
+            <w:tcW w:type="dxa" w:w="1120"/>
+          </w:tcPr>
+          <w:p>
+            <w:pPr>
+              <w:jc w:val="left"/>
+            </w:pPr>
+            <w:r/>
+          </w:p>
+        </w:tc>
+        <w:tc>
+          <w:tcPr>
+            <w:tcW w:type="dxa" w:w="1120"/>
+          </w:tcPr>
+          <w:p>
+            <w:pPr>
+              <w:jc w:val="left"/>
+            </w:pPr>
+            <w:r/>
+            <w:r>
+              <w:rPr>
+                <w:sz w:val="16"/>
+              </w:rPr>
+              <w:t>2D material, nitride</w:t>
+            </w:r>
+          </w:p>
+        </w:tc>
+        <w:tc>
+          <w:tcPr>
+            <w:tcW w:type="dxa" w:w="1120"/>
+          </w:tcPr>
+          <w:p>
+            <w:pPr>
+              <w:jc w:val="left"/>
+            </w:pPr>
+            <w:r/>
+            <w:r>
+              <w:rPr>
+                <w:sz w:val="16"/>
+              </w:rPr>
+              <w:t>AIMD, MLIP</w:t>
+            </w:r>
+          </w:p>
+        </w:tc>
+        <w:tc>
+          <w:tcPr>
+            <w:tcW w:type="dxa" w:w="1120"/>
+          </w:tcPr>
+          <w:p>
+            <w:pPr>
+              <w:jc w:val="left"/>
+            </w:pPr>
+            <w:r/>
+          </w:p>
+        </w:tc>
+        <w:tc>
+          <w:tcPr>
+            <w:tcW w:type="dxa" w:w="1120"/>
+          </w:tcPr>
+          <w:p>
+            <w:pPr>
+              <w:jc w:val="left"/>
+            </w:pPr>
+            <w:r/>
+            <w:r>
+              <w:rPr>
+                <w:sz w:val="16"/>
+              </w:rPr>
+              <w:t>2026-08-28</w:t>
+            </w:r>
+          </w:p>
+        </w:tc>
+        <w:tc>
+          <w:tcPr>
+            <w:tcW w:type="dxa" w:w="1120"/>
+          </w:tcPr>
+          <w:p>
+            <w:pPr>
+              <w:jc w:val="left"/>
+            </w:pPr>
+            <w:r/>
+            <w:hyperlink r:id="rId141">
+              <w:r>
+                <w:rPr>
+                  <w:color w:val="0B4F9E"/>
+                  <w:sz w:val="16"/>
+                  <w:u w:val="single"/>
+                </w:rPr>
+                <w:t>10.17632/c5pynk4jyj</w:t>
+              </w:r>
+            </w:hyperlink>
+          </w:p>
+        </w:tc>
+      </w:tr>
+      <w:tr>
+        <w:tc>
+          <w:tcPr>
+            <w:tcW w:type="dxa" w:w="1120"/>
+          </w:tcPr>
+          <w:p>
+            <w:pPr>
+              <w:jc w:val="left"/>
+            </w:pPr>
+            <w:r/>
+            <w:r>
+              <w:rPr>
+                <w:sz w:val="16"/>
+              </w:rPr>
+              <w:t>86</w:t>
+            </w:r>
+          </w:p>
+        </w:tc>
+        <w:tc>
+          <w:tcPr>
+            <w:tcW w:type="dxa" w:w="1120"/>
+          </w:tcPr>
+          <w:p>
+            <w:pPr>
+              <w:jc w:val="left"/>
+            </w:pPr>
+            <w:r/>
+          </w:p>
+        </w:tc>
+        <w:tc>
+          <w:tcPr>
+            <w:tcW w:type="dxa" w:w="1120"/>
+          </w:tcPr>
+          <w:p>
+            <w:pPr>
+              <w:jc w:val="left"/>
+            </w:pPr>
+            <w:r/>
+            <w:hyperlink r:id="rId142">
+              <w:r>
+                <w:rPr>
+                  <w:color w:val="0B4F9E"/>
+                  <w:sz w:val="16"/>
+                  <w:u w:val="single"/>
+                </w:rPr>
+                <w:t>ase-calculator-kit: a unified ASE calculator factory for MLIP and DFT calculators</w:t>
+              </w:r>
+            </w:hyperlink>
+          </w:p>
+        </w:tc>
+        <w:tc>
+          <w:tcPr>
+            <w:tcW w:type="dxa" w:w="1120"/>
+          </w:tcPr>
+          <w:p>
+            <w:pPr>
+              <w:jc w:val="left"/>
+            </w:pPr>
+            <w:r/>
+            <w:r>
+              <w:rPr>
+                <w:sz w:val="16"/>
+              </w:rPr>
+              <w:t>MatterSim, SevenNet, NequIP, CHGNet, MACE, UMA</w:t>
+            </w:r>
+          </w:p>
+        </w:tc>
+        <w:tc>
+          <w:tcPr>
+            <w:tcW w:type="dxa" w:w="1120"/>
+          </w:tcPr>
+          <w:p>
+            <w:pPr>
+              <w:jc w:val="left"/>
+            </w:pPr>
+            <w:r/>
+          </w:p>
+        </w:tc>
+        <w:tc>
+          <w:tcPr>
+            <w:tcW w:type="dxa" w:w="1120"/>
+          </w:tcPr>
+          <w:p>
+            <w:pPr>
+              <w:jc w:val="left"/>
+            </w:pPr>
+            <w:r/>
+            <w:r>
+              <w:rPr>
+                <w:sz w:val="16"/>
+              </w:rPr>
+              <w:t>DFT, MLIP</w:t>
+            </w:r>
+          </w:p>
+        </w:tc>
+        <w:tc>
+          <w:tcPr>
+            <w:tcW w:type="dxa" w:w="1120"/>
+          </w:tcPr>
+          <w:p>
+            <w:pPr>
+              <w:jc w:val="left"/>
+            </w:pPr>
+            <w:r/>
+          </w:p>
+        </w:tc>
+        <w:tc>
+          <w:tcPr>
+            <w:tcW w:type="dxa" w:w="1120"/>
+          </w:tcPr>
+          <w:p>
+            <w:pPr>
+              <w:jc w:val="left"/>
+            </w:pPr>
+            <w:r/>
+            <w:r>
+              <w:rPr>
+                <w:sz w:val="16"/>
+              </w:rPr>
+              <w:t>2026-08-28</w:t>
+            </w:r>
+          </w:p>
+        </w:tc>
+        <w:tc>
+          <w:tcPr>
+            <w:tcW w:type="dxa" w:w="1120"/>
+          </w:tcPr>
+          <w:p>
+            <w:pPr>
+              <w:jc w:val="left"/>
+            </w:pPr>
+            <w:r/>
+            <w:hyperlink r:id="rId142">
+              <w:r>
+                <w:rPr>
+                  <w:color w:val="0B4F9E"/>
+                  <w:sz w:val="16"/>
+                  <w:u w:val="single"/>
+                </w:rPr>
+                <w:t>10.5281/zenodo.21807793</w:t>
+              </w:r>
+            </w:hyperlink>
+          </w:p>
+        </w:tc>
+      </w:tr>
+      <w:tr>
+        <w:tc>
+          <w:tcPr>
+            <w:tcW w:type="dxa" w:w="1120"/>
+          </w:tcPr>
+          <w:p>
+            <w:pPr>
+              <w:jc w:val="left"/>
+            </w:pPr>
+            <w:r/>
+            <w:r>
+              <w:rPr>
+                <w:sz w:val="16"/>
+              </w:rPr>
+              <w:t>87</w:t>
+            </w:r>
+          </w:p>
+        </w:tc>
+        <w:tc>
+          <w:tcPr>
+            <w:tcW w:type="dxa" w:w="1120"/>
+          </w:tcPr>
+          <w:p>
+            <w:pPr>
+              <w:jc w:val="left"/>
+            </w:pPr>
+            <w:r/>
+          </w:p>
+        </w:tc>
+        <w:tc>
+          <w:tcPr>
+            <w:tcW w:type="dxa" w:w="1120"/>
+          </w:tcPr>
+          <w:p>
+            <w:pPr>
+              <w:jc w:val="left"/>
+            </w:pPr>
+            <w:r/>
+            <w:hyperlink r:id="rId143">
               <w:r>
                 <w:rPr>
                   <w:color w:val="0B4F9E"/>
@@ -29849,7 +31547,7 @@
               <w:jc w:val="left"/>
             </w:pPr>
             <w:r/>
-            <w:hyperlink r:id="rId131">
+            <w:hyperlink r:id="rId143">
               <w:r>
                 <w:rPr>
                   <w:color w:val="0B4F9E"/>
@@ -29876,31 +31574,170 @@
               <w:rPr>
                 <w:sz w:val="16"/>
               </w:rPr>
-              <w:t>76</w:t>
-            </w:r>
-          </w:p>
-        </w:tc>
-        <w:tc>
-          <w:tcPr>
-            <w:tcW w:type="dxa" w:w="1120"/>
-          </w:tcPr>
-          <w:p>
-            <w:pPr>
-              <w:jc w:val="left"/>
-            </w:pPr>
-            <w:r/>
-          </w:p>
-        </w:tc>
-        <w:tc>
-          <w:tcPr>
-            <w:tcW w:type="dxa" w:w="1120"/>
-          </w:tcPr>
-          <w:p>
-            <w:pPr>
-              <w:jc w:val="left"/>
-            </w:pPr>
-            <w:r/>
-            <w:hyperlink r:id="rId132">
+              <w:t>88</w:t>
+            </w:r>
+          </w:p>
+        </w:tc>
+        <w:tc>
+          <w:tcPr>
+            <w:tcW w:type="dxa" w:w="1120"/>
+          </w:tcPr>
+          <w:p>
+            <w:pPr>
+              <w:jc w:val="left"/>
+            </w:pPr>
+            <w:r/>
+          </w:p>
+        </w:tc>
+        <w:tc>
+          <w:tcPr>
+            <w:tcW w:type="dxa" w:w="1120"/>
+          </w:tcPr>
+          <w:p>
+            <w:pPr>
+              <w:jc w:val="left"/>
+            </w:pPr>
+            <w:r/>
+            <w:hyperlink r:id="rId144">
+              <w:r>
+                <w:rPr>
+                  <w:color w:val="0B4F9E"/>
+                  <w:sz w:val="16"/>
+                  <w:u w:val="single"/>
+                </w:rPr>
+                <w:t>Crystal structure prediction with nuclear quantum and finite-temperature effects via deep free energy learning</w:t>
+              </w:r>
+            </w:hyperlink>
+          </w:p>
+        </w:tc>
+        <w:tc>
+          <w:tcPr>
+            <w:tcW w:type="dxa" w:w="1120"/>
+          </w:tcPr>
+          <w:p>
+            <w:pPr>
+              <w:jc w:val="left"/>
+            </w:pPr>
+            <w:r/>
+          </w:p>
+        </w:tc>
+        <w:tc>
+          <w:tcPr>
+            <w:tcW w:type="dxa" w:w="1120"/>
+          </w:tcPr>
+          <w:p>
+            <w:pPr>
+              <w:jc w:val="left"/>
+            </w:pPr>
+            <w:r/>
+          </w:p>
+        </w:tc>
+        <w:tc>
+          <w:tcPr>
+            <w:tcW w:type="dxa" w:w="1120"/>
+          </w:tcPr>
+          <w:p>
+            <w:pPr>
+              <w:jc w:val="left"/>
+            </w:pPr>
+            <w:r/>
+            <w:r>
+              <w:rPr>
+                <w:sz w:val="16"/>
+              </w:rPr>
+              <w:t>free energy</w:t>
+            </w:r>
+          </w:p>
+        </w:tc>
+        <w:tc>
+          <w:tcPr>
+            <w:tcW w:type="dxa" w:w="1120"/>
+          </w:tcPr>
+          <w:p>
+            <w:pPr>
+              <w:jc w:val="left"/>
+            </w:pPr>
+            <w:r/>
+          </w:p>
+        </w:tc>
+        <w:tc>
+          <w:tcPr>
+            <w:tcW w:type="dxa" w:w="1120"/>
+          </w:tcPr>
+          <w:p>
+            <w:pPr>
+              <w:jc w:val="left"/>
+            </w:pPr>
+            <w:r/>
+            <w:r>
+              <w:rPr>
+                <w:sz w:val="16"/>
+              </w:rPr>
+              <w:t>2026-08-28</w:t>
+            </w:r>
+          </w:p>
+        </w:tc>
+        <w:tc>
+          <w:tcPr>
+            <w:tcW w:type="dxa" w:w="1120"/>
+          </w:tcPr>
+          <w:p>
+            <w:pPr>
+              <w:jc w:val="left"/>
+            </w:pPr>
+            <w:r/>
+            <w:hyperlink r:id="rId144">
+              <w:r>
+                <w:rPr>
+                  <w:color w:val="0B4F9E"/>
+                  <w:sz w:val="16"/>
+                  <w:u w:val="single"/>
+                </w:rPr>
+                <w:t>10.1103/3qjr-mgv7</w:t>
+              </w:r>
+            </w:hyperlink>
+          </w:p>
+        </w:tc>
+      </w:tr>
+      <w:tr>
+        <w:tc>
+          <w:tcPr>
+            <w:tcW w:type="dxa" w:w="1120"/>
+          </w:tcPr>
+          <w:p>
+            <w:pPr>
+              <w:jc w:val="left"/>
+            </w:pPr>
+            <w:r/>
+            <w:r>
+              <w:rPr>
+                <w:sz w:val="16"/>
+              </w:rPr>
+              <w:t>89</w:t>
+            </w:r>
+          </w:p>
+        </w:tc>
+        <w:tc>
+          <w:tcPr>
+            <w:tcW w:type="dxa" w:w="1120"/>
+          </w:tcPr>
+          <w:p>
+            <w:pPr>
+              <w:jc w:val="left"/>
+            </w:pPr>
+            <w:r/>
+          </w:p>
+        </w:tc>
+        <w:tc>
+          <w:tcPr>
+            <w:tcW w:type="dxa" w:w="1120"/>
+          </w:tcPr>
+          <w:p>
+            <w:pPr>
+              <w:jc w:val="left"/>
+            </w:pPr>
+            <w:r/>
+            <w:hyperlink r:id="rId145">
               <w:r>
                 <w:rPr>
                   <w:color w:val="0B4F9E"/>
@@ -29982,7 +31819,7 @@
               <w:jc w:val="left"/>
             </w:pPr>
             <w:r/>
-            <w:hyperlink r:id="rId133">
+            <w:hyperlink r:id="rId146">
               <w:r>
                 <w:rPr>
                   <w:color w:val="0B4F9E"/>
@@ -29990,6 +31827,556 @@
                   <w:u w:val="single"/>
                 </w:rPr>
                 <w:t>10.1038/s41563-026-02744-x</w:t>
+              </w:r>
+            </w:hyperlink>
+          </w:p>
+        </w:tc>
+      </w:tr>
+      <w:tr>
+        <w:tc>
+          <w:tcPr>
+            <w:tcW w:type="dxa" w:w="1120"/>
+          </w:tcPr>
+          <w:p>
+            <w:pPr>
+              <w:jc w:val="left"/>
+            </w:pPr>
+            <w:r/>
+            <w:r>
+              <w:rPr>
+                <w:sz w:val="16"/>
+              </w:rPr>
+              <w:t>90</w:t>
+            </w:r>
+          </w:p>
+        </w:tc>
+        <w:tc>
+          <w:tcPr>
+            <w:tcW w:type="dxa" w:w="1120"/>
+          </w:tcPr>
+          <w:p>
+            <w:pPr>
+              <w:jc w:val="left"/>
+            </w:pPr>
+            <w:r/>
+          </w:p>
+        </w:tc>
+        <w:tc>
+          <w:tcPr>
+            <w:tcW w:type="dxa" w:w="1120"/>
+          </w:tcPr>
+          <w:p>
+            <w:pPr>
+              <w:jc w:val="left"/>
+            </w:pPr>
+            <w:r/>
+            <w:hyperlink r:id="rId147">
+              <w:r>
+                <w:rPr>
+                  <w:color w:val="0B4F9E"/>
+                  <w:sz w:val="16"/>
+                  <w:u w:val="single"/>
+                </w:rPr>
+                <w:t>Atomistic simulations of high-entropy alloys: from density functional theory to machine-learning interatomic potentials</w:t>
+              </w:r>
+            </w:hyperlink>
+          </w:p>
+        </w:tc>
+        <w:tc>
+          <w:tcPr>
+            <w:tcW w:type="dxa" w:w="1120"/>
+          </w:tcPr>
+          <w:p>
+            <w:pPr>
+              <w:jc w:val="left"/>
+            </w:pPr>
+            <w:r/>
+          </w:p>
+        </w:tc>
+        <w:tc>
+          <w:tcPr>
+            <w:tcW w:type="dxa" w:w="1120"/>
+          </w:tcPr>
+          <w:p>
+            <w:pPr>
+              <w:jc w:val="left"/>
+            </w:pPr>
+            <w:r/>
+            <w:r>
+              <w:rPr>
+                <w:sz w:val="16"/>
+              </w:rPr>
+              <w:t>alloy</w:t>
+            </w:r>
+          </w:p>
+        </w:tc>
+        <w:tc>
+          <w:tcPr>
+            <w:tcW w:type="dxa" w:w="1120"/>
+          </w:tcPr>
+          <w:p>
+            <w:pPr>
+              <w:jc w:val="left"/>
+            </w:pPr>
+            <w:r/>
+            <w:r>
+              <w:rPr>
+                <w:sz w:val="16"/>
+              </w:rPr>
+              <w:t>DFT, MLIP, free energy</w:t>
+            </w:r>
+          </w:p>
+        </w:tc>
+        <w:tc>
+          <w:tcPr>
+            <w:tcW w:type="dxa" w:w="1120"/>
+          </w:tcPr>
+          <w:p>
+            <w:pPr>
+              <w:jc w:val="left"/>
+            </w:pPr>
+            <w:r/>
+          </w:p>
+        </w:tc>
+        <w:tc>
+          <w:tcPr>
+            <w:tcW w:type="dxa" w:w="1120"/>
+          </w:tcPr>
+          <w:p>
+            <w:pPr>
+              <w:jc w:val="left"/>
+            </w:pPr>
+            <w:r/>
+            <w:r>
+              <w:rPr>
+                <w:sz w:val="16"/>
+              </w:rPr>
+              <w:t>2026-08-29</w:t>
+            </w:r>
+          </w:p>
+        </w:tc>
+        <w:tc>
+          <w:tcPr>
+            <w:tcW w:type="dxa" w:w="1120"/>
+          </w:tcPr>
+          <w:p>
+            <w:pPr>
+              <w:jc w:val="left"/>
+            </w:pPr>
+            <w:r/>
+            <w:hyperlink r:id="rId147">
+              <w:r>
+                <w:rPr>
+                  <w:color w:val="0B4F9E"/>
+                  <w:sz w:val="16"/>
+                  <w:u w:val="single"/>
+                </w:rPr>
+                <w:t>10.1007/s10853-026-13520-2</w:t>
+              </w:r>
+            </w:hyperlink>
+          </w:p>
+        </w:tc>
+      </w:tr>
+      <w:tr>
+        <w:tc>
+          <w:tcPr>
+            <w:tcW w:type="dxa" w:w="1120"/>
+          </w:tcPr>
+          <w:p>
+            <w:pPr>
+              <w:jc w:val="left"/>
+            </w:pPr>
+            <w:r/>
+            <w:r>
+              <w:rPr>
+                <w:sz w:val="16"/>
+              </w:rPr>
+              <w:t>91</w:t>
+            </w:r>
+          </w:p>
+        </w:tc>
+        <w:tc>
+          <w:tcPr>
+            <w:tcW w:type="dxa" w:w="1120"/>
+          </w:tcPr>
+          <w:p>
+            <w:pPr>
+              <w:jc w:val="left"/>
+            </w:pPr>
+            <w:r/>
+          </w:p>
+        </w:tc>
+        <w:tc>
+          <w:tcPr>
+            <w:tcW w:type="dxa" w:w="1120"/>
+          </w:tcPr>
+          <w:p>
+            <w:pPr>
+              <w:jc w:val="left"/>
+            </w:pPr>
+            <w:r/>
+            <w:hyperlink r:id="rId148">
+              <w:r>
+                <w:rPr>
+                  <w:color w:val="0B4F9E"/>
+                  <w:sz w:val="16"/>
+                  <w:u w:val="single"/>
+                </w:rPr>
+                <w:t>Volumetric reference data of the orbit: a deep learning MRI analysis in the German national cohort</w:t>
+              </w:r>
+            </w:hyperlink>
+          </w:p>
+        </w:tc>
+        <w:tc>
+          <w:tcPr>
+            <w:tcW w:type="dxa" w:w="1120"/>
+          </w:tcPr>
+          <w:p>
+            <w:pPr>
+              <w:jc w:val="left"/>
+            </w:pPr>
+            <w:r/>
+          </w:p>
+        </w:tc>
+        <w:tc>
+          <w:tcPr>
+            <w:tcW w:type="dxa" w:w="1120"/>
+          </w:tcPr>
+          <w:p>
+            <w:pPr>
+              <w:jc w:val="left"/>
+            </w:pPr>
+            <w:r/>
+          </w:p>
+        </w:tc>
+        <w:tc>
+          <w:tcPr>
+            <w:tcW w:type="dxa" w:w="1120"/>
+          </w:tcPr>
+          <w:p>
+            <w:pPr>
+              <w:jc w:val="left"/>
+            </w:pPr>
+            <w:r/>
+          </w:p>
+        </w:tc>
+        <w:tc>
+          <w:tcPr>
+            <w:tcW w:type="dxa" w:w="1120"/>
+          </w:tcPr>
+          <w:p>
+            <w:pPr>
+              <w:jc w:val="left"/>
+            </w:pPr>
+            <w:r/>
+          </w:p>
+        </w:tc>
+        <w:tc>
+          <w:tcPr>
+            <w:tcW w:type="dxa" w:w="1120"/>
+          </w:tcPr>
+          <w:p>
+            <w:pPr>
+              <w:jc w:val="left"/>
+            </w:pPr>
+            <w:r/>
+            <w:r>
+              <w:rPr>
+                <w:sz w:val="16"/>
+              </w:rPr>
+              <w:t>2026-08-29</w:t>
+            </w:r>
+          </w:p>
+        </w:tc>
+        <w:tc>
+          <w:tcPr>
+            <w:tcW w:type="dxa" w:w="1120"/>
+          </w:tcPr>
+          <w:p>
+            <w:pPr>
+              <w:jc w:val="left"/>
+            </w:pPr>
+            <w:r/>
+            <w:hyperlink r:id="rId148">
+              <w:r>
+                <w:rPr>
+                  <w:color w:val="0B4F9E"/>
+                  <w:sz w:val="16"/>
+                  <w:u w:val="single"/>
+                </w:rPr>
+                <w:t>10.1038/s41598-026-68393-x</w:t>
+              </w:r>
+            </w:hyperlink>
+          </w:p>
+        </w:tc>
+      </w:tr>
+      <w:tr>
+        <w:tc>
+          <w:tcPr>
+            <w:tcW w:type="dxa" w:w="1120"/>
+          </w:tcPr>
+          <w:p>
+            <w:pPr>
+              <w:jc w:val="left"/>
+            </w:pPr>
+            <w:r/>
+            <w:r>
+              <w:rPr>
+                <w:sz w:val="16"/>
+              </w:rPr>
+              <w:t>92</w:t>
+            </w:r>
+          </w:p>
+        </w:tc>
+        <w:tc>
+          <w:tcPr>
+            <w:tcW w:type="dxa" w:w="1120"/>
+          </w:tcPr>
+          <w:p>
+            <w:pPr>
+              <w:jc w:val="left"/>
+            </w:pPr>
+            <w:r/>
+          </w:p>
+        </w:tc>
+        <w:tc>
+          <w:tcPr>
+            <w:tcW w:type="dxa" w:w="1120"/>
+          </w:tcPr>
+          <w:p>
+            <w:pPr>
+              <w:jc w:val="left"/>
+            </w:pPr>
+            <w:r/>
+            <w:hyperlink r:id="rId149">
+              <w:r>
+                <w:rPr>
+                  <w:color w:val="0B4F9E"/>
+                  <w:sz w:val="16"/>
+                  <w:u w:val="single"/>
+                </w:rPr>
+                <w:t>DFT and machine learning insights into productive versus self-metathesis selectivity in ruthenium-catalyzed ethenolysis</w:t>
+              </w:r>
+            </w:hyperlink>
+          </w:p>
+        </w:tc>
+        <w:tc>
+          <w:tcPr>
+            <w:tcW w:type="dxa" w:w="1120"/>
+          </w:tcPr>
+          <w:p>
+            <w:pPr>
+              <w:jc w:val="left"/>
+            </w:pPr>
+            <w:r/>
+          </w:p>
+        </w:tc>
+        <w:tc>
+          <w:tcPr>
+            <w:tcW w:type="dxa" w:w="1120"/>
+          </w:tcPr>
+          <w:p>
+            <w:pPr>
+              <w:jc w:val="left"/>
+            </w:pPr>
+            <w:r/>
+          </w:p>
+        </w:tc>
+        <w:tc>
+          <w:tcPr>
+            <w:tcW w:type="dxa" w:w="1120"/>
+          </w:tcPr>
+          <w:p>
+            <w:pPr>
+              <w:jc w:val="left"/>
+            </w:pPr>
+            <w:r/>
+            <w:r>
+              <w:rPr>
+                <w:sz w:val="16"/>
+              </w:rPr>
+              <w:t>DFT</w:t>
+            </w:r>
+          </w:p>
+        </w:tc>
+        <w:tc>
+          <w:tcPr>
+            <w:tcW w:type="dxa" w:w="1120"/>
+          </w:tcPr>
+          <w:p>
+            <w:pPr>
+              <w:jc w:val="left"/>
+            </w:pPr>
+            <w:r/>
+          </w:p>
+        </w:tc>
+        <w:tc>
+          <w:tcPr>
+            <w:tcW w:type="dxa" w:w="1120"/>
+          </w:tcPr>
+          <w:p>
+            <w:pPr>
+              <w:jc w:val="left"/>
+            </w:pPr>
+            <w:r/>
+            <w:r>
+              <w:rPr>
+                <w:sz w:val="16"/>
+              </w:rPr>
+              <w:t>2026-08-29</w:t>
+            </w:r>
+          </w:p>
+        </w:tc>
+        <w:tc>
+          <w:tcPr>
+            <w:tcW w:type="dxa" w:w="1120"/>
+          </w:tcPr>
+          <w:p>
+            <w:pPr>
+              <w:jc w:val="left"/>
+            </w:pPr>
+            <w:r/>
+            <w:hyperlink r:id="rId149">
+              <w:r>
+                <w:rPr>
+                  <w:color w:val="0B4F9E"/>
+                  <w:sz w:val="16"/>
+                  <w:u w:val="single"/>
+                </w:rPr>
+                <w:t>10.1016/j.jcat.2026.117142</w:t>
+              </w:r>
+            </w:hyperlink>
+          </w:p>
+        </w:tc>
+      </w:tr>
+      <w:tr>
+        <w:tc>
+          <w:tcPr>
+            <w:tcW w:type="dxa" w:w="1120"/>
+          </w:tcPr>
+          <w:p>
+            <w:pPr>
+              <w:jc w:val="left"/>
+            </w:pPr>
+            <w:r/>
+            <w:r>
+              <w:rPr>
+                <w:sz w:val="16"/>
+              </w:rPr>
+              <w:t>93</w:t>
+            </w:r>
+          </w:p>
+        </w:tc>
+        <w:tc>
+          <w:tcPr>
+            <w:tcW w:type="dxa" w:w="1120"/>
+          </w:tcPr>
+          <w:p>
+            <w:pPr>
+              <w:jc w:val="left"/>
+            </w:pPr>
+            <w:r/>
+          </w:p>
+        </w:tc>
+        <w:tc>
+          <w:tcPr>
+            <w:tcW w:type="dxa" w:w="1120"/>
+          </w:tcPr>
+          <w:p>
+            <w:pPr>
+              <w:jc w:val="left"/>
+            </w:pPr>
+            <w:r/>
+            <w:hyperlink r:id="rId150">
+              <w:r>
+                <w:rPr>
+                  <w:color w:val="0B4F9E"/>
+                  <w:sz w:val="16"/>
+                  <w:u w:val="single"/>
+                </w:rPr>
+                <w:t>PCFM-based small-sample data augmentation and inverse design of an all-dielectric metasurface supporting triple Fano resonances</w:t>
+              </w:r>
+            </w:hyperlink>
+          </w:p>
+        </w:tc>
+        <w:tc>
+          <w:tcPr>
+            <w:tcW w:type="dxa" w:w="1120"/>
+          </w:tcPr>
+          <w:p>
+            <w:pPr>
+              <w:jc w:val="left"/>
+            </w:pPr>
+            <w:r/>
+          </w:p>
+        </w:tc>
+        <w:tc>
+          <w:tcPr>
+            <w:tcW w:type="dxa" w:w="1120"/>
+          </w:tcPr>
+          <w:p>
+            <w:pPr>
+              <w:jc w:val="left"/>
+            </w:pPr>
+            <w:r/>
+          </w:p>
+        </w:tc>
+        <w:tc>
+          <w:tcPr>
+            <w:tcW w:type="dxa" w:w="1120"/>
+          </w:tcPr>
+          <w:p>
+            <w:pPr>
+              <w:jc w:val="left"/>
+            </w:pPr>
+            <w:r/>
+          </w:p>
+        </w:tc>
+        <w:tc>
+          <w:tcPr>
+            <w:tcW w:type="dxa" w:w="1120"/>
+          </w:tcPr>
+          <w:p>
+            <w:pPr>
+              <w:jc w:val="left"/>
+            </w:pPr>
+            <w:r/>
+          </w:p>
+        </w:tc>
+        <w:tc>
+          <w:tcPr>
+            <w:tcW w:type="dxa" w:w="1120"/>
+          </w:tcPr>
+          <w:p>
+            <w:pPr>
+              <w:jc w:val="left"/>
+            </w:pPr>
+            <w:r/>
+            <w:r>
+              <w:rPr>
+                <w:sz w:val="16"/>
+              </w:rPr>
+              <w:t>2026-08-29</w:t>
+            </w:r>
+          </w:p>
+        </w:tc>
+        <w:tc>
+          <w:tcPr>
+            <w:tcW w:type="dxa" w:w="1120"/>
+          </w:tcPr>
+          <w:p>
+            <w:pPr>
+              <w:jc w:val="left"/>
+            </w:pPr>
+            <w:r/>
+            <w:hyperlink r:id="rId150">
+              <w:r>
+                <w:rPr>
+                  <w:color w:val="0B4F9E"/>
+                  <w:sz w:val="16"/>
+                  <w:u w:val="single"/>
+                </w:rPr>
+                <w:t>10.1016/j.optcom.2026.133711</w:t>
               </w:r>
             </w:hyperlink>
           </w:p>

</xml_diff>

<commit_message>
Digest + summary: 2026-08-30
</commit_message>
<xml_diff>
--- a/MODEL_PERFORMANCE.docx
+++ b/MODEL_PERFORMANCE.docx
@@ -17,7 +17,7 @@
     </w:p>
     <w:p>
       <w:r>
-        <w:t xml:space="preserve">Generated 2026-08-29 by </w:t>
+        <w:t xml:space="preserve">Generated 2026-08-30 by </w:t>
       </w:r>
       <w:r>
         <w:rPr>
@@ -200,7 +200,7 @@
         <w:rPr>
           <w:b/>
         </w:rPr>
-        <w:t>93</w:t>
+        <w:t>96</w:t>
       </w:r>
       <w:r>
         <w:t xml:space="preserve"> studies parsed from the digest; </w:t>
@@ -20432,7 +20432,7 @@
               <w:rPr>
                 <w:sz w:val="16"/>
               </w:rPr>
-              <w:t>GRACE-1L-OAM, SevenNet-0, MatterSim, MACE-MP-0</w:t>
+              <w:t>GRACE-1L-OAM, SevenNet-0, MACE-MP-0, MatterSim</w:t>
             </w:r>
           </w:p>
         </w:tc>
@@ -23828,7 +23828,7 @@
               <w:rPr>
                 <w:sz w:val="16"/>
               </w:rPr>
-              <w:t>MEGNet, ALIGNN, CGCNN</w:t>
+              <w:t>ALIGNN, MEGNet, CGCNN</w:t>
             </w:r>
           </w:p>
         </w:tc>
@@ -27677,7 +27677,7 @@
               <w:rPr>
                 <w:sz w:val="16"/>
               </w:rPr>
-              <w:t>MatterGen, MatterSim</w:t>
+              <w:t>MatterSim, MatterGen</w:t>
             </w:r>
           </w:p>
         </w:tc>
@@ -31345,7 +31345,7 @@
               <w:rPr>
                 <w:sz w:val="16"/>
               </w:rPr>
-              <w:t>MatterSim, SevenNet, NequIP, CHGNet, MACE, UMA</w:t>
+              <w:t>MatterSim, SevenNet, CHGNet, NequIP, MACE, UMA</w:t>
             </w:r>
           </w:p>
         </w:tc>
@@ -32022,6 +32022,145 @@
                   <w:sz w:val="16"/>
                   <w:u w:val="single"/>
                 </w:rPr>
+                <w:t>High-quality, high-information datasets for universal atomistic machine learning</w:t>
+              </w:r>
+            </w:hyperlink>
+          </w:p>
+        </w:tc>
+        <w:tc>
+          <w:tcPr>
+            <w:tcW w:type="dxa" w:w="1120"/>
+          </w:tcPr>
+          <w:p>
+            <w:pPr>
+              <w:jc w:val="left"/>
+            </w:pPr>
+            <w:r/>
+          </w:p>
+        </w:tc>
+        <w:tc>
+          <w:tcPr>
+            <w:tcW w:type="dxa" w:w="1120"/>
+          </w:tcPr>
+          <w:p>
+            <w:pPr>
+              <w:jc w:val="left"/>
+            </w:pPr>
+            <w:r/>
+          </w:p>
+        </w:tc>
+        <w:tc>
+          <w:tcPr>
+            <w:tcW w:type="dxa" w:w="1120"/>
+          </w:tcPr>
+          <w:p>
+            <w:pPr>
+              <w:jc w:val="left"/>
+            </w:pPr>
+            <w:r/>
+            <w:r>
+              <w:rPr>
+                <w:sz w:val="16"/>
+              </w:rPr>
+              <w:t>r2SCAN, meta-GGA, DFT</w:t>
+            </w:r>
+          </w:p>
+        </w:tc>
+        <w:tc>
+          <w:tcPr>
+            <w:tcW w:type="dxa" w:w="1120"/>
+          </w:tcPr>
+          <w:p>
+            <w:pPr>
+              <w:jc w:val="left"/>
+            </w:pPr>
+            <w:r/>
+          </w:p>
+        </w:tc>
+        <w:tc>
+          <w:tcPr>
+            <w:tcW w:type="dxa" w:w="1120"/>
+          </w:tcPr>
+          <w:p>
+            <w:pPr>
+              <w:jc w:val="left"/>
+            </w:pPr>
+            <w:r/>
+            <w:r>
+              <w:rPr>
+                <w:sz w:val="16"/>
+              </w:rPr>
+              <w:t>2026-08-29</w:t>
+            </w:r>
+          </w:p>
+        </w:tc>
+        <w:tc>
+          <w:tcPr>
+            <w:tcW w:type="dxa" w:w="1120"/>
+          </w:tcPr>
+          <w:p>
+            <w:pPr>
+              <w:jc w:val="left"/>
+            </w:pPr>
+            <w:r/>
+            <w:hyperlink r:id="rId148">
+              <w:r>
+                <w:rPr>
+                  <w:color w:val="0B4F9E"/>
+                  <w:sz w:val="16"/>
+                  <w:u w:val="single"/>
+                </w:rPr>
+                <w:t>10.24435/materialscloud:vm-51</w:t>
+              </w:r>
+            </w:hyperlink>
+          </w:p>
+        </w:tc>
+      </w:tr>
+      <w:tr>
+        <w:tc>
+          <w:tcPr>
+            <w:tcW w:type="dxa" w:w="1120"/>
+          </w:tcPr>
+          <w:p>
+            <w:pPr>
+              <w:jc w:val="left"/>
+            </w:pPr>
+            <w:r/>
+            <w:r>
+              <w:rPr>
+                <w:sz w:val="16"/>
+              </w:rPr>
+              <w:t>92</w:t>
+            </w:r>
+          </w:p>
+        </w:tc>
+        <w:tc>
+          <w:tcPr>
+            <w:tcW w:type="dxa" w:w="1120"/>
+          </w:tcPr>
+          <w:p>
+            <w:pPr>
+              <w:jc w:val="left"/>
+            </w:pPr>
+            <w:r/>
+          </w:p>
+        </w:tc>
+        <w:tc>
+          <w:tcPr>
+            <w:tcW w:type="dxa" w:w="1120"/>
+          </w:tcPr>
+          <w:p>
+            <w:pPr>
+              <w:jc w:val="left"/>
+            </w:pPr>
+            <w:r/>
+            <w:hyperlink r:id="rId149">
+              <w:r>
+                <w:rPr>
+                  <w:color w:val="0B4F9E"/>
+                  <w:sz w:val="16"/>
+                  <w:u w:val="single"/>
+                </w:rPr>
                 <w:t>Volumetric reference data of the orbit: a deep learning MRI analysis in the German national cohort</w:t>
               </w:r>
             </w:hyperlink>
@@ -32097,7 +32236,7 @@
               <w:jc w:val="left"/>
             </w:pPr>
             <w:r/>
-            <w:hyperlink r:id="rId148">
+            <w:hyperlink r:id="rId149">
               <w:r>
                 <w:rPr>
                   <w:color w:val="0B4F9E"/>
@@ -32124,31 +32263,31 @@
               <w:rPr>
                 <w:sz w:val="16"/>
               </w:rPr>
-              <w:t>92</w:t>
-            </w:r>
-          </w:p>
-        </w:tc>
-        <w:tc>
-          <w:tcPr>
-            <w:tcW w:type="dxa" w:w="1120"/>
-          </w:tcPr>
-          <w:p>
-            <w:pPr>
-              <w:jc w:val="left"/>
-            </w:pPr>
-            <w:r/>
-          </w:p>
-        </w:tc>
-        <w:tc>
-          <w:tcPr>
-            <w:tcW w:type="dxa" w:w="1120"/>
-          </w:tcPr>
-          <w:p>
-            <w:pPr>
-              <w:jc w:val="left"/>
-            </w:pPr>
-            <w:r/>
-            <w:hyperlink r:id="rId149">
+              <w:t>93</w:t>
+            </w:r>
+          </w:p>
+        </w:tc>
+        <w:tc>
+          <w:tcPr>
+            <w:tcW w:type="dxa" w:w="1120"/>
+          </w:tcPr>
+          <w:p>
+            <w:pPr>
+              <w:jc w:val="left"/>
+            </w:pPr>
+            <w:r/>
+          </w:p>
+        </w:tc>
+        <w:tc>
+          <w:tcPr>
+            <w:tcW w:type="dxa" w:w="1120"/>
+          </w:tcPr>
+          <w:p>
+            <w:pPr>
+              <w:jc w:val="left"/>
+            </w:pPr>
+            <w:r/>
+            <w:hyperlink r:id="rId150">
               <w:r>
                 <w:rPr>
                   <w:color w:val="0B4F9E"/>
@@ -32236,7 +32375,7 @@
               <w:jc w:val="left"/>
             </w:pPr>
             <w:r/>
-            <w:hyperlink r:id="rId149">
+            <w:hyperlink r:id="rId150">
               <w:r>
                 <w:rPr>
                   <w:color w:val="0B4F9E"/>
@@ -32263,31 +32402,31 @@
               <w:rPr>
                 <w:sz w:val="16"/>
               </w:rPr>
-              <w:t>93</w:t>
-            </w:r>
-          </w:p>
-        </w:tc>
-        <w:tc>
-          <w:tcPr>
-            <w:tcW w:type="dxa" w:w="1120"/>
-          </w:tcPr>
-          <w:p>
-            <w:pPr>
-              <w:jc w:val="left"/>
-            </w:pPr>
-            <w:r/>
-          </w:p>
-        </w:tc>
-        <w:tc>
-          <w:tcPr>
-            <w:tcW w:type="dxa" w:w="1120"/>
-          </w:tcPr>
-          <w:p>
-            <w:pPr>
-              <w:jc w:val="left"/>
-            </w:pPr>
-            <w:r/>
-            <w:hyperlink r:id="rId150">
+              <w:t>94</w:t>
+            </w:r>
+          </w:p>
+        </w:tc>
+        <w:tc>
+          <w:tcPr>
+            <w:tcW w:type="dxa" w:w="1120"/>
+          </w:tcPr>
+          <w:p>
+            <w:pPr>
+              <w:jc w:val="left"/>
+            </w:pPr>
+            <w:r/>
+          </w:p>
+        </w:tc>
+        <w:tc>
+          <w:tcPr>
+            <w:tcW w:type="dxa" w:w="1120"/>
+          </w:tcPr>
+          <w:p>
+            <w:pPr>
+              <w:jc w:val="left"/>
+            </w:pPr>
+            <w:r/>
+            <w:hyperlink r:id="rId151">
               <w:r>
                 <w:rPr>
                   <w:color w:val="0B4F9E"/>
@@ -32369,7 +32508,7 @@
               <w:jc w:val="left"/>
             </w:pPr>
             <w:r/>
-            <w:hyperlink r:id="rId150">
+            <w:hyperlink r:id="rId151">
               <w:r>
                 <w:rPr>
                   <w:color w:val="0B4F9E"/>
@@ -32377,6 +32516,278 @@
                   <w:u w:val="single"/>
                 </w:rPr>
                 <w:t>10.1016/j.optcom.2026.133711</w:t>
+              </w:r>
+            </w:hyperlink>
+          </w:p>
+        </w:tc>
+      </w:tr>
+      <w:tr>
+        <w:tc>
+          <w:tcPr>
+            <w:tcW w:type="dxa" w:w="1120"/>
+          </w:tcPr>
+          <w:p>
+            <w:pPr>
+              <w:jc w:val="left"/>
+            </w:pPr>
+            <w:r/>
+            <w:r>
+              <w:rPr>
+                <w:sz w:val="16"/>
+              </w:rPr>
+              <w:t>95</w:t>
+            </w:r>
+          </w:p>
+        </w:tc>
+        <w:tc>
+          <w:tcPr>
+            <w:tcW w:type="dxa" w:w="1120"/>
+          </w:tcPr>
+          <w:p>
+            <w:pPr>
+              <w:jc w:val="left"/>
+            </w:pPr>
+            <w:r/>
+          </w:p>
+        </w:tc>
+        <w:tc>
+          <w:tcPr>
+            <w:tcW w:type="dxa" w:w="1120"/>
+          </w:tcPr>
+          <w:p>
+            <w:pPr>
+              <w:jc w:val="left"/>
+            </w:pPr>
+            <w:r/>
+            <w:hyperlink r:id="rId152">
+              <w:r>
+                <w:rPr>
+                  <w:color w:val="0B4F9E"/>
+                  <w:sz w:val="16"/>
+                  <w:u w:val="single"/>
+                </w:rPr>
+                <w:t>Learning 3D void growth and coalescence in heterogeneous polycrystalline materials using vision Transformer models</w:t>
+              </w:r>
+            </w:hyperlink>
+          </w:p>
+        </w:tc>
+        <w:tc>
+          <w:tcPr>
+            <w:tcW w:type="dxa" w:w="1120"/>
+          </w:tcPr>
+          <w:p>
+            <w:pPr>
+              <w:jc w:val="left"/>
+            </w:pPr>
+            <w:r/>
+          </w:p>
+        </w:tc>
+        <w:tc>
+          <w:tcPr>
+            <w:tcW w:type="dxa" w:w="1120"/>
+          </w:tcPr>
+          <w:p>
+            <w:pPr>
+              <w:jc w:val="left"/>
+            </w:pPr>
+            <w:r/>
+          </w:p>
+        </w:tc>
+        <w:tc>
+          <w:tcPr>
+            <w:tcW w:type="dxa" w:w="1120"/>
+          </w:tcPr>
+          <w:p>
+            <w:pPr>
+              <w:jc w:val="left"/>
+            </w:pPr>
+            <w:r/>
+          </w:p>
+        </w:tc>
+        <w:tc>
+          <w:tcPr>
+            <w:tcW w:type="dxa" w:w="1120"/>
+          </w:tcPr>
+          <w:p>
+            <w:pPr>
+              <w:jc w:val="left"/>
+            </w:pPr>
+            <w:r/>
+          </w:p>
+        </w:tc>
+        <w:tc>
+          <w:tcPr>
+            <w:tcW w:type="dxa" w:w="1120"/>
+          </w:tcPr>
+          <w:p>
+            <w:pPr>
+              <w:jc w:val="left"/>
+            </w:pPr>
+            <w:r/>
+            <w:r>
+              <w:rPr>
+                <w:sz w:val="16"/>
+              </w:rPr>
+              <w:t>2026-08-30</w:t>
+            </w:r>
+          </w:p>
+        </w:tc>
+        <w:tc>
+          <w:tcPr>
+            <w:tcW w:type="dxa" w:w="1120"/>
+          </w:tcPr>
+          <w:p>
+            <w:pPr>
+              <w:jc w:val="left"/>
+            </w:pPr>
+            <w:r/>
+            <w:hyperlink r:id="rId152">
+              <w:r>
+                <w:rPr>
+                  <w:color w:val="0B4F9E"/>
+                  <w:sz w:val="16"/>
+                  <w:u w:val="single"/>
+                </w:rPr>
+                <w:t>10.1016/j.engfracmech.2026.112576</w:t>
+              </w:r>
+            </w:hyperlink>
+          </w:p>
+        </w:tc>
+      </w:tr>
+      <w:tr>
+        <w:tc>
+          <w:tcPr>
+            <w:tcW w:type="dxa" w:w="1120"/>
+          </w:tcPr>
+          <w:p>
+            <w:pPr>
+              <w:jc w:val="left"/>
+            </w:pPr>
+            <w:r/>
+            <w:r>
+              <w:rPr>
+                <w:sz w:val="16"/>
+              </w:rPr>
+              <w:t>96</w:t>
+            </w:r>
+          </w:p>
+        </w:tc>
+        <w:tc>
+          <w:tcPr>
+            <w:tcW w:type="dxa" w:w="1120"/>
+          </w:tcPr>
+          <w:p>
+            <w:pPr>
+              <w:jc w:val="left"/>
+            </w:pPr>
+            <w:r/>
+          </w:p>
+        </w:tc>
+        <w:tc>
+          <w:tcPr>
+            <w:tcW w:type="dxa" w:w="1120"/>
+          </w:tcPr>
+          <w:p>
+            <w:pPr>
+              <w:jc w:val="left"/>
+            </w:pPr>
+            <w:r/>
+            <w:hyperlink r:id="rId153">
+              <w:r>
+                <w:rPr>
+                  <w:color w:val="0B4F9E"/>
+                  <w:sz w:val="16"/>
+                  <w:u w:val="single"/>
+                </w:rPr>
+                <w:t>DFA-Grasp: Depth Foundation Model-Augmented Transparent Object Depth Completion for Robotic Grasping</w:t>
+              </w:r>
+            </w:hyperlink>
+          </w:p>
+        </w:tc>
+        <w:tc>
+          <w:tcPr>
+            <w:tcW w:type="dxa" w:w="1120"/>
+          </w:tcPr>
+          <w:p>
+            <w:pPr>
+              <w:jc w:val="left"/>
+            </w:pPr>
+            <w:r/>
+          </w:p>
+        </w:tc>
+        <w:tc>
+          <w:tcPr>
+            <w:tcW w:type="dxa" w:w="1120"/>
+          </w:tcPr>
+          <w:p>
+            <w:pPr>
+              <w:jc w:val="left"/>
+            </w:pPr>
+            <w:r/>
+          </w:p>
+        </w:tc>
+        <w:tc>
+          <w:tcPr>
+            <w:tcW w:type="dxa" w:w="1120"/>
+          </w:tcPr>
+          <w:p>
+            <w:pPr>
+              <w:jc w:val="left"/>
+            </w:pPr>
+            <w:r/>
+            <w:r>
+              <w:rPr>
+                <w:sz w:val="16"/>
+              </w:rPr>
+              <w:t>MLIP</w:t>
+            </w:r>
+          </w:p>
+        </w:tc>
+        <w:tc>
+          <w:tcPr>
+            <w:tcW w:type="dxa" w:w="1120"/>
+          </w:tcPr>
+          <w:p>
+            <w:pPr>
+              <w:jc w:val="left"/>
+            </w:pPr>
+            <w:r/>
+          </w:p>
+        </w:tc>
+        <w:tc>
+          <w:tcPr>
+            <w:tcW w:type="dxa" w:w="1120"/>
+          </w:tcPr>
+          <w:p>
+            <w:pPr>
+              <w:jc w:val="left"/>
+            </w:pPr>
+            <w:r/>
+            <w:r>
+              <w:rPr>
+                <w:sz w:val="16"/>
+              </w:rPr>
+              <w:t>2026-08-30</w:t>
+            </w:r>
+          </w:p>
+        </w:tc>
+        <w:tc>
+          <w:tcPr>
+            <w:tcW w:type="dxa" w:w="1120"/>
+          </w:tcPr>
+          <w:p>
+            <w:pPr>
+              <w:jc w:val="left"/>
+            </w:pPr>
+            <w:r/>
+            <w:hyperlink r:id="rId153">
+              <w:r>
+                <w:rPr>
+                  <w:color w:val="0B4F9E"/>
+                  <w:sz w:val="16"/>
+                  <w:u w:val="single"/>
+                </w:rPr>
+                <w:t>10.1016/j.robot.2026.105733</w:t>
               </w:r>
             </w:hyperlink>
           </w:p>

</xml_diff>

<commit_message>
Digest + summary: 2026-09-01
</commit_message>
<xml_diff>
--- a/MODEL_PERFORMANCE.docx
+++ b/MODEL_PERFORMANCE.docx
@@ -17,7 +17,7 @@
     </w:p>
     <w:p>
       <w:r>
-        <w:t xml:space="preserve">Generated 2026-08-31 by </w:t>
+        <w:t xml:space="preserve">Generated 2026-09-01 by </w:t>
       </w:r>
       <w:r>
         <w:rPr>
@@ -200,7 +200,7 @@
         <w:rPr>
           <w:b/>
         </w:rPr>
-        <w:t>108</w:t>
+        <w:t>122</w:t>
       </w:r>
       <w:r>
         <w:t xml:space="preserve"> studies parsed from the digest; </w:t>
@@ -20728,7 +20728,7 @@
               <w:rPr>
                 <w:sz w:val="16"/>
               </w:rPr>
-              <w:t>GRACE-1L-OAM, SevenNet-0, MatterSim, MACE-MP-0</w:t>
+              <w:t>GRACE-1L-OAM, SevenNet-0, MACE-MP-0, MatterSim</w:t>
             </w:r>
           </w:p>
         </w:tc>
@@ -24124,7 +24124,7 @@
               <w:rPr>
                 <w:sz w:val="16"/>
               </w:rPr>
-              <w:t>ALIGNN, MEGNet, CGCNN</w:t>
+              <w:t>MEGNet, ALIGNN, CGCNN</w:t>
             </w:r>
           </w:p>
         </w:tc>
@@ -26136,7 +26136,7 @@
               <w:rPr>
                 <w:sz w:val="16"/>
               </w:rPr>
-              <w:t>CHGNet, ALIGNN</w:t>
+              <w:t>ALIGNN, CHGNet</w:t>
             </w:r>
           </w:p>
         </w:tc>
@@ -27973,7 +27973,7 @@
               <w:rPr>
                 <w:sz w:val="16"/>
               </w:rPr>
-              <w:t>MatterGen, MatterSim</w:t>
+              <w:t>MatterSim, MatterGen</w:t>
             </w:r>
           </w:p>
         </w:tc>
@@ -33968,6 +33968,707 @@
                   <w:sz w:val="16"/>
                   <w:u w:val="single"/>
                 </w:rPr>
+                <w:t>Cesium Clustering and Fluoroberyllate Network Disruption in FLiBe: A Total Scattering and Molecular Dynamics Study</w:t>
+              </w:r>
+            </w:hyperlink>
+          </w:p>
+        </w:tc>
+        <w:tc>
+          <w:tcPr>
+            <w:tcW w:type="dxa" w:w="1120"/>
+          </w:tcPr>
+          <w:p>
+            <w:pPr>
+              <w:jc w:val="left"/>
+            </w:pPr>
+            <w:r/>
+          </w:p>
+        </w:tc>
+        <w:tc>
+          <w:tcPr>
+            <w:tcW w:type="dxa" w:w="1120"/>
+          </w:tcPr>
+          <w:p>
+            <w:pPr>
+              <w:jc w:val="left"/>
+            </w:pPr>
+            <w:r/>
+          </w:p>
+        </w:tc>
+        <w:tc>
+          <w:tcPr>
+            <w:tcW w:type="dxa" w:w="1120"/>
+          </w:tcPr>
+          <w:p>
+            <w:pPr>
+              <w:jc w:val="left"/>
+            </w:pPr>
+            <w:r/>
+            <w:r>
+              <w:rPr>
+                <w:sz w:val="16"/>
+              </w:rPr>
+              <w:t>MD</w:t>
+            </w:r>
+          </w:p>
+        </w:tc>
+        <w:tc>
+          <w:tcPr>
+            <w:tcW w:type="dxa" w:w="1120"/>
+          </w:tcPr>
+          <w:p>
+            <w:pPr>
+              <w:jc w:val="left"/>
+            </w:pPr>
+            <w:r/>
+          </w:p>
+        </w:tc>
+        <w:tc>
+          <w:tcPr>
+            <w:tcW w:type="dxa" w:w="1120"/>
+          </w:tcPr>
+          <w:p>
+            <w:pPr>
+              <w:jc w:val="left"/>
+            </w:pPr>
+            <w:r/>
+            <w:r>
+              <w:rPr>
+                <w:sz w:val="16"/>
+              </w:rPr>
+              <w:t>2026-08-30</w:t>
+            </w:r>
+          </w:p>
+        </w:tc>
+        <w:tc>
+          <w:tcPr>
+            <w:tcW w:type="dxa" w:w="1120"/>
+          </w:tcPr>
+          <w:p>
+            <w:pPr>
+              <w:jc w:val="left"/>
+            </w:pPr>
+            <w:r/>
+            <w:hyperlink r:id="rId162">
+              <w:r>
+                <w:rPr>
+                  <w:color w:val="0B4F9E"/>
+                  <w:sz w:val="16"/>
+                  <w:u w:val="single"/>
+                </w:rPr>
+                <w:t>link</w:t>
+              </w:r>
+            </w:hyperlink>
+          </w:p>
+        </w:tc>
+      </w:tr>
+      <w:tr>
+        <w:tc>
+          <w:tcPr>
+            <w:tcW w:type="dxa" w:w="1120"/>
+          </w:tcPr>
+          <w:p>
+            <w:pPr>
+              <w:jc w:val="left"/>
+            </w:pPr>
+            <w:r/>
+            <w:r>
+              <w:rPr>
+                <w:sz w:val="16"/>
+              </w:rPr>
+              <w:t>106</w:t>
+            </w:r>
+          </w:p>
+        </w:tc>
+        <w:tc>
+          <w:tcPr>
+            <w:tcW w:type="dxa" w:w="1120"/>
+          </w:tcPr>
+          <w:p>
+            <w:pPr>
+              <w:jc w:val="left"/>
+            </w:pPr>
+            <w:r/>
+          </w:p>
+        </w:tc>
+        <w:tc>
+          <w:tcPr>
+            <w:tcW w:type="dxa" w:w="1120"/>
+          </w:tcPr>
+          <w:p>
+            <w:pPr>
+              <w:jc w:val="left"/>
+            </w:pPr>
+            <w:r/>
+            <w:hyperlink r:id="rId163">
+              <w:r>
+                <w:rPr>
+                  <w:color w:val="0B4F9E"/>
+                  <w:sz w:val="16"/>
+                  <w:u w:val="single"/>
+                </w:rPr>
+                <w:t>Compiling Matter: An AI-Driven Research Program for Universal Nanofabrication, Matter Compilation, and Programmable Matter</w:t>
+              </w:r>
+            </w:hyperlink>
+          </w:p>
+        </w:tc>
+        <w:tc>
+          <w:tcPr>
+            <w:tcW w:type="dxa" w:w="1120"/>
+          </w:tcPr>
+          <w:p>
+            <w:pPr>
+              <w:jc w:val="left"/>
+            </w:pPr>
+            <w:r/>
+          </w:p>
+        </w:tc>
+        <w:tc>
+          <w:tcPr>
+            <w:tcW w:type="dxa" w:w="1120"/>
+          </w:tcPr>
+          <w:p>
+            <w:pPr>
+              <w:jc w:val="left"/>
+            </w:pPr>
+            <w:r/>
+          </w:p>
+        </w:tc>
+        <w:tc>
+          <w:tcPr>
+            <w:tcW w:type="dxa" w:w="1120"/>
+          </w:tcPr>
+          <w:p>
+            <w:pPr>
+              <w:jc w:val="left"/>
+            </w:pPr>
+            <w:r/>
+            <w:r>
+              <w:rPr>
+                <w:sz w:val="16"/>
+              </w:rPr>
+              <w:t>MLIP</w:t>
+            </w:r>
+          </w:p>
+        </w:tc>
+        <w:tc>
+          <w:tcPr>
+            <w:tcW w:type="dxa" w:w="1120"/>
+          </w:tcPr>
+          <w:p>
+            <w:pPr>
+              <w:jc w:val="left"/>
+            </w:pPr>
+            <w:r/>
+          </w:p>
+        </w:tc>
+        <w:tc>
+          <w:tcPr>
+            <w:tcW w:type="dxa" w:w="1120"/>
+          </w:tcPr>
+          <w:p>
+            <w:pPr>
+              <w:jc w:val="left"/>
+            </w:pPr>
+            <w:r/>
+            <w:r>
+              <w:rPr>
+                <w:sz w:val="16"/>
+              </w:rPr>
+              <w:t>2026-08-31</w:t>
+            </w:r>
+          </w:p>
+        </w:tc>
+        <w:tc>
+          <w:tcPr>
+            <w:tcW w:type="dxa" w:w="1120"/>
+          </w:tcPr>
+          <w:p>
+            <w:pPr>
+              <w:jc w:val="left"/>
+            </w:pPr>
+            <w:r/>
+            <w:hyperlink r:id="rId163">
+              <w:r>
+                <w:rPr>
+                  <w:color w:val="0B4F9E"/>
+                  <w:sz w:val="16"/>
+                  <w:u w:val="single"/>
+                </w:rPr>
+                <w:t>10.5281/zenodo.22206444</w:t>
+              </w:r>
+            </w:hyperlink>
+          </w:p>
+        </w:tc>
+      </w:tr>
+      <w:tr>
+        <w:tc>
+          <w:tcPr>
+            <w:tcW w:type="dxa" w:w="1120"/>
+          </w:tcPr>
+          <w:p>
+            <w:pPr>
+              <w:jc w:val="left"/>
+            </w:pPr>
+            <w:r/>
+            <w:r>
+              <w:rPr>
+                <w:sz w:val="16"/>
+              </w:rPr>
+              <w:t>107</w:t>
+            </w:r>
+          </w:p>
+        </w:tc>
+        <w:tc>
+          <w:tcPr>
+            <w:tcW w:type="dxa" w:w="1120"/>
+          </w:tcPr>
+          <w:p>
+            <w:pPr>
+              <w:jc w:val="left"/>
+            </w:pPr>
+            <w:r/>
+          </w:p>
+        </w:tc>
+        <w:tc>
+          <w:tcPr>
+            <w:tcW w:type="dxa" w:w="1120"/>
+          </w:tcPr>
+          <w:p>
+            <w:pPr>
+              <w:jc w:val="left"/>
+            </w:pPr>
+            <w:r/>
+            <w:hyperlink r:id="rId164">
+              <w:r>
+                <w:rPr>
+                  <w:color w:val="0B4F9E"/>
+                  <w:sz w:val="16"/>
+                  <w:u w:val="single"/>
+                </w:rPr>
+                <w:t>AI-Guided Self-Driving Laboratories for Advanced Materials Discovery</w:t>
+              </w:r>
+            </w:hyperlink>
+          </w:p>
+        </w:tc>
+        <w:tc>
+          <w:tcPr>
+            <w:tcW w:type="dxa" w:w="1120"/>
+          </w:tcPr>
+          <w:p>
+            <w:pPr>
+              <w:jc w:val="left"/>
+            </w:pPr>
+            <w:r/>
+          </w:p>
+        </w:tc>
+        <w:tc>
+          <w:tcPr>
+            <w:tcW w:type="dxa" w:w="1120"/>
+          </w:tcPr>
+          <w:p>
+            <w:pPr>
+              <w:jc w:val="left"/>
+            </w:pPr>
+            <w:r/>
+            <w:r>
+              <w:rPr>
+                <w:sz w:val="16"/>
+              </w:rPr>
+              <w:t>alloy</w:t>
+            </w:r>
+          </w:p>
+        </w:tc>
+        <w:tc>
+          <w:tcPr>
+            <w:tcW w:type="dxa" w:w="1120"/>
+          </w:tcPr>
+          <w:p>
+            <w:pPr>
+              <w:jc w:val="left"/>
+            </w:pPr>
+            <w:r/>
+          </w:p>
+        </w:tc>
+        <w:tc>
+          <w:tcPr>
+            <w:tcW w:type="dxa" w:w="1120"/>
+          </w:tcPr>
+          <w:p>
+            <w:pPr>
+              <w:jc w:val="left"/>
+            </w:pPr>
+            <w:r/>
+          </w:p>
+        </w:tc>
+        <w:tc>
+          <w:tcPr>
+            <w:tcW w:type="dxa" w:w="1120"/>
+          </w:tcPr>
+          <w:p>
+            <w:pPr>
+              <w:jc w:val="left"/>
+            </w:pPr>
+            <w:r/>
+            <w:r>
+              <w:rPr>
+                <w:sz w:val="16"/>
+              </w:rPr>
+              <w:t>2026-08-31</w:t>
+            </w:r>
+          </w:p>
+        </w:tc>
+        <w:tc>
+          <w:tcPr>
+            <w:tcW w:type="dxa" w:w="1120"/>
+          </w:tcPr>
+          <w:p>
+            <w:pPr>
+              <w:jc w:val="left"/>
+            </w:pPr>
+            <w:r/>
+            <w:hyperlink r:id="rId164">
+              <w:r>
+                <w:rPr>
+                  <w:color w:val="0B4F9E"/>
+                  <w:sz w:val="16"/>
+                  <w:u w:val="single"/>
+                </w:rPr>
+                <w:t>10.69709/caic.2026.133382</w:t>
+              </w:r>
+            </w:hyperlink>
+          </w:p>
+        </w:tc>
+      </w:tr>
+      <w:tr>
+        <w:tc>
+          <w:tcPr>
+            <w:tcW w:type="dxa" w:w="1120"/>
+          </w:tcPr>
+          <w:p>
+            <w:pPr>
+              <w:jc w:val="left"/>
+            </w:pPr>
+            <w:r/>
+            <w:r>
+              <w:rPr>
+                <w:sz w:val="16"/>
+              </w:rPr>
+              <w:t>108</w:t>
+            </w:r>
+          </w:p>
+        </w:tc>
+        <w:tc>
+          <w:tcPr>
+            <w:tcW w:type="dxa" w:w="1120"/>
+          </w:tcPr>
+          <w:p>
+            <w:pPr>
+              <w:jc w:val="left"/>
+            </w:pPr>
+            <w:r/>
+          </w:p>
+        </w:tc>
+        <w:tc>
+          <w:tcPr>
+            <w:tcW w:type="dxa" w:w="1120"/>
+          </w:tcPr>
+          <w:p>
+            <w:pPr>
+              <w:jc w:val="left"/>
+            </w:pPr>
+            <w:r/>
+            <w:hyperlink r:id="rId165">
+              <w:r>
+                <w:rPr>
+                  <w:color w:val="0B4F9E"/>
+                  <w:sz w:val="16"/>
+                  <w:u w:val="single"/>
+                </w:rPr>
+                <w:t>GMD Task 4 composition-support audit - structures and public-checkpoint predictions</w:t>
+              </w:r>
+            </w:hyperlink>
+          </w:p>
+        </w:tc>
+        <w:tc>
+          <w:tcPr>
+            <w:tcW w:type="dxa" w:w="1120"/>
+          </w:tcPr>
+          <w:p>
+            <w:pPr>
+              <w:jc w:val="left"/>
+            </w:pPr>
+            <w:r/>
+            <w:r>
+              <w:rPr>
+                <w:sz w:val="16"/>
+              </w:rPr>
+              <w:t>NequIP, MACE</w:t>
+            </w:r>
+          </w:p>
+        </w:tc>
+        <w:tc>
+          <w:tcPr>
+            <w:tcW w:type="dxa" w:w="1120"/>
+          </w:tcPr>
+          <w:p>
+            <w:pPr>
+              <w:jc w:val="left"/>
+            </w:pPr>
+            <w:r/>
+          </w:p>
+        </w:tc>
+        <w:tc>
+          <w:tcPr>
+            <w:tcW w:type="dxa" w:w="1120"/>
+          </w:tcPr>
+          <w:p>
+            <w:pPr>
+              <w:jc w:val="left"/>
+            </w:pPr>
+            <w:r/>
+            <w:r>
+              <w:rPr>
+                <w:sz w:val="16"/>
+              </w:rPr>
+              <w:t>DFT, MLIP</w:t>
+            </w:r>
+          </w:p>
+        </w:tc>
+        <w:tc>
+          <w:tcPr>
+            <w:tcW w:type="dxa" w:w="1120"/>
+          </w:tcPr>
+          <w:p>
+            <w:pPr>
+              <w:jc w:val="left"/>
+            </w:pPr>
+            <w:r/>
+          </w:p>
+        </w:tc>
+        <w:tc>
+          <w:tcPr>
+            <w:tcW w:type="dxa" w:w="1120"/>
+          </w:tcPr>
+          <w:p>
+            <w:pPr>
+              <w:jc w:val="left"/>
+            </w:pPr>
+            <w:r/>
+            <w:r>
+              <w:rPr>
+                <w:sz w:val="16"/>
+              </w:rPr>
+              <w:t>2026-08-31</w:t>
+            </w:r>
+          </w:p>
+        </w:tc>
+        <w:tc>
+          <w:tcPr>
+            <w:tcW w:type="dxa" w:w="1120"/>
+          </w:tcPr>
+          <w:p>
+            <w:pPr>
+              <w:jc w:val="left"/>
+            </w:pPr>
+            <w:r/>
+            <w:hyperlink r:id="rId165">
+              <w:r>
+                <w:rPr>
+                  <w:color w:val="0B4F9E"/>
+                  <w:sz w:val="16"/>
+                  <w:u w:val="single"/>
+                </w:rPr>
+                <w:t>10.5281/zenodo.22215787</w:t>
+              </w:r>
+            </w:hyperlink>
+          </w:p>
+        </w:tc>
+      </w:tr>
+      <w:tr>
+        <w:tc>
+          <w:tcPr>
+            <w:tcW w:type="dxa" w:w="1120"/>
+          </w:tcPr>
+          <w:p>
+            <w:pPr>
+              <w:jc w:val="left"/>
+            </w:pPr>
+            <w:r/>
+            <w:r>
+              <w:rPr>
+                <w:sz w:val="16"/>
+              </w:rPr>
+              <w:t>109</w:t>
+            </w:r>
+          </w:p>
+        </w:tc>
+        <w:tc>
+          <w:tcPr>
+            <w:tcW w:type="dxa" w:w="1120"/>
+          </w:tcPr>
+          <w:p>
+            <w:pPr>
+              <w:jc w:val="left"/>
+            </w:pPr>
+            <w:r/>
+          </w:p>
+        </w:tc>
+        <w:tc>
+          <w:tcPr>
+            <w:tcW w:type="dxa" w:w="1120"/>
+          </w:tcPr>
+          <w:p>
+            <w:pPr>
+              <w:jc w:val="left"/>
+            </w:pPr>
+            <w:r/>
+            <w:hyperlink r:id="rId166">
+              <w:r>
+                <w:rPr>
+                  <w:color w:val="0B4F9E"/>
+                  <w:sz w:val="16"/>
+                  <w:u w:val="single"/>
+                </w:rPr>
+                <w:t>CrystalGRW: generative modeling of crystal structures with targeted crystallographic properties via geodesic random walks</w:t>
+              </w:r>
+            </w:hyperlink>
+          </w:p>
+        </w:tc>
+        <w:tc>
+          <w:tcPr>
+            <w:tcW w:type="dxa" w:w="1120"/>
+          </w:tcPr>
+          <w:p>
+            <w:pPr>
+              <w:jc w:val="left"/>
+            </w:pPr>
+            <w:r/>
+          </w:p>
+        </w:tc>
+        <w:tc>
+          <w:tcPr>
+            <w:tcW w:type="dxa" w:w="1120"/>
+          </w:tcPr>
+          <w:p>
+            <w:pPr>
+              <w:jc w:val="left"/>
+            </w:pPr>
+            <w:r/>
+          </w:p>
+        </w:tc>
+        <w:tc>
+          <w:tcPr>
+            <w:tcW w:type="dxa" w:w="1120"/>
+          </w:tcPr>
+          <w:p>
+            <w:pPr>
+              <w:jc w:val="left"/>
+            </w:pPr>
+            <w:r/>
+            <w:r>
+              <w:rPr>
+                <w:sz w:val="16"/>
+              </w:rPr>
+              <w:t>DFT</w:t>
+            </w:r>
+          </w:p>
+        </w:tc>
+        <w:tc>
+          <w:tcPr>
+            <w:tcW w:type="dxa" w:w="1120"/>
+          </w:tcPr>
+          <w:p>
+            <w:pPr>
+              <w:jc w:val="left"/>
+            </w:pPr>
+            <w:r/>
+          </w:p>
+        </w:tc>
+        <w:tc>
+          <w:tcPr>
+            <w:tcW w:type="dxa" w:w="1120"/>
+          </w:tcPr>
+          <w:p>
+            <w:pPr>
+              <w:jc w:val="left"/>
+            </w:pPr>
+            <w:r/>
+            <w:r>
+              <w:rPr>
+                <w:sz w:val="16"/>
+              </w:rPr>
+              <w:t>2026-08-31</w:t>
+            </w:r>
+          </w:p>
+        </w:tc>
+        <w:tc>
+          <w:tcPr>
+            <w:tcW w:type="dxa" w:w="1120"/>
+          </w:tcPr>
+          <w:p>
+            <w:pPr>
+              <w:jc w:val="left"/>
+            </w:pPr>
+            <w:r/>
+            <w:hyperlink r:id="rId166">
+              <w:r>
+                <w:rPr>
+                  <w:color w:val="0B4F9E"/>
+                  <w:sz w:val="16"/>
+                  <w:u w:val="single"/>
+                </w:rPr>
+                <w:t>10.1038/s41598-026-62470-x</w:t>
+              </w:r>
+            </w:hyperlink>
+          </w:p>
+        </w:tc>
+      </w:tr>
+      <w:tr>
+        <w:tc>
+          <w:tcPr>
+            <w:tcW w:type="dxa" w:w="1120"/>
+          </w:tcPr>
+          <w:p>
+            <w:pPr>
+              <w:jc w:val="left"/>
+            </w:pPr>
+            <w:r/>
+            <w:r>
+              <w:rPr>
+                <w:sz w:val="16"/>
+              </w:rPr>
+              <w:t>110</w:t>
+            </w:r>
+          </w:p>
+        </w:tc>
+        <w:tc>
+          <w:tcPr>
+            <w:tcW w:type="dxa" w:w="1120"/>
+          </w:tcPr>
+          <w:p>
+            <w:pPr>
+              <w:jc w:val="left"/>
+            </w:pPr>
+            <w:r/>
+          </w:p>
+        </w:tc>
+        <w:tc>
+          <w:tcPr>
+            <w:tcW w:type="dxa" w:w="1120"/>
+          </w:tcPr>
+          <w:p>
+            <w:pPr>
+              <w:jc w:val="left"/>
+            </w:pPr>
+            <w:r/>
+            <w:hyperlink r:id="rId167">
+              <w:r>
+                <w:rPr>
+                  <w:color w:val="0B4F9E"/>
+                  <w:sz w:val="16"/>
+                  <w:u w:val="single"/>
+                </w:rPr>
                 <w:t>Workflow design as a research variable in computational materials discovery</w:t>
               </w:r>
             </w:hyperlink>
@@ -34043,7 +34744,7 @@
               <w:jc w:val="left"/>
             </w:pPr>
             <w:r/>
-            <w:hyperlink r:id="rId162">
+            <w:hyperlink r:id="rId167">
               <w:r>
                 <w:rPr>
                   <w:color w:val="0B4F9E"/>
@@ -34070,31 +34771,31 @@
               <w:rPr>
                 <w:sz w:val="16"/>
               </w:rPr>
-              <w:t>106</w:t>
-            </w:r>
-          </w:p>
-        </w:tc>
-        <w:tc>
-          <w:tcPr>
-            <w:tcW w:type="dxa" w:w="1120"/>
-          </w:tcPr>
-          <w:p>
-            <w:pPr>
-              <w:jc w:val="left"/>
-            </w:pPr>
-            <w:r/>
-          </w:p>
-        </w:tc>
-        <w:tc>
-          <w:tcPr>
-            <w:tcW w:type="dxa" w:w="1120"/>
-          </w:tcPr>
-          <w:p>
-            <w:pPr>
-              <w:jc w:val="left"/>
-            </w:pPr>
-            <w:r/>
-            <w:hyperlink r:id="rId163">
+              <w:t>111</w:t>
+            </w:r>
+          </w:p>
+        </w:tc>
+        <w:tc>
+          <w:tcPr>
+            <w:tcW w:type="dxa" w:w="1120"/>
+          </w:tcPr>
+          <w:p>
+            <w:pPr>
+              <w:jc w:val="left"/>
+            </w:pPr>
+            <w:r/>
+          </w:p>
+        </w:tc>
+        <w:tc>
+          <w:tcPr>
+            <w:tcW w:type="dxa" w:w="1120"/>
+          </w:tcPr>
+          <w:p>
+            <w:pPr>
+              <w:jc w:val="left"/>
+            </w:pPr>
+            <w:r/>
+            <w:hyperlink r:id="rId168">
               <w:r>
                 <w:rPr>
                   <w:color w:val="0B4F9E"/>
@@ -34188,7 +34889,7 @@
               <w:jc w:val="left"/>
             </w:pPr>
             <w:r/>
-            <w:hyperlink r:id="rId163">
+            <w:hyperlink r:id="rId168">
               <w:r>
                 <w:rPr>
                   <w:color w:val="0B4F9E"/>
@@ -34215,31 +34916,303 @@
               <w:rPr>
                 <w:sz w:val="16"/>
               </w:rPr>
-              <w:t>107</w:t>
-            </w:r>
-          </w:p>
-        </w:tc>
-        <w:tc>
-          <w:tcPr>
-            <w:tcW w:type="dxa" w:w="1120"/>
-          </w:tcPr>
-          <w:p>
-            <w:pPr>
-              <w:jc w:val="left"/>
-            </w:pPr>
-            <w:r/>
-          </w:p>
-        </w:tc>
-        <w:tc>
-          <w:tcPr>
-            <w:tcW w:type="dxa" w:w="1120"/>
-          </w:tcPr>
-          <w:p>
-            <w:pPr>
-              <w:jc w:val="left"/>
-            </w:pPr>
-            <w:r/>
-            <w:hyperlink r:id="rId164">
+              <w:t>112</w:t>
+            </w:r>
+          </w:p>
+        </w:tc>
+        <w:tc>
+          <w:tcPr>
+            <w:tcW w:type="dxa" w:w="1120"/>
+          </w:tcPr>
+          <w:p>
+            <w:pPr>
+              <w:jc w:val="left"/>
+            </w:pPr>
+            <w:r/>
+          </w:p>
+        </w:tc>
+        <w:tc>
+          <w:tcPr>
+            <w:tcW w:type="dxa" w:w="1120"/>
+          </w:tcPr>
+          <w:p>
+            <w:pPr>
+              <w:jc w:val="left"/>
+            </w:pPr>
+            <w:r/>
+            <w:hyperlink r:id="rId169">
+              <w:r>
+                <w:rPr>
+                  <w:color w:val="0B4F9E"/>
+                  <w:sz w:val="16"/>
+                  <w:u w:val="single"/>
+                </w:rPr>
+                <w:t>Nonlinear Crystal Structure Prediction</w:t>
+              </w:r>
+            </w:hyperlink>
+          </w:p>
+        </w:tc>
+        <w:tc>
+          <w:tcPr>
+            <w:tcW w:type="dxa" w:w="1120"/>
+          </w:tcPr>
+          <w:p>
+            <w:pPr>
+              <w:jc w:val="left"/>
+            </w:pPr>
+            <w:r/>
+          </w:p>
+        </w:tc>
+        <w:tc>
+          <w:tcPr>
+            <w:tcW w:type="dxa" w:w="1120"/>
+          </w:tcPr>
+          <w:p>
+            <w:pPr>
+              <w:jc w:val="left"/>
+            </w:pPr>
+            <w:r/>
+          </w:p>
+        </w:tc>
+        <w:tc>
+          <w:tcPr>
+            <w:tcW w:type="dxa" w:w="1120"/>
+          </w:tcPr>
+          <w:p>
+            <w:pPr>
+              <w:jc w:val="left"/>
+            </w:pPr>
+            <w:r/>
+          </w:p>
+        </w:tc>
+        <w:tc>
+          <w:tcPr>
+            <w:tcW w:type="dxa" w:w="1120"/>
+          </w:tcPr>
+          <w:p>
+            <w:pPr>
+              <w:jc w:val="left"/>
+            </w:pPr>
+            <w:r/>
+          </w:p>
+        </w:tc>
+        <w:tc>
+          <w:tcPr>
+            <w:tcW w:type="dxa" w:w="1120"/>
+          </w:tcPr>
+          <w:p>
+            <w:pPr>
+              <w:jc w:val="left"/>
+            </w:pPr>
+            <w:r/>
+            <w:r>
+              <w:rPr>
+                <w:sz w:val="16"/>
+              </w:rPr>
+              <w:t>2026-08-31</w:t>
+            </w:r>
+          </w:p>
+        </w:tc>
+        <w:tc>
+          <w:tcPr>
+            <w:tcW w:type="dxa" w:w="1120"/>
+          </w:tcPr>
+          <w:p>
+            <w:pPr>
+              <w:jc w:val="left"/>
+            </w:pPr>
+            <w:r/>
+            <w:hyperlink r:id="rId169">
+              <w:r>
+                <w:rPr>
+                  <w:color w:val="0B4F9E"/>
+                  <w:sz w:val="16"/>
+                  <w:u w:val="single"/>
+                </w:rPr>
+                <w:t>10.5281/zenodo.22195386</w:t>
+              </w:r>
+            </w:hyperlink>
+          </w:p>
+        </w:tc>
+      </w:tr>
+      <w:tr>
+        <w:tc>
+          <w:tcPr>
+            <w:tcW w:type="dxa" w:w="1120"/>
+          </w:tcPr>
+          <w:p>
+            <w:pPr>
+              <w:jc w:val="left"/>
+            </w:pPr>
+            <w:r/>
+            <w:r>
+              <w:rPr>
+                <w:sz w:val="16"/>
+              </w:rPr>
+              <w:t>113</w:t>
+            </w:r>
+          </w:p>
+        </w:tc>
+        <w:tc>
+          <w:tcPr>
+            <w:tcW w:type="dxa" w:w="1120"/>
+          </w:tcPr>
+          <w:p>
+            <w:pPr>
+              <w:jc w:val="left"/>
+            </w:pPr>
+            <w:r/>
+          </w:p>
+        </w:tc>
+        <w:tc>
+          <w:tcPr>
+            <w:tcW w:type="dxa" w:w="1120"/>
+          </w:tcPr>
+          <w:p>
+            <w:pPr>
+              <w:jc w:val="left"/>
+            </w:pPr>
+            <w:r/>
+            <w:hyperlink r:id="rId170">
+              <w:r>
+                <w:rPr>
+                  <w:color w:val="0B4F9E"/>
+                  <w:sz w:val="16"/>
+                  <w:u w:val="single"/>
+                </w:rPr>
+                <w:t>bayesaenet: uncertainty quantification for machine learning interatomic potentials</w:t>
+              </w:r>
+            </w:hyperlink>
+          </w:p>
+        </w:tc>
+        <w:tc>
+          <w:tcPr>
+            <w:tcW w:type="dxa" w:w="1120"/>
+          </w:tcPr>
+          <w:p>
+            <w:pPr>
+              <w:jc w:val="left"/>
+            </w:pPr>
+            <w:r/>
+          </w:p>
+        </w:tc>
+        <w:tc>
+          <w:tcPr>
+            <w:tcW w:type="dxa" w:w="1120"/>
+          </w:tcPr>
+          <w:p>
+            <w:pPr>
+              <w:jc w:val="left"/>
+            </w:pPr>
+            <w:r/>
+          </w:p>
+        </w:tc>
+        <w:tc>
+          <w:tcPr>
+            <w:tcW w:type="dxa" w:w="1120"/>
+          </w:tcPr>
+          <w:p>
+            <w:pPr>
+              <w:jc w:val="left"/>
+            </w:pPr>
+            <w:r/>
+            <w:r>
+              <w:rPr>
+                <w:sz w:val="16"/>
+              </w:rPr>
+              <w:t>MLIP</w:t>
+            </w:r>
+          </w:p>
+        </w:tc>
+        <w:tc>
+          <w:tcPr>
+            <w:tcW w:type="dxa" w:w="1120"/>
+          </w:tcPr>
+          <w:p>
+            <w:pPr>
+              <w:jc w:val="left"/>
+            </w:pPr>
+            <w:r/>
+          </w:p>
+        </w:tc>
+        <w:tc>
+          <w:tcPr>
+            <w:tcW w:type="dxa" w:w="1120"/>
+          </w:tcPr>
+          <w:p>
+            <w:pPr>
+              <w:jc w:val="left"/>
+            </w:pPr>
+            <w:r/>
+            <w:r>
+              <w:rPr>
+                <w:sz w:val="16"/>
+              </w:rPr>
+              <w:t>2026-08-31</w:t>
+            </w:r>
+          </w:p>
+        </w:tc>
+        <w:tc>
+          <w:tcPr>
+            <w:tcW w:type="dxa" w:w="1120"/>
+          </w:tcPr>
+          <w:p>
+            <w:pPr>
+              <w:jc w:val="left"/>
+            </w:pPr>
+            <w:r/>
+            <w:hyperlink r:id="rId170">
+              <w:r>
+                <w:rPr>
+                  <w:color w:val="0B4F9E"/>
+                  <w:sz w:val="16"/>
+                  <w:u w:val="single"/>
+                </w:rPr>
+                <w:t>10.5281/zenodo.22201403</w:t>
+              </w:r>
+            </w:hyperlink>
+          </w:p>
+        </w:tc>
+      </w:tr>
+      <w:tr>
+        <w:tc>
+          <w:tcPr>
+            <w:tcW w:type="dxa" w:w="1120"/>
+          </w:tcPr>
+          <w:p>
+            <w:pPr>
+              <w:jc w:val="left"/>
+            </w:pPr>
+            <w:r/>
+            <w:r>
+              <w:rPr>
+                <w:sz w:val="16"/>
+              </w:rPr>
+              <w:t>114</w:t>
+            </w:r>
+          </w:p>
+        </w:tc>
+        <w:tc>
+          <w:tcPr>
+            <w:tcW w:type="dxa" w:w="1120"/>
+          </w:tcPr>
+          <w:p>
+            <w:pPr>
+              <w:jc w:val="left"/>
+            </w:pPr>
+            <w:r/>
+          </w:p>
+        </w:tc>
+        <w:tc>
+          <w:tcPr>
+            <w:tcW w:type="dxa" w:w="1120"/>
+          </w:tcPr>
+          <w:p>
+            <w:pPr>
+              <w:jc w:val="left"/>
+            </w:pPr>
+            <w:r/>
+            <w:hyperlink r:id="rId171">
               <w:r>
                 <w:rPr>
                   <w:color w:val="0B4F9E"/>
@@ -34327,7 +35300,7 @@
               <w:jc w:val="left"/>
             </w:pPr>
             <w:r/>
-            <w:hyperlink r:id="rId165">
+            <w:hyperlink r:id="rId172">
               <w:r>
                 <w:rPr>
                   <w:color w:val="0B4F9E"/>
@@ -34354,31 +35327,309 @@
               <w:rPr>
                 <w:sz w:val="16"/>
               </w:rPr>
-              <w:t>108</w:t>
-            </w:r>
-          </w:p>
-        </w:tc>
-        <w:tc>
-          <w:tcPr>
-            <w:tcW w:type="dxa" w:w="1120"/>
-          </w:tcPr>
-          <w:p>
-            <w:pPr>
-              <w:jc w:val="left"/>
-            </w:pPr>
-            <w:r/>
-          </w:p>
-        </w:tc>
-        <w:tc>
-          <w:tcPr>
-            <w:tcW w:type="dxa" w:w="1120"/>
-          </w:tcPr>
-          <w:p>
-            <w:pPr>
-              <w:jc w:val="left"/>
-            </w:pPr>
-            <w:r/>
-            <w:hyperlink r:id="rId166">
+              <w:t>115</w:t>
+            </w:r>
+          </w:p>
+        </w:tc>
+        <w:tc>
+          <w:tcPr>
+            <w:tcW w:type="dxa" w:w="1120"/>
+          </w:tcPr>
+          <w:p>
+            <w:pPr>
+              <w:jc w:val="left"/>
+            </w:pPr>
+            <w:r/>
+          </w:p>
+        </w:tc>
+        <w:tc>
+          <w:tcPr>
+            <w:tcW w:type="dxa" w:w="1120"/>
+          </w:tcPr>
+          <w:p>
+            <w:pPr>
+              <w:jc w:val="left"/>
+            </w:pPr>
+            <w:r/>
+            <w:hyperlink r:id="rId173">
+              <w:r>
+                <w:rPr>
+                  <w:color w:val="0B4F9E"/>
+                  <w:sz w:val="16"/>
+                  <w:u w:val="single"/>
+                </w:rPr>
+                <w:t>Cartesian tensor equivariant machine-learning force field for spin-dependent atomistic simulations</w:t>
+              </w:r>
+            </w:hyperlink>
+          </w:p>
+        </w:tc>
+        <w:tc>
+          <w:tcPr>
+            <w:tcW w:type="dxa" w:w="1120"/>
+          </w:tcPr>
+          <w:p>
+            <w:pPr>
+              <w:jc w:val="left"/>
+            </w:pPr>
+            <w:r/>
+          </w:p>
+        </w:tc>
+        <w:tc>
+          <w:tcPr>
+            <w:tcW w:type="dxa" w:w="1120"/>
+          </w:tcPr>
+          <w:p>
+            <w:pPr>
+              <w:jc w:val="left"/>
+            </w:pPr>
+            <w:r/>
+            <w:r>
+              <w:rPr>
+                <w:sz w:val="16"/>
+              </w:rPr>
+              <w:t>magnetic material</w:t>
+            </w:r>
+          </w:p>
+        </w:tc>
+        <w:tc>
+          <w:tcPr>
+            <w:tcW w:type="dxa" w:w="1120"/>
+          </w:tcPr>
+          <w:p>
+            <w:pPr>
+              <w:jc w:val="left"/>
+            </w:pPr>
+            <w:r/>
+            <w:r>
+              <w:rPr>
+                <w:sz w:val="16"/>
+              </w:rPr>
+              <w:t>MLIP</w:t>
+            </w:r>
+          </w:p>
+        </w:tc>
+        <w:tc>
+          <w:tcPr>
+            <w:tcW w:type="dxa" w:w="1120"/>
+          </w:tcPr>
+          <w:p>
+            <w:pPr>
+              <w:jc w:val="left"/>
+            </w:pPr>
+            <w:r/>
+          </w:p>
+        </w:tc>
+        <w:tc>
+          <w:tcPr>
+            <w:tcW w:type="dxa" w:w="1120"/>
+          </w:tcPr>
+          <w:p>
+            <w:pPr>
+              <w:jc w:val="left"/>
+            </w:pPr>
+            <w:r/>
+            <w:r>
+              <w:rPr>
+                <w:sz w:val="16"/>
+              </w:rPr>
+              <w:t>2026-08-31</w:t>
+            </w:r>
+          </w:p>
+        </w:tc>
+        <w:tc>
+          <w:tcPr>
+            <w:tcW w:type="dxa" w:w="1120"/>
+          </w:tcPr>
+          <w:p>
+            <w:pPr>
+              <w:jc w:val="left"/>
+            </w:pPr>
+            <w:r/>
+            <w:hyperlink r:id="rId173">
+              <w:r>
+                <w:rPr>
+                  <w:color w:val="0B4F9E"/>
+                  <w:sz w:val="16"/>
+                  <w:u w:val="single"/>
+                </w:rPr>
+                <w:t>link</w:t>
+              </w:r>
+            </w:hyperlink>
+          </w:p>
+        </w:tc>
+      </w:tr>
+      <w:tr>
+        <w:tc>
+          <w:tcPr>
+            <w:tcW w:type="dxa" w:w="1120"/>
+          </w:tcPr>
+          <w:p>
+            <w:pPr>
+              <w:jc w:val="left"/>
+            </w:pPr>
+            <w:r/>
+            <w:r>
+              <w:rPr>
+                <w:sz w:val="16"/>
+              </w:rPr>
+              <w:t>116</w:t>
+            </w:r>
+          </w:p>
+        </w:tc>
+        <w:tc>
+          <w:tcPr>
+            <w:tcW w:type="dxa" w:w="1120"/>
+          </w:tcPr>
+          <w:p>
+            <w:pPr>
+              <w:jc w:val="left"/>
+            </w:pPr>
+            <w:r/>
+          </w:p>
+        </w:tc>
+        <w:tc>
+          <w:tcPr>
+            <w:tcW w:type="dxa" w:w="1120"/>
+          </w:tcPr>
+          <w:p>
+            <w:pPr>
+              <w:jc w:val="left"/>
+            </w:pPr>
+            <w:r/>
+            <w:hyperlink r:id="rId174">
+              <w:r>
+                <w:rPr>
+                  <w:color w:val="0B4F9E"/>
+                  <w:sz w:val="16"/>
+                  <w:u w:val="single"/>
+                </w:rPr>
+                <w:t>Learning Materials Properties from Scarce Labels and Unlabeled Crystals</w:t>
+              </w:r>
+            </w:hyperlink>
+          </w:p>
+        </w:tc>
+        <w:tc>
+          <w:tcPr>
+            <w:tcW w:type="dxa" w:w="1120"/>
+          </w:tcPr>
+          <w:p>
+            <w:pPr>
+              <w:jc w:val="left"/>
+            </w:pPr>
+            <w:r/>
+          </w:p>
+        </w:tc>
+        <w:tc>
+          <w:tcPr>
+            <w:tcW w:type="dxa" w:w="1120"/>
+          </w:tcPr>
+          <w:p>
+            <w:pPr>
+              <w:jc w:val="left"/>
+            </w:pPr>
+            <w:r/>
+          </w:p>
+        </w:tc>
+        <w:tc>
+          <w:tcPr>
+            <w:tcW w:type="dxa" w:w="1120"/>
+          </w:tcPr>
+          <w:p>
+            <w:pPr>
+              <w:jc w:val="left"/>
+            </w:pPr>
+            <w:r/>
+          </w:p>
+        </w:tc>
+        <w:tc>
+          <w:tcPr>
+            <w:tcW w:type="dxa" w:w="1120"/>
+          </w:tcPr>
+          <w:p>
+            <w:pPr>
+              <w:jc w:val="left"/>
+            </w:pPr>
+            <w:r/>
+          </w:p>
+        </w:tc>
+        <w:tc>
+          <w:tcPr>
+            <w:tcW w:type="dxa" w:w="1120"/>
+          </w:tcPr>
+          <w:p>
+            <w:pPr>
+              <w:jc w:val="left"/>
+            </w:pPr>
+            <w:r/>
+            <w:r>
+              <w:rPr>
+                <w:sz w:val="16"/>
+              </w:rPr>
+              <w:t>2026-08-31</w:t>
+            </w:r>
+          </w:p>
+        </w:tc>
+        <w:tc>
+          <w:tcPr>
+            <w:tcW w:type="dxa" w:w="1120"/>
+          </w:tcPr>
+          <w:p>
+            <w:pPr>
+              <w:jc w:val="left"/>
+            </w:pPr>
+            <w:r/>
+            <w:hyperlink r:id="rId174">
+              <w:r>
+                <w:rPr>
+                  <w:color w:val="0B4F9E"/>
+                  <w:sz w:val="16"/>
+                  <w:u w:val="single"/>
+                </w:rPr>
+                <w:t>link</w:t>
+              </w:r>
+            </w:hyperlink>
+          </w:p>
+        </w:tc>
+      </w:tr>
+      <w:tr>
+        <w:tc>
+          <w:tcPr>
+            <w:tcW w:type="dxa" w:w="1120"/>
+          </w:tcPr>
+          <w:p>
+            <w:pPr>
+              <w:jc w:val="left"/>
+            </w:pPr>
+            <w:r/>
+            <w:r>
+              <w:rPr>
+                <w:sz w:val="16"/>
+              </w:rPr>
+              <w:t>117</w:t>
+            </w:r>
+          </w:p>
+        </w:tc>
+        <w:tc>
+          <w:tcPr>
+            <w:tcW w:type="dxa" w:w="1120"/>
+          </w:tcPr>
+          <w:p>
+            <w:pPr>
+              <w:jc w:val="left"/>
+            </w:pPr>
+            <w:r/>
+          </w:p>
+        </w:tc>
+        <w:tc>
+          <w:tcPr>
+            <w:tcW w:type="dxa" w:w="1120"/>
+          </w:tcPr>
+          <w:p>
+            <w:pPr>
+              <w:jc w:val="left"/>
+            </w:pPr>
+            <w:r/>
+            <w:hyperlink r:id="rId175">
               <w:r>
                 <w:rPr>
                   <w:color w:val="0B4F9E"/>
@@ -34466,7 +35717,7 @@
               <w:jc w:val="left"/>
             </w:pPr>
             <w:r/>
-            <w:hyperlink r:id="rId166">
+            <w:hyperlink r:id="rId175">
               <w:r>
                 <w:rPr>
                   <w:color w:val="0B4F9E"/>
@@ -34474,6 +35725,683 @@
                   <w:u w:val="single"/>
                 </w:rPr>
                 <w:t>link</w:t>
+              </w:r>
+            </w:hyperlink>
+          </w:p>
+        </w:tc>
+      </w:tr>
+      <w:tr>
+        <w:tc>
+          <w:tcPr>
+            <w:tcW w:type="dxa" w:w="1120"/>
+          </w:tcPr>
+          <w:p>
+            <w:pPr>
+              <w:jc w:val="left"/>
+            </w:pPr>
+            <w:r/>
+            <w:r>
+              <w:rPr>
+                <w:sz w:val="16"/>
+              </w:rPr>
+              <w:t>118</w:t>
+            </w:r>
+          </w:p>
+        </w:tc>
+        <w:tc>
+          <w:tcPr>
+            <w:tcW w:type="dxa" w:w="1120"/>
+          </w:tcPr>
+          <w:p>
+            <w:pPr>
+              <w:jc w:val="left"/>
+            </w:pPr>
+            <w:r/>
+          </w:p>
+        </w:tc>
+        <w:tc>
+          <w:tcPr>
+            <w:tcW w:type="dxa" w:w="1120"/>
+          </w:tcPr>
+          <w:p>
+            <w:pPr>
+              <w:jc w:val="left"/>
+            </w:pPr>
+            <w:r/>
+            <w:hyperlink r:id="rId176">
+              <w:r>
+                <w:rPr>
+                  <w:color w:val="0B4F9E"/>
+                  <w:sz w:val="16"/>
+                  <w:u w:val="single"/>
+                </w:rPr>
+                <w:t>When Do Models Win? A Learning Curve Benchmark for Molecular Property Prediction in Low-Data Regimes</w:t>
+              </w:r>
+            </w:hyperlink>
+          </w:p>
+        </w:tc>
+        <w:tc>
+          <w:tcPr>
+            <w:tcW w:type="dxa" w:w="1120"/>
+          </w:tcPr>
+          <w:p>
+            <w:pPr>
+              <w:jc w:val="left"/>
+            </w:pPr>
+            <w:r/>
+          </w:p>
+        </w:tc>
+        <w:tc>
+          <w:tcPr>
+            <w:tcW w:type="dxa" w:w="1120"/>
+          </w:tcPr>
+          <w:p>
+            <w:pPr>
+              <w:jc w:val="left"/>
+            </w:pPr>
+            <w:r/>
+          </w:p>
+        </w:tc>
+        <w:tc>
+          <w:tcPr>
+            <w:tcW w:type="dxa" w:w="1120"/>
+          </w:tcPr>
+          <w:p>
+            <w:pPr>
+              <w:jc w:val="left"/>
+            </w:pPr>
+            <w:r/>
+            <w:r>
+              <w:rPr>
+                <w:sz w:val="16"/>
+              </w:rPr>
+              <w:t>DFT</w:t>
+            </w:r>
+          </w:p>
+        </w:tc>
+        <w:tc>
+          <w:tcPr>
+            <w:tcW w:type="dxa" w:w="1120"/>
+          </w:tcPr>
+          <w:p>
+            <w:pPr>
+              <w:jc w:val="left"/>
+            </w:pPr>
+            <w:r/>
+          </w:p>
+        </w:tc>
+        <w:tc>
+          <w:tcPr>
+            <w:tcW w:type="dxa" w:w="1120"/>
+          </w:tcPr>
+          <w:p>
+            <w:pPr>
+              <w:jc w:val="left"/>
+            </w:pPr>
+            <w:r/>
+            <w:r>
+              <w:rPr>
+                <w:sz w:val="16"/>
+              </w:rPr>
+              <w:t>2026-09-01</w:t>
+            </w:r>
+          </w:p>
+        </w:tc>
+        <w:tc>
+          <w:tcPr>
+            <w:tcW w:type="dxa" w:w="1120"/>
+          </w:tcPr>
+          <w:p>
+            <w:pPr>
+              <w:jc w:val="left"/>
+            </w:pPr>
+            <w:r/>
+            <w:hyperlink r:id="rId176">
+              <w:r>
+                <w:rPr>
+                  <w:color w:val="0B4F9E"/>
+                  <w:sz w:val="16"/>
+                  <w:u w:val="single"/>
+                </w:rPr>
+                <w:t>10.26434/chemrxiv.15001253/v6</w:t>
+              </w:r>
+            </w:hyperlink>
+          </w:p>
+        </w:tc>
+      </w:tr>
+      <w:tr>
+        <w:tc>
+          <w:tcPr>
+            <w:tcW w:type="dxa" w:w="1120"/>
+          </w:tcPr>
+          <w:p>
+            <w:pPr>
+              <w:jc w:val="left"/>
+            </w:pPr>
+            <w:r/>
+            <w:r>
+              <w:rPr>
+                <w:sz w:val="16"/>
+              </w:rPr>
+              <w:t>119</w:t>
+            </w:r>
+          </w:p>
+        </w:tc>
+        <w:tc>
+          <w:tcPr>
+            <w:tcW w:type="dxa" w:w="1120"/>
+          </w:tcPr>
+          <w:p>
+            <w:pPr>
+              <w:jc w:val="left"/>
+            </w:pPr>
+            <w:r/>
+          </w:p>
+        </w:tc>
+        <w:tc>
+          <w:tcPr>
+            <w:tcW w:type="dxa" w:w="1120"/>
+          </w:tcPr>
+          <w:p>
+            <w:pPr>
+              <w:jc w:val="left"/>
+            </w:pPr>
+            <w:r/>
+            <w:hyperlink r:id="rId177">
+              <w:r>
+                <w:rPr>
+                  <w:color w:val="0B4F9E"/>
+                  <w:sz w:val="16"/>
+                  <w:u w:val="single"/>
+                </w:rPr>
+                <w:t>Multicenter Validation of Foundation Model Adaptation for Automated Pancreatic Tumor Delineation on CT Scans</w:t>
+              </w:r>
+            </w:hyperlink>
+          </w:p>
+        </w:tc>
+        <w:tc>
+          <w:tcPr>
+            <w:tcW w:type="dxa" w:w="1120"/>
+          </w:tcPr>
+          <w:p>
+            <w:pPr>
+              <w:jc w:val="left"/>
+            </w:pPr>
+            <w:r/>
+          </w:p>
+        </w:tc>
+        <w:tc>
+          <w:tcPr>
+            <w:tcW w:type="dxa" w:w="1120"/>
+          </w:tcPr>
+          <w:p>
+            <w:pPr>
+              <w:jc w:val="left"/>
+            </w:pPr>
+            <w:r/>
+          </w:p>
+        </w:tc>
+        <w:tc>
+          <w:tcPr>
+            <w:tcW w:type="dxa" w:w="1120"/>
+          </w:tcPr>
+          <w:p>
+            <w:pPr>
+              <w:jc w:val="left"/>
+            </w:pPr>
+            <w:r/>
+            <w:r>
+              <w:rPr>
+                <w:sz w:val="16"/>
+              </w:rPr>
+              <w:t>MLIP</w:t>
+            </w:r>
+          </w:p>
+        </w:tc>
+        <w:tc>
+          <w:tcPr>
+            <w:tcW w:type="dxa" w:w="1120"/>
+          </w:tcPr>
+          <w:p>
+            <w:pPr>
+              <w:jc w:val="left"/>
+            </w:pPr>
+            <w:r/>
+          </w:p>
+        </w:tc>
+        <w:tc>
+          <w:tcPr>
+            <w:tcW w:type="dxa" w:w="1120"/>
+          </w:tcPr>
+          <w:p>
+            <w:pPr>
+              <w:jc w:val="left"/>
+            </w:pPr>
+            <w:r/>
+            <w:r>
+              <w:rPr>
+                <w:sz w:val="16"/>
+              </w:rPr>
+              <w:t>2026-09-01</w:t>
+            </w:r>
+          </w:p>
+        </w:tc>
+        <w:tc>
+          <w:tcPr>
+            <w:tcW w:type="dxa" w:w="1120"/>
+          </w:tcPr>
+          <w:p>
+            <w:pPr>
+              <w:jc w:val="left"/>
+            </w:pPr>
+            <w:r/>
+            <w:hyperlink r:id="rId177">
+              <w:r>
+                <w:rPr>
+                  <w:color w:val="0B4F9E"/>
+                  <w:sz w:val="16"/>
+                  <w:u w:val="single"/>
+                </w:rPr>
+                <w:t>10.3390/cancers18172836</w:t>
+              </w:r>
+            </w:hyperlink>
+          </w:p>
+        </w:tc>
+      </w:tr>
+      <w:tr>
+        <w:tc>
+          <w:tcPr>
+            <w:tcW w:type="dxa" w:w="1120"/>
+          </w:tcPr>
+          <w:p>
+            <w:pPr>
+              <w:jc w:val="left"/>
+            </w:pPr>
+            <w:r/>
+            <w:r>
+              <w:rPr>
+                <w:sz w:val="16"/>
+              </w:rPr>
+              <w:t>120</w:t>
+            </w:r>
+          </w:p>
+        </w:tc>
+        <w:tc>
+          <w:tcPr>
+            <w:tcW w:type="dxa" w:w="1120"/>
+          </w:tcPr>
+          <w:p>
+            <w:pPr>
+              <w:jc w:val="left"/>
+            </w:pPr>
+            <w:r/>
+          </w:p>
+        </w:tc>
+        <w:tc>
+          <w:tcPr>
+            <w:tcW w:type="dxa" w:w="1120"/>
+          </w:tcPr>
+          <w:p>
+            <w:pPr>
+              <w:jc w:val="left"/>
+            </w:pPr>
+            <w:r/>
+            <w:hyperlink r:id="rId178">
+              <w:r>
+                <w:rPr>
+                  <w:color w:val="0B4F9E"/>
+                  <w:sz w:val="16"/>
+                  <w:u w:val="single"/>
+                </w:rPr>
+                <w:t>Conditional Latent-Prior Generative Compressed Sensing with Application to Petrophysical Target-Log Reconstruction</w:t>
+              </w:r>
+            </w:hyperlink>
+          </w:p>
+        </w:tc>
+        <w:tc>
+          <w:tcPr>
+            <w:tcW w:type="dxa" w:w="1120"/>
+          </w:tcPr>
+          <w:p>
+            <w:pPr>
+              <w:jc w:val="left"/>
+            </w:pPr>
+            <w:r/>
+          </w:p>
+        </w:tc>
+        <w:tc>
+          <w:tcPr>
+            <w:tcW w:type="dxa" w:w="1120"/>
+          </w:tcPr>
+          <w:p>
+            <w:pPr>
+              <w:jc w:val="left"/>
+            </w:pPr>
+            <w:r/>
+          </w:p>
+        </w:tc>
+        <w:tc>
+          <w:tcPr>
+            <w:tcW w:type="dxa" w:w="1120"/>
+          </w:tcPr>
+          <w:p>
+            <w:pPr>
+              <w:jc w:val="left"/>
+            </w:pPr>
+            <w:r/>
+          </w:p>
+        </w:tc>
+        <w:tc>
+          <w:tcPr>
+            <w:tcW w:type="dxa" w:w="1120"/>
+          </w:tcPr>
+          <w:p>
+            <w:pPr>
+              <w:jc w:val="left"/>
+            </w:pPr>
+            <w:r/>
+          </w:p>
+        </w:tc>
+        <w:tc>
+          <w:tcPr>
+            <w:tcW w:type="dxa" w:w="1120"/>
+          </w:tcPr>
+          <w:p>
+            <w:pPr>
+              <w:jc w:val="left"/>
+            </w:pPr>
+            <w:r/>
+            <w:r>
+              <w:rPr>
+                <w:sz w:val="16"/>
+              </w:rPr>
+              <w:t>2026-09-01</w:t>
+            </w:r>
+          </w:p>
+        </w:tc>
+        <w:tc>
+          <w:tcPr>
+            <w:tcW w:type="dxa" w:w="1120"/>
+          </w:tcPr>
+          <w:p>
+            <w:pPr>
+              <w:jc w:val="left"/>
+            </w:pPr>
+            <w:r/>
+            <w:hyperlink r:id="rId178">
+              <w:r>
+                <w:rPr>
+                  <w:color w:val="0B4F9E"/>
+                  <w:sz w:val="16"/>
+                  <w:u w:val="single"/>
+                </w:rPr>
+                <w:t>10.2139/ssrn.7385284</w:t>
+              </w:r>
+            </w:hyperlink>
+          </w:p>
+        </w:tc>
+      </w:tr>
+      <w:tr>
+        <w:tc>
+          <w:tcPr>
+            <w:tcW w:type="dxa" w:w="1120"/>
+          </w:tcPr>
+          <w:p>
+            <w:pPr>
+              <w:jc w:val="left"/>
+            </w:pPr>
+            <w:r/>
+            <w:r>
+              <w:rPr>
+                <w:sz w:val="16"/>
+              </w:rPr>
+              <w:t>121</w:t>
+            </w:r>
+          </w:p>
+        </w:tc>
+        <w:tc>
+          <w:tcPr>
+            <w:tcW w:type="dxa" w:w="1120"/>
+          </w:tcPr>
+          <w:p>
+            <w:pPr>
+              <w:jc w:val="left"/>
+            </w:pPr>
+            <w:r/>
+          </w:p>
+        </w:tc>
+        <w:tc>
+          <w:tcPr>
+            <w:tcW w:type="dxa" w:w="1120"/>
+          </w:tcPr>
+          <w:p>
+            <w:pPr>
+              <w:jc w:val="left"/>
+            </w:pPr>
+            <w:r/>
+            <w:hyperlink r:id="rId179">
+              <w:r>
+                <w:rPr>
+                  <w:color w:val="0B4F9E"/>
+                  <w:sz w:val="16"/>
+                  <w:u w:val="single"/>
+                </w:rPr>
+                <w:t>Active Learning for Neural Classifiers: Selecting Training and Test Areas in Satellite Image Object Recognition</w:t>
+              </w:r>
+            </w:hyperlink>
+          </w:p>
+        </w:tc>
+        <w:tc>
+          <w:tcPr>
+            <w:tcW w:type="dxa" w:w="1120"/>
+          </w:tcPr>
+          <w:p>
+            <w:pPr>
+              <w:jc w:val="left"/>
+            </w:pPr>
+            <w:r/>
+          </w:p>
+        </w:tc>
+        <w:tc>
+          <w:tcPr>
+            <w:tcW w:type="dxa" w:w="1120"/>
+          </w:tcPr>
+          <w:p>
+            <w:pPr>
+              <w:jc w:val="left"/>
+            </w:pPr>
+            <w:r/>
+          </w:p>
+        </w:tc>
+        <w:tc>
+          <w:tcPr>
+            <w:tcW w:type="dxa" w:w="1120"/>
+          </w:tcPr>
+          <w:p>
+            <w:pPr>
+              <w:jc w:val="left"/>
+            </w:pPr>
+            <w:r/>
+          </w:p>
+        </w:tc>
+        <w:tc>
+          <w:tcPr>
+            <w:tcW w:type="dxa" w:w="1120"/>
+          </w:tcPr>
+          <w:p>
+            <w:pPr>
+              <w:jc w:val="left"/>
+            </w:pPr>
+            <w:r/>
+          </w:p>
+        </w:tc>
+        <w:tc>
+          <w:tcPr>
+            <w:tcW w:type="dxa" w:w="1120"/>
+          </w:tcPr>
+          <w:p>
+            <w:pPr>
+              <w:jc w:val="left"/>
+            </w:pPr>
+            <w:r/>
+            <w:r>
+              <w:rPr>
+                <w:sz w:val="16"/>
+              </w:rPr>
+              <w:t>2026-09-01</w:t>
+            </w:r>
+          </w:p>
+        </w:tc>
+        <w:tc>
+          <w:tcPr>
+            <w:tcW w:type="dxa" w:w="1120"/>
+          </w:tcPr>
+          <w:p>
+            <w:pPr>
+              <w:jc w:val="left"/>
+            </w:pPr>
+            <w:r/>
+            <w:hyperlink r:id="rId179">
+              <w:r>
+                <w:rPr>
+                  <w:color w:val="0B4F9E"/>
+                  <w:sz w:val="16"/>
+                  <w:u w:val="single"/>
+                </w:rPr>
+                <w:t>10.1007/978-3-032-16265-6_4</w:t>
+              </w:r>
+            </w:hyperlink>
+          </w:p>
+        </w:tc>
+      </w:tr>
+      <w:tr>
+        <w:tc>
+          <w:tcPr>
+            <w:tcW w:type="dxa" w:w="1120"/>
+          </w:tcPr>
+          <w:p>
+            <w:pPr>
+              <w:jc w:val="left"/>
+            </w:pPr>
+            <w:r/>
+            <w:r>
+              <w:rPr>
+                <w:sz w:val="16"/>
+              </w:rPr>
+              <w:t>122</w:t>
+            </w:r>
+          </w:p>
+        </w:tc>
+        <w:tc>
+          <w:tcPr>
+            <w:tcW w:type="dxa" w:w="1120"/>
+          </w:tcPr>
+          <w:p>
+            <w:pPr>
+              <w:jc w:val="left"/>
+            </w:pPr>
+            <w:r/>
+          </w:p>
+        </w:tc>
+        <w:tc>
+          <w:tcPr>
+            <w:tcW w:type="dxa" w:w="1120"/>
+          </w:tcPr>
+          <w:p>
+            <w:pPr>
+              <w:jc w:val="left"/>
+            </w:pPr>
+            <w:r/>
+            <w:hyperlink r:id="rId180">
+              <w:r>
+                <w:rPr>
+                  <w:color w:val="0B4F9E"/>
+                  <w:sz w:val="16"/>
+                  <w:u w:val="single"/>
+                </w:rPr>
+                <w:t>Dynamical analysis of fractional order corruption diffusion model with optimal control and cost-effectiveness analysis</w:t>
+              </w:r>
+            </w:hyperlink>
+          </w:p>
+        </w:tc>
+        <w:tc>
+          <w:tcPr>
+            <w:tcW w:type="dxa" w:w="1120"/>
+          </w:tcPr>
+          <w:p>
+            <w:pPr>
+              <w:jc w:val="left"/>
+            </w:pPr>
+            <w:r/>
+          </w:p>
+        </w:tc>
+        <w:tc>
+          <w:tcPr>
+            <w:tcW w:type="dxa" w:w="1120"/>
+          </w:tcPr>
+          <w:p>
+            <w:pPr>
+              <w:jc w:val="left"/>
+            </w:pPr>
+            <w:r/>
+          </w:p>
+        </w:tc>
+        <w:tc>
+          <w:tcPr>
+            <w:tcW w:type="dxa" w:w="1120"/>
+          </w:tcPr>
+          <w:p>
+            <w:pPr>
+              <w:jc w:val="left"/>
+            </w:pPr>
+            <w:r/>
+          </w:p>
+        </w:tc>
+        <w:tc>
+          <w:tcPr>
+            <w:tcW w:type="dxa" w:w="1120"/>
+          </w:tcPr>
+          <w:p>
+            <w:pPr>
+              <w:jc w:val="left"/>
+            </w:pPr>
+            <w:r/>
+          </w:p>
+        </w:tc>
+        <w:tc>
+          <w:tcPr>
+            <w:tcW w:type="dxa" w:w="1120"/>
+          </w:tcPr>
+          <w:p>
+            <w:pPr>
+              <w:jc w:val="left"/>
+            </w:pPr>
+            <w:r/>
+            <w:r>
+              <w:rPr>
+                <w:sz w:val="16"/>
+              </w:rPr>
+              <w:t>2026-09-01</w:t>
+            </w:r>
+          </w:p>
+        </w:tc>
+        <w:tc>
+          <w:tcPr>
+            <w:tcW w:type="dxa" w:w="1120"/>
+          </w:tcPr>
+          <w:p>
+            <w:pPr>
+              <w:jc w:val="left"/>
+            </w:pPr>
+            <w:r/>
+            <w:hyperlink r:id="rId180">
+              <w:r>
+                <w:rPr>
+                  <w:color w:val="0B4F9E"/>
+                  <w:sz w:val="16"/>
+                  <w:u w:val="single"/>
+                </w:rPr>
+                <w:t>10.1080/0022250x.2026.2726737</w:t>
               </w:r>
             </w:hyperlink>
           </w:p>

</xml_diff>

<commit_message>
Digest + summary: 2026-09-05
</commit_message>
<xml_diff>
--- a/MODEL_PERFORMANCE.docx
+++ b/MODEL_PERFORMANCE.docx
@@ -17,7 +17,7 @@
     </w:p>
     <w:p>
       <w:r>
-        <w:t xml:space="preserve">Generated 2026-09-04 by </w:t>
+        <w:t xml:space="preserve">Generated 2026-09-05 by </w:t>
       </w:r>
       <w:r>
         <w:rPr>
@@ -200,7 +200,7 @@
         <w:rPr>
           <w:b/>
         </w:rPr>
-        <w:t>173</w:t>
+        <w:t>182</w:t>
       </w:r>
       <w:r>
         <w:t xml:space="preserve"> studies parsed from the digest; </w:t>
@@ -21332,7 +21332,7 @@
               <w:rPr>
                 <w:sz w:val="16"/>
               </w:rPr>
-              <w:t>GRACE-1L-OAM, SevenNet-0, MACE-MP-0, MatterSim</w:t>
+              <w:t>GRACE-1L-OAM, SevenNet-0, MatterSim, MACE-MP-0</w:t>
             </w:r>
           </w:p>
         </w:tc>
@@ -28438,7 +28438,7 @@
               <w:rPr>
                 <w:sz w:val="16"/>
               </w:rPr>
-              <w:t>MatterGen, MatterSim</w:t>
+              <w:t>MatterSim, MatterGen</w:t>
             </w:r>
           </w:p>
         </w:tc>
@@ -41830,7 +41830,7 @@
               <w:rPr>
                 <w:sz w:val="16"/>
               </w:rPr>
-              <w:t>SevenNet-0, MACE-MP-0, MatterSim, CHGNet</w:t>
+              <w:t>SevenNet-0, MatterSim, MACE-MP-0, CHGNet</w:t>
             </w:r>
           </w:p>
         </w:tc>
@@ -41963,6 +41963,145 @@
                   <w:sz w:val="16"/>
                   <w:u w:val="single"/>
                 </w:rPr>
+                <w:t>Machine learning for predicting the glass transition and melting temperatures of polymers: molecular representations, model architectures, and interpr</w:t>
+              </w:r>
+            </w:hyperlink>
+          </w:p>
+        </w:tc>
+        <w:tc>
+          <w:tcPr>
+            <w:tcW w:type="dxa" w:w="1120"/>
+          </w:tcPr>
+          <w:p>
+            <w:pPr>
+              <w:jc w:val="left"/>
+            </w:pPr>
+            <w:r/>
+          </w:p>
+        </w:tc>
+        <w:tc>
+          <w:tcPr>
+            <w:tcW w:type="dxa" w:w="1120"/>
+          </w:tcPr>
+          <w:p>
+            <w:pPr>
+              <w:jc w:val="left"/>
+            </w:pPr>
+            <w:r/>
+            <w:r>
+              <w:rPr>
+                <w:sz w:val="16"/>
+              </w:rPr>
+              <w:t>polymer, glass / amorphous</w:t>
+            </w:r>
+          </w:p>
+        </w:tc>
+        <w:tc>
+          <w:tcPr>
+            <w:tcW w:type="dxa" w:w="1120"/>
+          </w:tcPr>
+          <w:p>
+            <w:pPr>
+              <w:jc w:val="left"/>
+            </w:pPr>
+            <w:r/>
+          </w:p>
+        </w:tc>
+        <w:tc>
+          <w:tcPr>
+            <w:tcW w:type="dxa" w:w="1120"/>
+          </w:tcPr>
+          <w:p>
+            <w:pPr>
+              <w:jc w:val="left"/>
+            </w:pPr>
+            <w:r/>
+          </w:p>
+        </w:tc>
+        <w:tc>
+          <w:tcPr>
+            <w:tcW w:type="dxa" w:w="1120"/>
+          </w:tcPr>
+          <w:p>
+            <w:pPr>
+              <w:jc w:val="left"/>
+            </w:pPr>
+            <w:r/>
+            <w:r>
+              <w:rPr>
+                <w:sz w:val="16"/>
+              </w:rPr>
+              <w:t>2026-09-03</w:t>
+            </w:r>
+          </w:p>
+        </w:tc>
+        <w:tc>
+          <w:tcPr>
+            <w:tcW w:type="dxa" w:w="1120"/>
+          </w:tcPr>
+          <w:p>
+            <w:pPr>
+              <w:jc w:val="left"/>
+            </w:pPr>
+            <w:r/>
+            <w:hyperlink r:id="rId222">
+              <w:r>
+                <w:rPr>
+                  <w:color w:val="0B4F9E"/>
+                  <w:sz w:val="16"/>
+                  <w:u w:val="single"/>
+                </w:rPr>
+                <w:t>10.3389/fmats.2026.1919251</w:t>
+              </w:r>
+            </w:hyperlink>
+          </w:p>
+        </w:tc>
+      </w:tr>
+      <w:tr>
+        <w:tc>
+          <w:tcPr>
+            <w:tcW w:type="dxa" w:w="1120"/>
+          </w:tcPr>
+          <w:p>
+            <w:pPr>
+              <w:jc w:val="left"/>
+            </w:pPr>
+            <w:r/>
+            <w:r>
+              <w:rPr>
+                <w:sz w:val="16"/>
+              </w:rPr>
+              <w:t>163</w:t>
+            </w:r>
+          </w:p>
+        </w:tc>
+        <w:tc>
+          <w:tcPr>
+            <w:tcW w:type="dxa" w:w="1120"/>
+          </w:tcPr>
+          <w:p>
+            <w:pPr>
+              <w:jc w:val="left"/>
+            </w:pPr>
+            <w:r/>
+          </w:p>
+        </w:tc>
+        <w:tc>
+          <w:tcPr>
+            <w:tcW w:type="dxa" w:w="1120"/>
+          </w:tcPr>
+          <w:p>
+            <w:pPr>
+              <w:jc w:val="left"/>
+            </w:pPr>
+            <w:r/>
+            <w:hyperlink r:id="rId223">
+              <w:r>
+                <w:rPr>
+                  <w:color w:val="0B4F9E"/>
+                  <w:sz w:val="16"/>
+                  <w:u w:val="single"/>
+                </w:rPr>
                 <w:t>Accelerated Discovery of BPA-Free Dental Resin Candidates through Active Learning of Network-Emergent Properties</w:t>
               </w:r>
             </w:hyperlink>
@@ -42044,7 +42183,7 @@
               <w:jc w:val="left"/>
             </w:pPr>
             <w:r/>
-            <w:hyperlink r:id="rId222">
+            <w:hyperlink r:id="rId223">
               <w:r>
                 <w:rPr>
                   <w:color w:val="0B4F9E"/>
@@ -42071,31 +42210,31 @@
               <w:rPr>
                 <w:sz w:val="16"/>
               </w:rPr>
-              <w:t>163</w:t>
-            </w:r>
-          </w:p>
-        </w:tc>
-        <w:tc>
-          <w:tcPr>
-            <w:tcW w:type="dxa" w:w="1120"/>
-          </w:tcPr>
-          <w:p>
-            <w:pPr>
-              <w:jc w:val="left"/>
-            </w:pPr>
-            <w:r/>
-          </w:p>
-        </w:tc>
-        <w:tc>
-          <w:tcPr>
-            <w:tcW w:type="dxa" w:w="1120"/>
-          </w:tcPr>
-          <w:p>
-            <w:pPr>
-              <w:jc w:val="left"/>
-            </w:pPr>
-            <w:r/>
-            <w:hyperlink r:id="rId223">
+              <w:t>164</w:t>
+            </w:r>
+          </w:p>
+        </w:tc>
+        <w:tc>
+          <w:tcPr>
+            <w:tcW w:type="dxa" w:w="1120"/>
+          </w:tcPr>
+          <w:p>
+            <w:pPr>
+              <w:jc w:val="left"/>
+            </w:pPr>
+            <w:r/>
+          </w:p>
+        </w:tc>
+        <w:tc>
+          <w:tcPr>
+            <w:tcW w:type="dxa" w:w="1120"/>
+          </w:tcPr>
+          <w:p>
+            <w:pPr>
+              <w:jc w:val="left"/>
+            </w:pPr>
+            <w:r/>
+            <w:hyperlink r:id="rId224">
               <w:r>
                 <w:rPr>
                   <w:color w:val="0B4F9E"/>
@@ -42189,7 +42328,7 @@
               <w:jc w:val="left"/>
             </w:pPr>
             <w:r/>
-            <w:hyperlink r:id="rId223">
+            <w:hyperlink r:id="rId224">
               <w:r>
                 <w:rPr>
                   <w:color w:val="0B4F9E"/>
@@ -42216,31 +42355,31 @@
               <w:rPr>
                 <w:sz w:val="16"/>
               </w:rPr>
-              <w:t>164</w:t>
-            </w:r>
-          </w:p>
-        </w:tc>
-        <w:tc>
-          <w:tcPr>
-            <w:tcW w:type="dxa" w:w="1120"/>
-          </w:tcPr>
-          <w:p>
-            <w:pPr>
-              <w:jc w:val="left"/>
-            </w:pPr>
-            <w:r/>
-          </w:p>
-        </w:tc>
-        <w:tc>
-          <w:tcPr>
-            <w:tcW w:type="dxa" w:w="1120"/>
-          </w:tcPr>
-          <w:p>
-            <w:pPr>
-              <w:jc w:val="left"/>
-            </w:pPr>
-            <w:r/>
-            <w:hyperlink r:id="rId224">
+              <w:t>165</w:t>
+            </w:r>
+          </w:p>
+        </w:tc>
+        <w:tc>
+          <w:tcPr>
+            <w:tcW w:type="dxa" w:w="1120"/>
+          </w:tcPr>
+          <w:p>
+            <w:pPr>
+              <w:jc w:val="left"/>
+            </w:pPr>
+            <w:r/>
+          </w:p>
+        </w:tc>
+        <w:tc>
+          <w:tcPr>
+            <w:tcW w:type="dxa" w:w="1120"/>
+          </w:tcPr>
+          <w:p>
+            <w:pPr>
+              <w:jc w:val="left"/>
+            </w:pPr>
+            <w:r/>
+            <w:hyperlink r:id="rId225">
               <w:r>
                 <w:rPr>
                   <w:color w:val="0B4F9E"/>
@@ -42322,7 +42461,7 @@
               <w:jc w:val="left"/>
             </w:pPr>
             <w:r/>
-            <w:hyperlink r:id="rId224">
+            <w:hyperlink r:id="rId225">
               <w:r>
                 <w:rPr>
                   <w:color w:val="0B4F9E"/>
@@ -42349,31 +42488,31 @@
               <w:rPr>
                 <w:sz w:val="16"/>
               </w:rPr>
-              <w:t>165</w:t>
-            </w:r>
-          </w:p>
-        </w:tc>
-        <w:tc>
-          <w:tcPr>
-            <w:tcW w:type="dxa" w:w="1120"/>
-          </w:tcPr>
-          <w:p>
-            <w:pPr>
-              <w:jc w:val="left"/>
-            </w:pPr>
-            <w:r/>
-          </w:p>
-        </w:tc>
-        <w:tc>
-          <w:tcPr>
-            <w:tcW w:type="dxa" w:w="1120"/>
-          </w:tcPr>
-          <w:p>
-            <w:pPr>
-              <w:jc w:val="left"/>
-            </w:pPr>
-            <w:r/>
-            <w:hyperlink r:id="rId225">
+              <w:t>166</w:t>
+            </w:r>
+          </w:p>
+        </w:tc>
+        <w:tc>
+          <w:tcPr>
+            <w:tcW w:type="dxa" w:w="1120"/>
+          </w:tcPr>
+          <w:p>
+            <w:pPr>
+              <w:jc w:val="left"/>
+            </w:pPr>
+            <w:r/>
+          </w:p>
+        </w:tc>
+        <w:tc>
+          <w:tcPr>
+            <w:tcW w:type="dxa" w:w="1120"/>
+          </w:tcPr>
+          <w:p>
+            <w:pPr>
+              <w:jc w:val="left"/>
+            </w:pPr>
+            <w:r/>
+            <w:hyperlink r:id="rId226">
               <w:r>
                 <w:rPr>
                   <w:color w:val="0B4F9E"/>
@@ -42455,7 +42594,7 @@
               <w:jc w:val="left"/>
             </w:pPr>
             <w:r/>
-            <w:hyperlink r:id="rId225">
+            <w:hyperlink r:id="rId226">
               <w:r>
                 <w:rPr>
                   <w:color w:val="0B4F9E"/>
@@ -42482,31 +42621,31 @@
               <w:rPr>
                 <w:sz w:val="16"/>
               </w:rPr>
-              <w:t>166</w:t>
-            </w:r>
-          </w:p>
-        </w:tc>
-        <w:tc>
-          <w:tcPr>
-            <w:tcW w:type="dxa" w:w="1120"/>
-          </w:tcPr>
-          <w:p>
-            <w:pPr>
-              <w:jc w:val="left"/>
-            </w:pPr>
-            <w:r/>
-          </w:p>
-        </w:tc>
-        <w:tc>
-          <w:tcPr>
-            <w:tcW w:type="dxa" w:w="1120"/>
-          </w:tcPr>
-          <w:p>
-            <w:pPr>
-              <w:jc w:val="left"/>
-            </w:pPr>
-            <w:r/>
-            <w:hyperlink r:id="rId226">
+              <w:t>167</w:t>
+            </w:r>
+          </w:p>
+        </w:tc>
+        <w:tc>
+          <w:tcPr>
+            <w:tcW w:type="dxa" w:w="1120"/>
+          </w:tcPr>
+          <w:p>
+            <w:pPr>
+              <w:jc w:val="left"/>
+            </w:pPr>
+            <w:r/>
+          </w:p>
+        </w:tc>
+        <w:tc>
+          <w:tcPr>
+            <w:tcW w:type="dxa" w:w="1120"/>
+          </w:tcPr>
+          <w:p>
+            <w:pPr>
+              <w:jc w:val="left"/>
+            </w:pPr>
+            <w:r/>
+            <w:hyperlink r:id="rId227">
               <w:r>
                 <w:rPr>
                   <w:color w:val="0B4F9E"/>
@@ -42588,7 +42727,7 @@
               <w:jc w:val="left"/>
             </w:pPr>
             <w:r/>
-            <w:hyperlink r:id="rId226">
+            <w:hyperlink r:id="rId227">
               <w:r>
                 <w:rPr>
                   <w:color w:val="0B4F9E"/>
@@ -42615,31 +42754,31 @@
               <w:rPr>
                 <w:sz w:val="16"/>
               </w:rPr>
-              <w:t>167</w:t>
-            </w:r>
-          </w:p>
-        </w:tc>
-        <w:tc>
-          <w:tcPr>
-            <w:tcW w:type="dxa" w:w="1120"/>
-          </w:tcPr>
-          <w:p>
-            <w:pPr>
-              <w:jc w:val="left"/>
-            </w:pPr>
-            <w:r/>
-          </w:p>
-        </w:tc>
-        <w:tc>
-          <w:tcPr>
-            <w:tcW w:type="dxa" w:w="1120"/>
-          </w:tcPr>
-          <w:p>
-            <w:pPr>
-              <w:jc w:val="left"/>
-            </w:pPr>
-            <w:r/>
-            <w:hyperlink r:id="rId227">
+              <w:t>168</w:t>
+            </w:r>
+          </w:p>
+        </w:tc>
+        <w:tc>
+          <w:tcPr>
+            <w:tcW w:type="dxa" w:w="1120"/>
+          </w:tcPr>
+          <w:p>
+            <w:pPr>
+              <w:jc w:val="left"/>
+            </w:pPr>
+            <w:r/>
+          </w:p>
+        </w:tc>
+        <w:tc>
+          <w:tcPr>
+            <w:tcW w:type="dxa" w:w="1120"/>
+          </w:tcPr>
+          <w:p>
+            <w:pPr>
+              <w:jc w:val="left"/>
+            </w:pPr>
+            <w:r/>
+            <w:hyperlink r:id="rId228">
               <w:r>
                 <w:rPr>
                   <w:color w:val="0B4F9E"/>
@@ -42733,7 +42872,7 @@
               <w:jc w:val="left"/>
             </w:pPr>
             <w:r/>
-            <w:hyperlink r:id="rId227">
+            <w:hyperlink r:id="rId228">
               <w:r>
                 <w:rPr>
                   <w:color w:val="0B4F9E"/>
@@ -42760,31 +42899,31 @@
               <w:rPr>
                 <w:sz w:val="16"/>
               </w:rPr>
-              <w:t>168</w:t>
-            </w:r>
-          </w:p>
-        </w:tc>
-        <w:tc>
-          <w:tcPr>
-            <w:tcW w:type="dxa" w:w="1120"/>
-          </w:tcPr>
-          <w:p>
-            <w:pPr>
-              <w:jc w:val="left"/>
-            </w:pPr>
-            <w:r/>
-          </w:p>
-        </w:tc>
-        <w:tc>
-          <w:tcPr>
-            <w:tcW w:type="dxa" w:w="1120"/>
-          </w:tcPr>
-          <w:p>
-            <w:pPr>
-              <w:jc w:val="left"/>
-            </w:pPr>
-            <w:r/>
-            <w:hyperlink r:id="rId228">
+              <w:t>169</w:t>
+            </w:r>
+          </w:p>
+        </w:tc>
+        <w:tc>
+          <w:tcPr>
+            <w:tcW w:type="dxa" w:w="1120"/>
+          </w:tcPr>
+          <w:p>
+            <w:pPr>
+              <w:jc w:val="left"/>
+            </w:pPr>
+            <w:r/>
+          </w:p>
+        </w:tc>
+        <w:tc>
+          <w:tcPr>
+            <w:tcW w:type="dxa" w:w="1120"/>
+          </w:tcPr>
+          <w:p>
+            <w:pPr>
+              <w:jc w:val="left"/>
+            </w:pPr>
+            <w:r/>
+            <w:hyperlink r:id="rId229">
               <w:r>
                 <w:rPr>
                   <w:color w:val="0B4F9E"/>
@@ -42866,7 +43005,7 @@
               <w:jc w:val="left"/>
             </w:pPr>
             <w:r/>
-            <w:hyperlink r:id="rId228">
+            <w:hyperlink r:id="rId229">
               <w:r>
                 <w:rPr>
                   <w:color w:val="0B4F9E"/>
@@ -42893,31 +43032,460 @@
               <w:rPr>
                 <w:sz w:val="16"/>
               </w:rPr>
-              <w:t>169</w:t>
-            </w:r>
-          </w:p>
-        </w:tc>
-        <w:tc>
-          <w:tcPr>
-            <w:tcW w:type="dxa" w:w="1120"/>
-          </w:tcPr>
-          <w:p>
-            <w:pPr>
-              <w:jc w:val="left"/>
-            </w:pPr>
-            <w:r/>
-          </w:p>
-        </w:tc>
-        <w:tc>
-          <w:tcPr>
-            <w:tcW w:type="dxa" w:w="1120"/>
-          </w:tcPr>
-          <w:p>
-            <w:pPr>
-              <w:jc w:val="left"/>
-            </w:pPr>
-            <w:r/>
-            <w:hyperlink r:id="rId229">
+              <w:t>170</w:t>
+            </w:r>
+          </w:p>
+        </w:tc>
+        <w:tc>
+          <w:tcPr>
+            <w:tcW w:type="dxa" w:w="1120"/>
+          </w:tcPr>
+          <w:p>
+            <w:pPr>
+              <w:jc w:val="left"/>
+            </w:pPr>
+            <w:r/>
+          </w:p>
+        </w:tc>
+        <w:tc>
+          <w:tcPr>
+            <w:tcW w:type="dxa" w:w="1120"/>
+          </w:tcPr>
+          <w:p>
+            <w:pPr>
+              <w:jc w:val="left"/>
+            </w:pPr>
+            <w:r/>
+            <w:hyperlink r:id="rId230">
+              <w:r>
+                <w:rPr>
+                  <w:color w:val="0B4F9E"/>
+                  <w:sz w:val="16"/>
+                  <w:u w:val="single"/>
+                </w:rPr>
+                <w:t>Unveiling Surface Reaction Networks in Biomass-Derived Compound Upgrading</w:t>
+              </w:r>
+            </w:hyperlink>
+          </w:p>
+        </w:tc>
+        <w:tc>
+          <w:tcPr>
+            <w:tcW w:type="dxa" w:w="1120"/>
+          </w:tcPr>
+          <w:p>
+            <w:pPr>
+              <w:jc w:val="left"/>
+            </w:pPr>
+            <w:r/>
+          </w:p>
+        </w:tc>
+        <w:tc>
+          <w:tcPr>
+            <w:tcW w:type="dxa" w:w="1120"/>
+          </w:tcPr>
+          <w:p>
+            <w:pPr>
+              <w:jc w:val="left"/>
+            </w:pPr>
+            <w:r/>
+            <w:r>
+              <w:rPr>
+                <w:sz w:val="16"/>
+              </w:rPr>
+              <w:t>catalyst, oxide</w:t>
+            </w:r>
+          </w:p>
+        </w:tc>
+        <w:tc>
+          <w:tcPr>
+            <w:tcW w:type="dxa" w:w="1120"/>
+          </w:tcPr>
+          <w:p>
+            <w:pPr>
+              <w:jc w:val="left"/>
+            </w:pPr>
+            <w:r/>
+            <w:r>
+              <w:rPr>
+                <w:sz w:val="16"/>
+              </w:rPr>
+              <w:t>MLIP</w:t>
+            </w:r>
+          </w:p>
+        </w:tc>
+        <w:tc>
+          <w:tcPr>
+            <w:tcW w:type="dxa" w:w="1120"/>
+          </w:tcPr>
+          <w:p>
+            <w:pPr>
+              <w:jc w:val="left"/>
+            </w:pPr>
+            <w:r/>
+          </w:p>
+        </w:tc>
+        <w:tc>
+          <w:tcPr>
+            <w:tcW w:type="dxa" w:w="1120"/>
+          </w:tcPr>
+          <w:p>
+            <w:pPr>
+              <w:jc w:val="left"/>
+            </w:pPr>
+            <w:r/>
+            <w:r>
+              <w:rPr>
+                <w:sz w:val="16"/>
+              </w:rPr>
+              <w:t>2026-09-04</w:t>
+            </w:r>
+          </w:p>
+        </w:tc>
+        <w:tc>
+          <w:tcPr>
+            <w:tcW w:type="dxa" w:w="1120"/>
+          </w:tcPr>
+          <w:p>
+            <w:pPr>
+              <w:jc w:val="left"/>
+            </w:pPr>
+            <w:r/>
+            <w:hyperlink r:id="rId230">
+              <w:r>
+                <w:rPr>
+                  <w:color w:val="0B4F9E"/>
+                  <w:sz w:val="16"/>
+                  <w:u w:val="single"/>
+                </w:rPr>
+                <w:t>10.26434/chemrxiv.15008286/v1</w:t>
+              </w:r>
+            </w:hyperlink>
+          </w:p>
+        </w:tc>
+      </w:tr>
+      <w:tr>
+        <w:tc>
+          <w:tcPr>
+            <w:tcW w:type="dxa" w:w="1120"/>
+          </w:tcPr>
+          <w:p>
+            <w:pPr>
+              <w:jc w:val="left"/>
+            </w:pPr>
+            <w:r/>
+            <w:r>
+              <w:rPr>
+                <w:sz w:val="16"/>
+              </w:rPr>
+              <w:t>171</w:t>
+            </w:r>
+          </w:p>
+        </w:tc>
+        <w:tc>
+          <w:tcPr>
+            <w:tcW w:type="dxa" w:w="1120"/>
+          </w:tcPr>
+          <w:p>
+            <w:pPr>
+              <w:jc w:val="left"/>
+            </w:pPr>
+            <w:r/>
+          </w:p>
+        </w:tc>
+        <w:tc>
+          <w:tcPr>
+            <w:tcW w:type="dxa" w:w="1120"/>
+          </w:tcPr>
+          <w:p>
+            <w:pPr>
+              <w:jc w:val="left"/>
+            </w:pPr>
+            <w:r/>
+            <w:hyperlink r:id="rId231">
+              <w:r>
+                <w:rPr>
+                  <w:color w:val="0B4F9E"/>
+                  <w:sz w:val="16"/>
+                  <w:u w:val="single"/>
+                </w:rPr>
+                <w:t>Field-aware and charge-informed machine learning for predicting molecular and condensed-phase responses and vibrational spectra</w:t>
+              </w:r>
+            </w:hyperlink>
+          </w:p>
+        </w:tc>
+        <w:tc>
+          <w:tcPr>
+            <w:tcW w:type="dxa" w:w="1120"/>
+          </w:tcPr>
+          <w:p>
+            <w:pPr>
+              <w:jc w:val="left"/>
+            </w:pPr>
+            <w:r/>
+          </w:p>
+        </w:tc>
+        <w:tc>
+          <w:tcPr>
+            <w:tcW w:type="dxa" w:w="1120"/>
+          </w:tcPr>
+          <w:p>
+            <w:pPr>
+              <w:jc w:val="left"/>
+            </w:pPr>
+            <w:r/>
+          </w:p>
+        </w:tc>
+        <w:tc>
+          <w:tcPr>
+            <w:tcW w:type="dxa" w:w="1120"/>
+          </w:tcPr>
+          <w:p>
+            <w:pPr>
+              <w:jc w:val="left"/>
+            </w:pPr>
+            <w:r/>
+            <w:r>
+              <w:rPr>
+                <w:sz w:val="16"/>
+              </w:rPr>
+              <w:t>MLIP</w:t>
+            </w:r>
+          </w:p>
+        </w:tc>
+        <w:tc>
+          <w:tcPr>
+            <w:tcW w:type="dxa" w:w="1120"/>
+          </w:tcPr>
+          <w:p>
+            <w:pPr>
+              <w:jc w:val="left"/>
+            </w:pPr>
+            <w:r/>
+          </w:p>
+        </w:tc>
+        <w:tc>
+          <w:tcPr>
+            <w:tcW w:type="dxa" w:w="1120"/>
+          </w:tcPr>
+          <w:p>
+            <w:pPr>
+              <w:jc w:val="left"/>
+            </w:pPr>
+            <w:r/>
+            <w:r>
+              <w:rPr>
+                <w:sz w:val="16"/>
+              </w:rPr>
+              <w:t>2026-09-04</w:t>
+            </w:r>
+          </w:p>
+        </w:tc>
+        <w:tc>
+          <w:tcPr>
+            <w:tcW w:type="dxa" w:w="1120"/>
+          </w:tcPr>
+          <w:p>
+            <w:pPr>
+              <w:jc w:val="left"/>
+            </w:pPr>
+            <w:r/>
+            <w:hyperlink r:id="rId231">
+              <w:r>
+                <w:rPr>
+                  <w:color w:val="0B4F9E"/>
+                  <w:sz w:val="16"/>
+                  <w:u w:val="single"/>
+                </w:rPr>
+                <w:t>10.1038/s41524-026-02293-6</w:t>
+              </w:r>
+            </w:hyperlink>
+          </w:p>
+        </w:tc>
+      </w:tr>
+      <w:tr>
+        <w:tc>
+          <w:tcPr>
+            <w:tcW w:type="dxa" w:w="1120"/>
+          </w:tcPr>
+          <w:p>
+            <w:pPr>
+              <w:jc w:val="left"/>
+            </w:pPr>
+            <w:r/>
+            <w:r>
+              <w:rPr>
+                <w:sz w:val="16"/>
+              </w:rPr>
+              <w:t>172</w:t>
+            </w:r>
+          </w:p>
+        </w:tc>
+        <w:tc>
+          <w:tcPr>
+            <w:tcW w:type="dxa" w:w="1120"/>
+          </w:tcPr>
+          <w:p>
+            <w:pPr>
+              <w:jc w:val="left"/>
+            </w:pPr>
+            <w:r/>
+          </w:p>
+        </w:tc>
+        <w:tc>
+          <w:tcPr>
+            <w:tcW w:type="dxa" w:w="1120"/>
+          </w:tcPr>
+          <w:p>
+            <w:pPr>
+              <w:jc w:val="left"/>
+            </w:pPr>
+            <w:r/>
+            <w:hyperlink r:id="rId232">
+              <w:r>
+                <w:rPr>
+                  <w:color w:val="0B4F9E"/>
+                  <w:sz w:val="16"/>
+                  <w:u w:val="single"/>
+                </w:rPr>
+                <w:t>Accelerated stable structure prediction of Li-intercalated bilayer graphene using a data-efficient deep learning framework</w:t>
+              </w:r>
+            </w:hyperlink>
+          </w:p>
+        </w:tc>
+        <w:tc>
+          <w:tcPr>
+            <w:tcW w:type="dxa" w:w="1120"/>
+          </w:tcPr>
+          <w:p>
+            <w:pPr>
+              <w:jc w:val="left"/>
+            </w:pPr>
+            <w:r/>
+          </w:p>
+        </w:tc>
+        <w:tc>
+          <w:tcPr>
+            <w:tcW w:type="dxa" w:w="1120"/>
+          </w:tcPr>
+          <w:p>
+            <w:pPr>
+              <w:jc w:val="left"/>
+            </w:pPr>
+            <w:r/>
+            <w:r>
+              <w:rPr>
+                <w:sz w:val="16"/>
+              </w:rPr>
+              <w:t>Li-ion battery, 2D material</w:t>
+            </w:r>
+          </w:p>
+        </w:tc>
+        <w:tc>
+          <w:tcPr>
+            <w:tcW w:type="dxa" w:w="1120"/>
+          </w:tcPr>
+          <w:p>
+            <w:pPr>
+              <w:jc w:val="left"/>
+            </w:pPr>
+            <w:r/>
+            <w:r>
+              <w:rPr>
+                <w:sz w:val="16"/>
+              </w:rPr>
+              <w:t>DFT, MLIP</w:t>
+            </w:r>
+          </w:p>
+        </w:tc>
+        <w:tc>
+          <w:tcPr>
+            <w:tcW w:type="dxa" w:w="1120"/>
+          </w:tcPr>
+          <w:p>
+            <w:pPr>
+              <w:jc w:val="left"/>
+            </w:pPr>
+            <w:r/>
+          </w:p>
+        </w:tc>
+        <w:tc>
+          <w:tcPr>
+            <w:tcW w:type="dxa" w:w="1120"/>
+          </w:tcPr>
+          <w:p>
+            <w:pPr>
+              <w:jc w:val="left"/>
+            </w:pPr>
+            <w:r/>
+            <w:r>
+              <w:rPr>
+                <w:sz w:val="16"/>
+              </w:rPr>
+              <w:t>2026-09-04</w:t>
+            </w:r>
+          </w:p>
+        </w:tc>
+        <w:tc>
+          <w:tcPr>
+            <w:tcW w:type="dxa" w:w="1120"/>
+          </w:tcPr>
+          <w:p>
+            <w:pPr>
+              <w:jc w:val="left"/>
+            </w:pPr>
+            <w:r/>
+            <w:hyperlink r:id="rId232">
+              <w:r>
+                <w:rPr>
+                  <w:color w:val="0B4F9E"/>
+                  <w:sz w:val="16"/>
+                  <w:u w:val="single"/>
+                </w:rPr>
+                <w:t>10.1038/s41524-026-02314-4</w:t>
+              </w:r>
+            </w:hyperlink>
+          </w:p>
+        </w:tc>
+      </w:tr>
+      <w:tr>
+        <w:tc>
+          <w:tcPr>
+            <w:tcW w:type="dxa" w:w="1120"/>
+          </w:tcPr>
+          <w:p>
+            <w:pPr>
+              <w:jc w:val="left"/>
+            </w:pPr>
+            <w:r/>
+            <w:r>
+              <w:rPr>
+                <w:sz w:val="16"/>
+              </w:rPr>
+              <w:t>173</w:t>
+            </w:r>
+          </w:p>
+        </w:tc>
+        <w:tc>
+          <w:tcPr>
+            <w:tcW w:type="dxa" w:w="1120"/>
+          </w:tcPr>
+          <w:p>
+            <w:pPr>
+              <w:jc w:val="left"/>
+            </w:pPr>
+            <w:r/>
+          </w:p>
+        </w:tc>
+        <w:tc>
+          <w:tcPr>
+            <w:tcW w:type="dxa" w:w="1120"/>
+          </w:tcPr>
+          <w:p>
+            <w:pPr>
+              <w:jc w:val="left"/>
+            </w:pPr>
+            <w:r/>
+            <w:hyperlink r:id="rId233">
               <w:r>
                 <w:rPr>
                   <w:color w:val="0B4F9E"/>
@@ -43005,7 +43573,7 @@
               <w:jc w:val="left"/>
             </w:pPr>
             <w:r/>
-            <w:hyperlink r:id="rId229">
+            <w:hyperlink r:id="rId233">
               <w:r>
                 <w:rPr>
                   <w:color w:val="0B4F9E"/>
@@ -43032,31 +43600,31 @@
               <w:rPr>
                 <w:sz w:val="16"/>
               </w:rPr>
-              <w:t>170</w:t>
-            </w:r>
-          </w:p>
-        </w:tc>
-        <w:tc>
-          <w:tcPr>
-            <w:tcW w:type="dxa" w:w="1120"/>
-          </w:tcPr>
-          <w:p>
-            <w:pPr>
-              <w:jc w:val="left"/>
-            </w:pPr>
-            <w:r/>
-          </w:p>
-        </w:tc>
-        <w:tc>
-          <w:tcPr>
-            <w:tcW w:type="dxa" w:w="1120"/>
-          </w:tcPr>
-          <w:p>
-            <w:pPr>
-              <w:jc w:val="left"/>
-            </w:pPr>
-            <w:r/>
-            <w:hyperlink r:id="rId230">
+              <w:t>174</w:t>
+            </w:r>
+          </w:p>
+        </w:tc>
+        <w:tc>
+          <w:tcPr>
+            <w:tcW w:type="dxa" w:w="1120"/>
+          </w:tcPr>
+          <w:p>
+            <w:pPr>
+              <w:jc w:val="left"/>
+            </w:pPr>
+            <w:r/>
+          </w:p>
+        </w:tc>
+        <w:tc>
+          <w:tcPr>
+            <w:tcW w:type="dxa" w:w="1120"/>
+          </w:tcPr>
+          <w:p>
+            <w:pPr>
+              <w:jc w:val="left"/>
+            </w:pPr>
+            <w:r/>
+            <w:hyperlink r:id="rId234">
               <w:r>
                 <w:rPr>
                   <w:color w:val="0B4F9E"/>
@@ -43144,7 +43712,7 @@
               <w:jc w:val="left"/>
             </w:pPr>
             <w:r/>
-            <w:hyperlink r:id="rId230">
+            <w:hyperlink r:id="rId234">
               <w:r>
                 <w:rPr>
                   <w:color w:val="0B4F9E"/>
@@ -43171,31 +43739,31 @@
               <w:rPr>
                 <w:sz w:val="16"/>
               </w:rPr>
-              <w:t>171</w:t>
-            </w:r>
-          </w:p>
-        </w:tc>
-        <w:tc>
-          <w:tcPr>
-            <w:tcW w:type="dxa" w:w="1120"/>
-          </w:tcPr>
-          <w:p>
-            <w:pPr>
-              <w:jc w:val="left"/>
-            </w:pPr>
-            <w:r/>
-          </w:p>
-        </w:tc>
-        <w:tc>
-          <w:tcPr>
-            <w:tcW w:type="dxa" w:w="1120"/>
-          </w:tcPr>
-          <w:p>
-            <w:pPr>
-              <w:jc w:val="left"/>
-            </w:pPr>
-            <w:r/>
-            <w:hyperlink r:id="rId231">
+              <w:t>175</w:t>
+            </w:r>
+          </w:p>
+        </w:tc>
+        <w:tc>
+          <w:tcPr>
+            <w:tcW w:type="dxa" w:w="1120"/>
+          </w:tcPr>
+          <w:p>
+            <w:pPr>
+              <w:jc w:val="left"/>
+            </w:pPr>
+            <w:r/>
+          </w:p>
+        </w:tc>
+        <w:tc>
+          <w:tcPr>
+            <w:tcW w:type="dxa" w:w="1120"/>
+          </w:tcPr>
+          <w:p>
+            <w:pPr>
+              <w:jc w:val="left"/>
+            </w:pPr>
+            <w:r/>
+            <w:hyperlink r:id="rId235">
               <w:r>
                 <w:rPr>
                   <w:color w:val="0B4F9E"/>
@@ -43277,7 +43845,7 @@
               <w:jc w:val="left"/>
             </w:pPr>
             <w:r/>
-            <w:hyperlink r:id="rId231">
+            <w:hyperlink r:id="rId235">
               <w:r>
                 <w:rPr>
                   <w:color w:val="0B4F9E"/>
@@ -43304,31 +43872,321 @@
               <w:rPr>
                 <w:sz w:val="16"/>
               </w:rPr>
-              <w:t>172</w:t>
-            </w:r>
-          </w:p>
-        </w:tc>
-        <w:tc>
-          <w:tcPr>
-            <w:tcW w:type="dxa" w:w="1120"/>
-          </w:tcPr>
-          <w:p>
-            <w:pPr>
-              <w:jc w:val="left"/>
-            </w:pPr>
-            <w:r/>
-          </w:p>
-        </w:tc>
-        <w:tc>
-          <w:tcPr>
-            <w:tcW w:type="dxa" w:w="1120"/>
-          </w:tcPr>
-          <w:p>
-            <w:pPr>
-              <w:jc w:val="left"/>
-            </w:pPr>
-            <w:r/>
-            <w:hyperlink r:id="rId232">
+              <w:t>176</w:t>
+            </w:r>
+          </w:p>
+        </w:tc>
+        <w:tc>
+          <w:tcPr>
+            <w:tcW w:type="dxa" w:w="1120"/>
+          </w:tcPr>
+          <w:p>
+            <w:pPr>
+              <w:jc w:val="left"/>
+            </w:pPr>
+            <w:r/>
+          </w:p>
+        </w:tc>
+        <w:tc>
+          <w:tcPr>
+            <w:tcW w:type="dxa" w:w="1120"/>
+          </w:tcPr>
+          <w:p>
+            <w:pPr>
+              <w:jc w:val="left"/>
+            </w:pPr>
+            <w:r/>
+            <w:hyperlink r:id="rId236">
+              <w:r>
+                <w:rPr>
+                  <w:color w:val="0B4F9E"/>
+                  <w:sz w:val="16"/>
+                  <w:u w:val="single"/>
+                </w:rPr>
+                <w:t>Distinguishing the mixed conduction interphase: a machine learning molecular dynamics study on the Na 3 PS 4 /Na battery interface</w:t>
+              </w:r>
+            </w:hyperlink>
+          </w:p>
+        </w:tc>
+        <w:tc>
+          <w:tcPr>
+            <w:tcW w:type="dxa" w:w="1120"/>
+          </w:tcPr>
+          <w:p>
+            <w:pPr>
+              <w:jc w:val="left"/>
+            </w:pPr>
+            <w:r/>
+          </w:p>
+        </w:tc>
+        <w:tc>
+          <w:tcPr>
+            <w:tcW w:type="dxa" w:w="1120"/>
+          </w:tcPr>
+          <w:p>
+            <w:pPr>
+              <w:jc w:val="left"/>
+            </w:pPr>
+            <w:r/>
+            <w:r>
+              <w:rPr>
+                <w:sz w:val="16"/>
+              </w:rPr>
+              <w:t>solid electrolyte, Li-ion battery, glass / amorphous</w:t>
+            </w:r>
+          </w:p>
+        </w:tc>
+        <w:tc>
+          <w:tcPr>
+            <w:tcW w:type="dxa" w:w="1120"/>
+          </w:tcPr>
+          <w:p>
+            <w:pPr>
+              <w:jc w:val="left"/>
+            </w:pPr>
+            <w:r/>
+            <w:r>
+              <w:rPr>
+                <w:sz w:val="16"/>
+              </w:rPr>
+              <w:t>MD, MLIP</w:t>
+            </w:r>
+          </w:p>
+        </w:tc>
+        <w:tc>
+          <w:tcPr>
+            <w:tcW w:type="dxa" w:w="1120"/>
+          </w:tcPr>
+          <w:p>
+            <w:pPr>
+              <w:jc w:val="left"/>
+            </w:pPr>
+            <w:r/>
+          </w:p>
+        </w:tc>
+        <w:tc>
+          <w:tcPr>
+            <w:tcW w:type="dxa" w:w="1120"/>
+          </w:tcPr>
+          <w:p>
+            <w:pPr>
+              <w:jc w:val="left"/>
+            </w:pPr>
+            <w:r/>
+            <w:r>
+              <w:rPr>
+                <w:sz w:val="16"/>
+              </w:rPr>
+              <w:t>2026-09-04</w:t>
+            </w:r>
+          </w:p>
+        </w:tc>
+        <w:tc>
+          <w:tcPr>
+            <w:tcW w:type="dxa" w:w="1120"/>
+          </w:tcPr>
+          <w:p>
+            <w:pPr>
+              <w:jc w:val="left"/>
+            </w:pPr>
+            <w:r/>
+            <w:hyperlink r:id="rId236">
+              <w:r>
+                <w:rPr>
+                  <w:color w:val="0B4F9E"/>
+                  <w:sz w:val="16"/>
+                  <w:u w:val="single"/>
+                </w:rPr>
+                <w:t>10.1088/2632-2153/aea2f0</w:t>
+              </w:r>
+            </w:hyperlink>
+          </w:p>
+        </w:tc>
+      </w:tr>
+      <w:tr>
+        <w:tc>
+          <w:tcPr>
+            <w:tcW w:type="dxa" w:w="1120"/>
+          </w:tcPr>
+          <w:p>
+            <w:pPr>
+              <w:jc w:val="left"/>
+            </w:pPr>
+            <w:r/>
+            <w:r>
+              <w:rPr>
+                <w:sz w:val="16"/>
+              </w:rPr>
+              <w:t>177</w:t>
+            </w:r>
+          </w:p>
+        </w:tc>
+        <w:tc>
+          <w:tcPr>
+            <w:tcW w:type="dxa" w:w="1120"/>
+          </w:tcPr>
+          <w:p>
+            <w:pPr>
+              <w:jc w:val="left"/>
+            </w:pPr>
+            <w:r/>
+          </w:p>
+        </w:tc>
+        <w:tc>
+          <w:tcPr>
+            <w:tcW w:type="dxa" w:w="1120"/>
+          </w:tcPr>
+          <w:p>
+            <w:pPr>
+              <w:jc w:val="left"/>
+            </w:pPr>
+            <w:r/>
+            <w:hyperlink r:id="rId237">
+              <w:r>
+                <w:rPr>
+                  <w:color w:val="0B4F9E"/>
+                  <w:sz w:val="16"/>
+                  <w:u w:val="single"/>
+                </w:rPr>
+                <w:t>Machine learning interatomic potentials for solid-state precipitation</w:t>
+              </w:r>
+            </w:hyperlink>
+          </w:p>
+        </w:tc>
+        <w:tc>
+          <w:tcPr>
+            <w:tcW w:type="dxa" w:w="1120"/>
+          </w:tcPr>
+          <w:p>
+            <w:pPr>
+              <w:jc w:val="left"/>
+            </w:pPr>
+            <w:r/>
+          </w:p>
+        </w:tc>
+        <w:tc>
+          <w:tcPr>
+            <w:tcW w:type="dxa" w:w="1120"/>
+          </w:tcPr>
+          <w:p>
+            <w:pPr>
+              <w:jc w:val="left"/>
+            </w:pPr>
+            <w:r/>
+            <w:r>
+              <w:rPr>
+                <w:sz w:val="16"/>
+              </w:rPr>
+              <w:t>alloy</w:t>
+            </w:r>
+          </w:p>
+        </w:tc>
+        <w:tc>
+          <w:tcPr>
+            <w:tcW w:type="dxa" w:w="1120"/>
+          </w:tcPr>
+          <w:p>
+            <w:pPr>
+              <w:jc w:val="left"/>
+            </w:pPr>
+            <w:r/>
+            <w:r>
+              <w:rPr>
+                <w:sz w:val="16"/>
+              </w:rPr>
+              <w:t>MLIP</w:t>
+            </w:r>
+          </w:p>
+        </w:tc>
+        <w:tc>
+          <w:tcPr>
+            <w:tcW w:type="dxa" w:w="1120"/>
+          </w:tcPr>
+          <w:p>
+            <w:pPr>
+              <w:jc w:val="left"/>
+            </w:pPr>
+            <w:r/>
+          </w:p>
+        </w:tc>
+        <w:tc>
+          <w:tcPr>
+            <w:tcW w:type="dxa" w:w="1120"/>
+          </w:tcPr>
+          <w:p>
+            <w:pPr>
+              <w:jc w:val="left"/>
+            </w:pPr>
+            <w:r/>
+            <w:r>
+              <w:rPr>
+                <w:sz w:val="16"/>
+              </w:rPr>
+              <w:t>2026-09-04</w:t>
+            </w:r>
+          </w:p>
+        </w:tc>
+        <w:tc>
+          <w:tcPr>
+            <w:tcW w:type="dxa" w:w="1120"/>
+          </w:tcPr>
+          <w:p>
+            <w:pPr>
+              <w:jc w:val="left"/>
+            </w:pPr>
+            <w:r/>
+            <w:hyperlink r:id="rId237">
+              <w:r>
+                <w:rPr>
+                  <w:color w:val="0B4F9E"/>
+                  <w:sz w:val="16"/>
+                  <w:u w:val="single"/>
+                </w:rPr>
+                <w:t>10.1103/qyb1-7j1p</w:t>
+              </w:r>
+            </w:hyperlink>
+          </w:p>
+        </w:tc>
+      </w:tr>
+      <w:tr>
+        <w:tc>
+          <w:tcPr>
+            <w:tcW w:type="dxa" w:w="1120"/>
+          </w:tcPr>
+          <w:p>
+            <w:pPr>
+              <w:jc w:val="left"/>
+            </w:pPr>
+            <w:r/>
+            <w:r>
+              <w:rPr>
+                <w:sz w:val="16"/>
+              </w:rPr>
+              <w:t>178</w:t>
+            </w:r>
+          </w:p>
+        </w:tc>
+        <w:tc>
+          <w:tcPr>
+            <w:tcW w:type="dxa" w:w="1120"/>
+          </w:tcPr>
+          <w:p>
+            <w:pPr>
+              <w:jc w:val="left"/>
+            </w:pPr>
+            <w:r/>
+          </w:p>
+        </w:tc>
+        <w:tc>
+          <w:tcPr>
+            <w:tcW w:type="dxa" w:w="1120"/>
+          </w:tcPr>
+          <w:p>
+            <w:pPr>
+              <w:jc w:val="left"/>
+            </w:pPr>
+            <w:r/>
+            <w:hyperlink r:id="rId238">
               <w:r>
                 <w:rPr>
                   <w:color w:val="0B4F9E"/>
@@ -43410,7 +44268,7 @@
               <w:jc w:val="left"/>
             </w:pPr>
             <w:r/>
-            <w:hyperlink r:id="rId232">
+            <w:hyperlink r:id="rId238">
               <w:r>
                 <w:rPr>
                   <w:color w:val="0B4F9E"/>
@@ -43437,31 +44295,176 @@
               <w:rPr>
                 <w:sz w:val="16"/>
               </w:rPr>
-              <w:t>173</w:t>
-            </w:r>
-          </w:p>
-        </w:tc>
-        <w:tc>
-          <w:tcPr>
-            <w:tcW w:type="dxa" w:w="1120"/>
-          </w:tcPr>
-          <w:p>
-            <w:pPr>
-              <w:jc w:val="left"/>
-            </w:pPr>
-            <w:r/>
-          </w:p>
-        </w:tc>
-        <w:tc>
-          <w:tcPr>
-            <w:tcW w:type="dxa" w:w="1120"/>
-          </w:tcPr>
-          <w:p>
-            <w:pPr>
-              <w:jc w:val="left"/>
-            </w:pPr>
-            <w:r/>
-            <w:hyperlink r:id="rId233">
+              <w:t>179</w:t>
+            </w:r>
+          </w:p>
+        </w:tc>
+        <w:tc>
+          <w:tcPr>
+            <w:tcW w:type="dxa" w:w="1120"/>
+          </w:tcPr>
+          <w:p>
+            <w:pPr>
+              <w:jc w:val="left"/>
+            </w:pPr>
+            <w:r/>
+          </w:p>
+        </w:tc>
+        <w:tc>
+          <w:tcPr>
+            <w:tcW w:type="dxa" w:w="1120"/>
+          </w:tcPr>
+          <w:p>
+            <w:pPr>
+              <w:jc w:val="left"/>
+            </w:pPr>
+            <w:r/>
+            <w:hyperlink r:id="rId239">
+              <w:r>
+                <w:rPr>
+                  <w:color w:val="0B4F9E"/>
+                  <w:sz w:val="16"/>
+                  <w:u w:val="single"/>
+                </w:rPr>
+                <w:t>Machine learning interatomic potentials for high-entropy alloys: from atomic mechanisms to macroscopic design</w:t>
+              </w:r>
+            </w:hyperlink>
+          </w:p>
+        </w:tc>
+        <w:tc>
+          <w:tcPr>
+            <w:tcW w:type="dxa" w:w="1120"/>
+          </w:tcPr>
+          <w:p>
+            <w:pPr>
+              <w:jc w:val="left"/>
+            </w:pPr>
+            <w:r/>
+          </w:p>
+        </w:tc>
+        <w:tc>
+          <w:tcPr>
+            <w:tcW w:type="dxa" w:w="1120"/>
+          </w:tcPr>
+          <w:p>
+            <w:pPr>
+              <w:jc w:val="left"/>
+            </w:pPr>
+            <w:r/>
+            <w:r>
+              <w:rPr>
+                <w:sz w:val="16"/>
+              </w:rPr>
+              <w:t>alloy</w:t>
+            </w:r>
+          </w:p>
+        </w:tc>
+        <w:tc>
+          <w:tcPr>
+            <w:tcW w:type="dxa" w:w="1120"/>
+          </w:tcPr>
+          <w:p>
+            <w:pPr>
+              <w:jc w:val="left"/>
+            </w:pPr>
+            <w:r/>
+            <w:r>
+              <w:rPr>
+                <w:sz w:val="16"/>
+              </w:rPr>
+              <w:t>MLIP</w:t>
+            </w:r>
+          </w:p>
+        </w:tc>
+        <w:tc>
+          <w:tcPr>
+            <w:tcW w:type="dxa" w:w="1120"/>
+          </w:tcPr>
+          <w:p>
+            <w:pPr>
+              <w:jc w:val="left"/>
+            </w:pPr>
+            <w:r/>
+          </w:p>
+        </w:tc>
+        <w:tc>
+          <w:tcPr>
+            <w:tcW w:type="dxa" w:w="1120"/>
+          </w:tcPr>
+          <w:p>
+            <w:pPr>
+              <w:jc w:val="left"/>
+            </w:pPr>
+            <w:r/>
+            <w:r>
+              <w:rPr>
+                <w:sz w:val="16"/>
+              </w:rPr>
+              <w:t>2026-09-04</w:t>
+            </w:r>
+          </w:p>
+        </w:tc>
+        <w:tc>
+          <w:tcPr>
+            <w:tcW w:type="dxa" w:w="1120"/>
+          </w:tcPr>
+          <w:p>
+            <w:pPr>
+              <w:jc w:val="left"/>
+            </w:pPr>
+            <w:r/>
+            <w:hyperlink r:id="rId239">
+              <w:r>
+                <w:rPr>
+                  <w:color w:val="0B4F9E"/>
+                  <w:sz w:val="16"/>
+                  <w:u w:val="single"/>
+                </w:rPr>
+                <w:t>10.1016/j.commatsci.2026.115016</w:t>
+              </w:r>
+            </w:hyperlink>
+          </w:p>
+        </w:tc>
+      </w:tr>
+      <w:tr>
+        <w:tc>
+          <w:tcPr>
+            <w:tcW w:type="dxa" w:w="1120"/>
+          </w:tcPr>
+          <w:p>
+            <w:pPr>
+              <w:jc w:val="left"/>
+            </w:pPr>
+            <w:r/>
+            <w:r>
+              <w:rPr>
+                <w:sz w:val="16"/>
+              </w:rPr>
+              <w:t>180</w:t>
+            </w:r>
+          </w:p>
+        </w:tc>
+        <w:tc>
+          <w:tcPr>
+            <w:tcW w:type="dxa" w:w="1120"/>
+          </w:tcPr>
+          <w:p>
+            <w:pPr>
+              <w:jc w:val="left"/>
+            </w:pPr>
+            <w:r/>
+          </w:p>
+        </w:tc>
+        <w:tc>
+          <w:tcPr>
+            <w:tcW w:type="dxa" w:w="1120"/>
+          </w:tcPr>
+          <w:p>
+            <w:pPr>
+              <w:jc w:val="left"/>
+            </w:pPr>
+            <w:r/>
+            <w:hyperlink r:id="rId240">
               <w:r>
                 <w:rPr>
                   <w:color w:val="0B4F9E"/>
@@ -43543,7 +44546,7 @@
               <w:jc w:val="left"/>
             </w:pPr>
             <w:r/>
-            <w:hyperlink r:id="rId233">
+            <w:hyperlink r:id="rId240">
               <w:r>
                 <w:rPr>
                   <w:color w:val="0B4F9E"/>
@@ -43551,6 +44554,278 @@
                   <w:u w:val="single"/>
                 </w:rPr>
                 <w:t>10.20537/2076-7633-2026-18-4-929-972</w:t>
+              </w:r>
+            </w:hyperlink>
+          </w:p>
+        </w:tc>
+      </w:tr>
+      <w:tr>
+        <w:tc>
+          <w:tcPr>
+            <w:tcW w:type="dxa" w:w="1120"/>
+          </w:tcPr>
+          <w:p>
+            <w:pPr>
+              <w:jc w:val="left"/>
+            </w:pPr>
+            <w:r/>
+            <w:r>
+              <w:rPr>
+                <w:sz w:val="16"/>
+              </w:rPr>
+              <w:t>181</w:t>
+            </w:r>
+          </w:p>
+        </w:tc>
+        <w:tc>
+          <w:tcPr>
+            <w:tcW w:type="dxa" w:w="1120"/>
+          </w:tcPr>
+          <w:p>
+            <w:pPr>
+              <w:jc w:val="left"/>
+            </w:pPr>
+            <w:r/>
+          </w:p>
+        </w:tc>
+        <w:tc>
+          <w:tcPr>
+            <w:tcW w:type="dxa" w:w="1120"/>
+          </w:tcPr>
+          <w:p>
+            <w:pPr>
+              <w:jc w:val="left"/>
+            </w:pPr>
+            <w:r/>
+            <w:hyperlink r:id="rId241">
+              <w:r>
+                <w:rPr>
+                  <w:color w:val="0B4F9E"/>
+                  <w:sz w:val="16"/>
+                  <w:u w:val="single"/>
+                </w:rPr>
+                <w:t>Using Approximations of Practice to Support Calculus Instructors’ Enactment of Equitable Active Learning Teaching Practices</w:t>
+              </w:r>
+            </w:hyperlink>
+          </w:p>
+        </w:tc>
+        <w:tc>
+          <w:tcPr>
+            <w:tcW w:type="dxa" w:w="1120"/>
+          </w:tcPr>
+          <w:p>
+            <w:pPr>
+              <w:jc w:val="left"/>
+            </w:pPr>
+            <w:r/>
+          </w:p>
+        </w:tc>
+        <w:tc>
+          <w:tcPr>
+            <w:tcW w:type="dxa" w:w="1120"/>
+          </w:tcPr>
+          <w:p>
+            <w:pPr>
+              <w:jc w:val="left"/>
+            </w:pPr>
+            <w:r/>
+          </w:p>
+        </w:tc>
+        <w:tc>
+          <w:tcPr>
+            <w:tcW w:type="dxa" w:w="1120"/>
+          </w:tcPr>
+          <w:p>
+            <w:pPr>
+              <w:jc w:val="left"/>
+            </w:pPr>
+            <w:r/>
+          </w:p>
+        </w:tc>
+        <w:tc>
+          <w:tcPr>
+            <w:tcW w:type="dxa" w:w="1120"/>
+          </w:tcPr>
+          <w:p>
+            <w:pPr>
+              <w:jc w:val="left"/>
+            </w:pPr>
+            <w:r/>
+          </w:p>
+        </w:tc>
+        <w:tc>
+          <w:tcPr>
+            <w:tcW w:type="dxa" w:w="1120"/>
+          </w:tcPr>
+          <w:p>
+            <w:pPr>
+              <w:jc w:val="left"/>
+            </w:pPr>
+            <w:r/>
+            <w:r>
+              <w:rPr>
+                <w:sz w:val="16"/>
+              </w:rPr>
+              <w:t>2026-09-05</w:t>
+            </w:r>
+          </w:p>
+        </w:tc>
+        <w:tc>
+          <w:tcPr>
+            <w:tcW w:type="dxa" w:w="1120"/>
+          </w:tcPr>
+          <w:p>
+            <w:pPr>
+              <w:jc w:val="left"/>
+            </w:pPr>
+            <w:r/>
+            <w:hyperlink r:id="rId241">
+              <w:r>
+                <w:rPr>
+                  <w:color w:val="0B4F9E"/>
+                  <w:sz w:val="16"/>
+                  <w:u w:val="single"/>
+                </w:rPr>
+                <w:t>10.1007/s40753-026-00315-8</w:t>
+              </w:r>
+            </w:hyperlink>
+          </w:p>
+        </w:tc>
+      </w:tr>
+      <w:tr>
+        <w:tc>
+          <w:tcPr>
+            <w:tcW w:type="dxa" w:w="1120"/>
+          </w:tcPr>
+          <w:p>
+            <w:pPr>
+              <w:jc w:val="left"/>
+            </w:pPr>
+            <w:r/>
+            <w:r>
+              <w:rPr>
+                <w:sz w:val="16"/>
+              </w:rPr>
+              <w:t>182</w:t>
+            </w:r>
+          </w:p>
+        </w:tc>
+        <w:tc>
+          <w:tcPr>
+            <w:tcW w:type="dxa" w:w="1120"/>
+          </w:tcPr>
+          <w:p>
+            <w:pPr>
+              <w:jc w:val="left"/>
+            </w:pPr>
+            <w:r/>
+          </w:p>
+        </w:tc>
+        <w:tc>
+          <w:tcPr>
+            <w:tcW w:type="dxa" w:w="1120"/>
+          </w:tcPr>
+          <w:p>
+            <w:pPr>
+              <w:jc w:val="left"/>
+            </w:pPr>
+            <w:r/>
+            <w:hyperlink r:id="rId242">
+              <w:r>
+                <w:rPr>
+                  <w:color w:val="0B4F9E"/>
+                  <w:sz w:val="16"/>
+                  <w:u w:val="single"/>
+                </w:rPr>
+                <w:t>Deep learning statistical defect models on magnetic material dynamic and static properties</w:t>
+              </w:r>
+            </w:hyperlink>
+          </w:p>
+        </w:tc>
+        <w:tc>
+          <w:tcPr>
+            <w:tcW w:type="dxa" w:w="1120"/>
+          </w:tcPr>
+          <w:p>
+            <w:pPr>
+              <w:jc w:val="left"/>
+            </w:pPr>
+            <w:r/>
+          </w:p>
+        </w:tc>
+        <w:tc>
+          <w:tcPr>
+            <w:tcW w:type="dxa" w:w="1120"/>
+          </w:tcPr>
+          <w:p>
+            <w:pPr>
+              <w:jc w:val="left"/>
+            </w:pPr>
+            <w:r/>
+            <w:r>
+              <w:rPr>
+                <w:sz w:val="16"/>
+              </w:rPr>
+              <w:t>magnetic material</w:t>
+            </w:r>
+          </w:p>
+        </w:tc>
+        <w:tc>
+          <w:tcPr>
+            <w:tcW w:type="dxa" w:w="1120"/>
+          </w:tcPr>
+          <w:p>
+            <w:pPr>
+              <w:jc w:val="left"/>
+            </w:pPr>
+            <w:r/>
+          </w:p>
+        </w:tc>
+        <w:tc>
+          <w:tcPr>
+            <w:tcW w:type="dxa" w:w="1120"/>
+          </w:tcPr>
+          <w:p>
+            <w:pPr>
+              <w:jc w:val="left"/>
+            </w:pPr>
+            <w:r/>
+          </w:p>
+        </w:tc>
+        <w:tc>
+          <w:tcPr>
+            <w:tcW w:type="dxa" w:w="1120"/>
+          </w:tcPr>
+          <w:p>
+            <w:pPr>
+              <w:jc w:val="left"/>
+            </w:pPr>
+            <w:r/>
+            <w:r>
+              <w:rPr>
+                <w:sz w:val="16"/>
+              </w:rPr>
+              <w:t>2026-09-05</w:t>
+            </w:r>
+          </w:p>
+        </w:tc>
+        <w:tc>
+          <w:tcPr>
+            <w:tcW w:type="dxa" w:w="1120"/>
+          </w:tcPr>
+          <w:p>
+            <w:pPr>
+              <w:jc w:val="left"/>
+            </w:pPr>
+            <w:r/>
+            <w:hyperlink r:id="rId243">
+              <w:r>
+                <w:rPr>
+                  <w:color w:val="0B4F9E"/>
+                  <w:sz w:val="16"/>
+                  <w:u w:val="single"/>
+                </w:rPr>
+                <w:t>10.1038/s41524-026-02285-6</w:t>
               </w:r>
             </w:hyperlink>
           </w:p>

</xml_diff>